<commit_message>
chore(packet-templates): refresh docx binaries
- AttorneyClaimExaminerPacket, DoctorPacket, and PatientPacketNew .docx
  binaries rewritten on disk by the dev container's template loader;
  capturing them as a single chore commit before the upcoming main
  merge so the merge commit only carries main's changes.
</commit_message>
<xml_diff>
--- a/src/HealthcareSupport.CaseEvaluation.Domain/AppointmentDocuments/Templates/Resources/AttorneyClaimExaminerPacket.docx
+++ b/src/HealthcareSupport.CaseEvaluation.Domain/AppointmentDocuments/Templates/Resources/AttorneyClaimExaminerPacket.docx
@@ -1,6 +1,6 @@
 
 <file path=word/document.xml><?xml version="1.0" encoding="utf-8"?>
-<w:document xmlns:wpc="http://schemas.microsoft.com/office/word/2010/wordprocessingCanvas" xmlns:cx="http://schemas.microsoft.com/office/drawing/2014/chartex" xmlns:cx1="http://schemas.microsoft.com/office/drawing/2015/9/8/chartex" xmlns:mc="http://schemas.openxmlformats.org/markup-compatibility/2006" xmlns:o="urn:schemas-microsoft-com:office:office" xmlns:r="http://schemas.openxmlformats.org/officeDocument/2006/relationships" xmlns:m="http://schemas.openxmlformats.org/officeDocument/2006/math" xmlns:v="urn:schemas-microsoft-com:vml" xmlns:wp14="http://schemas.microsoft.com/office/word/2010/wordprocessingDrawing" xmlns:wp="http://schemas.openxmlformats.org/drawingml/2006/wordprocessingDrawing" xmlns:w10="urn:schemas-microsoft-com:office:word" xmlns:w="http://schemas.openxmlformats.org/wordprocessingml/2006/main" xmlns:w14="http://schemas.microsoft.com/office/word/2010/wordml" xmlns:w15="http://schemas.microsoft.com/office/word/2012/wordml" xmlns:w16se="http://schemas.microsoft.com/office/word/2015/wordml/symex" xmlns:wpg="http://schemas.microsoft.com/office/word/2010/wordprocessingGroup" xmlns:wpi="http://schemas.microsoft.com/office/word/2010/wordprocessingInk" xmlns:wne="http://schemas.microsoft.com/office/word/2006/wordml" xmlns:wps="http://schemas.microsoft.com/office/word/2010/wordprocessingShape" mc:Ignorable="w14 w15 w16se wp14">
+<w:document xmlns:wpc="http://schemas.microsoft.com/office/word/2010/wordprocessingCanvas" xmlns:cx="http://schemas.microsoft.com/office/drawing/2014/chartex" xmlns:cx1="http://schemas.microsoft.com/office/drawing/2015/9/8/chartex" xmlns:cx2="http://schemas.microsoft.com/office/drawing/2015/10/21/chartex" xmlns:cx3="http://schemas.microsoft.com/office/drawing/2016/5/9/chartex" xmlns:cx4="http://schemas.microsoft.com/office/drawing/2016/5/10/chartex" xmlns:cx5="http://schemas.microsoft.com/office/drawing/2016/5/11/chartex" xmlns:cx6="http://schemas.microsoft.com/office/drawing/2016/5/12/chartex" xmlns:cx7="http://schemas.microsoft.com/office/drawing/2016/5/13/chartex" xmlns:cx8="http://schemas.microsoft.com/office/drawing/2016/5/14/chartex" xmlns:mc="http://schemas.openxmlformats.org/markup-compatibility/2006" xmlns:aink="http://schemas.microsoft.com/office/drawing/2016/ink" xmlns:am3d="http://schemas.microsoft.com/office/drawing/2017/model3d" xmlns:o="urn:schemas-microsoft-com:office:office" xmlns:oel="http://schemas.microsoft.com/office/2019/extlst" xmlns:r="http://schemas.openxmlformats.org/officeDocument/2006/relationships" xmlns:m="http://schemas.openxmlformats.org/officeDocument/2006/math" xmlns:v="urn:schemas-microsoft-com:vml" xmlns:wp14="http://schemas.microsoft.com/office/word/2010/wordprocessingDrawing" xmlns:wp="http://schemas.openxmlformats.org/drawingml/2006/wordprocessingDrawing" xmlns:w10="urn:schemas-microsoft-com:office:word" xmlns:w="http://schemas.openxmlformats.org/wordprocessingml/2006/main" xmlns:w14="http://schemas.microsoft.com/office/word/2010/wordml" xmlns:w15="http://schemas.microsoft.com/office/word/2012/wordml" xmlns:w16cex="http://schemas.microsoft.com/office/word/2018/wordml/cex" xmlns:w16cid="http://schemas.microsoft.com/office/word/2016/wordml/cid" xmlns:w16="http://schemas.microsoft.com/office/word/2018/wordml" xmlns:w16du="http://schemas.microsoft.com/office/word/2023/wordml/word16du" xmlns:w16sdtdh="http://schemas.microsoft.com/office/word/2020/wordml/sdtdatahash" xmlns:w16sdtfl="http://schemas.microsoft.com/office/word/2024/wordml/sdtformatlock" xmlns:w16se="http://schemas.microsoft.com/office/word/2015/wordml/symex" xmlns:wpg="http://schemas.microsoft.com/office/word/2010/wordprocessingGroup" xmlns:wpi="http://schemas.microsoft.com/office/word/2010/wordprocessingInk" xmlns:wne="http://schemas.microsoft.com/office/word/2006/wordml" xmlns:wps="http://schemas.microsoft.com/office/word/2010/wordprocessingShape" mc:Ignorable="w14 w15 w16se w16cid w16 w16cex w16sdtdh w16sdtfl w16du wp14">
   <w:body>
     <w:p>
       <w:pPr>
@@ -410,76 +410,28 @@
           <w:u w:val="single"/>
           <w:lang w:val="en"/>
         </w:rPr>
-        <w:t xml:space="preserve"> ##</w:t>
-      </w:r>
-      <w:proofErr w:type="spellStart"/>
+        <w:t xml:space="preserve"> ##Appointments.AvailableDate## </w:t>
+      </w:r>
       <w:r>
         <w:rPr>
           <w:rFonts w:ascii="Arial" w:hAnsi="Arial" w:cs="Arial"/>
           <w:color w:val="000000"/>
           <w:sz w:val="20"/>
           <w:szCs w:val="20"/>
+          <w:lang w:val="en"/>
+        </w:rPr>
+        <w:t xml:space="preserve"> at </w:t>
+      </w:r>
+      <w:r>
+        <w:rPr>
+          <w:rFonts w:ascii="Arial" w:hAnsi="Arial" w:cs="Arial"/>
+          <w:color w:val="000000"/>
+          <w:sz w:val="20"/>
+          <w:szCs w:val="20"/>
           <w:u w:val="single"/>
           <w:lang w:val="en"/>
         </w:rPr>
-        <w:t>Appointments.AvailableDate</w:t>
-      </w:r>
-      <w:proofErr w:type="spellEnd"/>
-      <w:r>
-        <w:rPr>
-          <w:rFonts w:ascii="Arial" w:hAnsi="Arial" w:cs="Arial"/>
-          <w:color w:val="000000"/>
-          <w:sz w:val="20"/>
-          <w:szCs w:val="20"/>
-          <w:u w:val="single"/>
-          <w:lang w:val="en"/>
-        </w:rPr>
-        <w:t xml:space="preserve">## </w:t>
-      </w:r>
-      <w:r>
-        <w:rPr>
-          <w:rFonts w:ascii="Arial" w:hAnsi="Arial" w:cs="Arial"/>
-          <w:color w:val="000000"/>
-          <w:sz w:val="20"/>
-          <w:szCs w:val="20"/>
-          <w:lang w:val="en"/>
-        </w:rPr>
-        <w:t xml:space="preserve"> at </w:t>
-      </w:r>
-      <w:r>
-        <w:rPr>
-          <w:rFonts w:ascii="Arial" w:hAnsi="Arial" w:cs="Arial"/>
-          <w:color w:val="000000"/>
-          <w:sz w:val="20"/>
-          <w:szCs w:val="20"/>
-          <w:u w:val="single"/>
-          <w:lang w:val="en"/>
-        </w:rPr>
-        <w:t>##</w:t>
-      </w:r>
-      <w:proofErr w:type="spellStart"/>
-      <w:r>
-        <w:rPr>
-          <w:rFonts w:ascii="Arial" w:hAnsi="Arial" w:cs="Arial"/>
-          <w:color w:val="000000"/>
-          <w:sz w:val="20"/>
-          <w:szCs w:val="20"/>
-          <w:u w:val="single"/>
-          <w:lang w:val="en"/>
-        </w:rPr>
-        <w:t>Appointments.AppointmenTime</w:t>
-      </w:r>
-      <w:proofErr w:type="spellEnd"/>
-      <w:r>
-        <w:rPr>
-          <w:rFonts w:ascii="Arial" w:hAnsi="Arial" w:cs="Arial"/>
-          <w:color w:val="000000"/>
-          <w:sz w:val="20"/>
-          <w:szCs w:val="20"/>
-          <w:u w:val="single"/>
-          <w:lang w:val="en"/>
-        </w:rPr>
-        <w:t>##</w:t>
+        <w:t>##Appointments.AppointmenTime##</w:t>
       </w:r>
       <w:r>
         <w:rPr>
@@ -2035,7 +1987,7 @@
               </wp:anchor>
             </w:drawing>
           </mc:Choice>
-          <mc:Fallback xmlns:cx2="http://schemas.microsoft.com/office/drawing/2015/10/21/chartex" xmlns:cx3="http://schemas.microsoft.com/office/drawing/2016/5/9/chartex" xmlns:cx4="http://schemas.microsoft.com/office/drawing/2016/5/10/chartex" xmlns:cx5="http://schemas.microsoft.com/office/drawing/2016/5/11/chartex" xmlns:cx6="http://schemas.microsoft.com/office/drawing/2016/5/12/chartex" xmlns:cx7="http://schemas.microsoft.com/office/drawing/2016/5/13/chartex" xmlns:cx8="http://schemas.microsoft.com/office/drawing/2016/5/14/chartex" xmlns:aink="http://schemas.microsoft.com/office/drawing/2016/ink" xmlns:am3d="http://schemas.microsoft.com/office/drawing/2017/model3d" xmlns:w16cex="http://schemas.microsoft.com/office/word/2018/wordml/cex" xmlns:w16cid="http://schemas.microsoft.com/office/word/2016/wordml/cid" xmlns:w16="http://schemas.microsoft.com/office/word/2018/wordml" xmlns:w16sdtdh="http://schemas.microsoft.com/office/word/2020/wordml/sdtdatahash">
+          <mc:Fallback>
             <w:pict>
               <v:line w14:anchorId="0CBFD5C6" id="Straight Connector 9" o:spid="_x0000_s1026" style="position:absolute;z-index:251703296;visibility:visible;mso-wrap-style:square;mso-width-percent:0;mso-height-percent:0;mso-wrap-distance-left:9pt;mso-wrap-distance-top:-3e-5mm;mso-wrap-distance-right:9pt;mso-wrap-distance-bottom:-3e-5mm;mso-position-horizontal:absolute;mso-position-horizontal-relative:text;mso-position-vertical:absolute;mso-position-vertical-relative:text;mso-width-percent:0;mso-height-percent:0;mso-width-relative:page;mso-height-relative:page" from="-27.6pt,12.7pt" to="497.35pt,12.7pt" o:gfxdata="UEsDBBQABgAIAAAAIQC2gziS/gAAAOEBAAATAAAAW0NvbnRlbnRfVHlwZXNdLnhtbJSRQU7DMBBF&#10;90jcwfIWJU67QAgl6YK0S0CoHGBkTxKLZGx5TGhvj5O2G0SRWNoz/78nu9wcxkFMGNg6quQqL6RA&#10;0s5Y6ir5vt9lD1JwBDIwOMJKHpHlpr69KfdHjyxSmriSfYz+USnWPY7AufNIadK6MEJMx9ApD/oD&#10;OlTrorhX2lFEilmcO2RdNtjC5xDF9pCuTyYBB5bi6bQ4syoJ3g9WQ0ymaiLzg5KdCXlKLjvcW893&#10;SUOqXwnz5DrgnHtJTxOsQfEKIT7DmDSUCaxw7Rqn8787ZsmRM9e2VmPeBN4uqYvTtW7jvijg9N/y&#10;JsXecLq0q+WD6m8AAAD//wMAUEsDBBQABgAIAAAAIQA4/SH/1gAAAJQBAAALAAAAX3JlbHMvLnJl&#10;bHOkkMFqwzAMhu+DvYPRfXGawxijTi+j0GvpHsDYimMaW0Yy2fr2M4PBMnrbUb/Q94l/f/hMi1qR&#10;JVI2sOt6UJgd+ZiDgffL8ekFlFSbvV0oo4EbChzGx4f9GRdb25HMsYhqlCwG5lrLq9biZkxWOiqY&#10;22YiTra2kYMu1l1tQD30/bPm3wwYN0x18gb45AdQl1tp5j/sFB2T0FQ7R0nTNEV3j6o9feQzro1i&#10;OWA14Fm+Q8a1a8+Bvu/d/dMb2JY5uiPbhG/ktn4cqGU/er3pcvwCAAD//wMAUEsDBBQABgAIAAAA&#10;IQB23TVL2gEAAKUDAAAOAAAAZHJzL2Uyb0RvYy54bWysU01v2zAMvQ/YfxB0b5wGaJYacXpI0F2K&#10;LUC6H8DKsi1MEgVRi5N/P0r5WNrdhvkgSCL5yPf0vHw6OCv2OpJB38j7yVQK7RW2xveN/PH6fLeQ&#10;ghL4Fix63cijJvm0+vxpOYZaz3BA2+ooGMRTPYZGDimFuqpIDdoBTTBoz8EOo4PEx9hXbYSR0Z2t&#10;ZtPpvBoxtiGi0kR8uzkF5argd51W6XvXkU7CNpJnS2WNZX3La7VaQt1HCINR5zHgH6ZwYDw3vUJt&#10;IIH4Fc1fUM6oiIRdmih0FXadUbpwYDb30w9sdgMEXbiwOBSuMtH/g1Xf9tsoTNvIRyk8OH6iXYpg&#10;+iGJNXrPAmIUj1mnMVDN6Wu/jZmpOvhdeEH1kzhWvQvmA4VT2qGLLqczVXEouh+vuutDEoov5/wt&#10;5g9SqEusgvpSGCKlrxqdyJtGWuOzJFDD/oVSbg31JSVfe3w21pZntV6M7MnZlym/vAJ2V2ch8dYF&#10;5ku+lwJsz7ZVKRZIQmvaXJ6B6EhrG8Ue2DlsuBbHV55XCguUOMAkypeV4RHeleZ5NkDDqbiETkZz&#10;JrHbrXGNXNxWW5876uLXM6s/GubdG7bHbbwIzV4oTc++zWa7PfP+9u9a/QYAAP//AwBQSwMEFAAG&#10;AAgAAAAhANh8U+reAAAACQEAAA8AAABkcnMvZG93bnJldi54bWxMj8FOg0AQhu8mvsNmTLy1i6RU&#10;QZbGaOxJD9Y+wABToN2dRXah6NO7xoMeZ+bLP9+fb2ajxUSD6ywruFlGIIgrW3fcKNi/Py/uQDiP&#10;XKO2TAo+ycGmuLzIMavtmd9o2vlGhBB2GSpove8zKV3VkkG3tD1xuB3sYNCHcWhkPeA5hBst4yha&#10;S4Mdhw8t9vTYUnXajUbBdv5KXnQ1PZXpfowPevvxise1UtdX88M9CE+z/4PhRz+oQxGcSjty7YRW&#10;sEiSOKAK4mQFIgBpuroFUf4uZJHL/w2KbwAAAP//AwBQSwECLQAUAAYACAAAACEAtoM4kv4AAADh&#10;AQAAEwAAAAAAAAAAAAAAAAAAAAAAW0NvbnRlbnRfVHlwZXNdLnhtbFBLAQItABQABgAIAAAAIQA4&#10;/SH/1gAAAJQBAAALAAAAAAAAAAAAAAAAAC8BAABfcmVscy8ucmVsc1BLAQItABQABgAIAAAAIQB2&#10;3TVL2gEAAKUDAAAOAAAAAAAAAAAAAAAAAC4CAABkcnMvZTJvRG9jLnhtbFBLAQItABQABgAIAAAA&#10;IQDYfFPq3gAAAAkBAAAPAAAAAAAAAAAAAAAAADQEAABkcnMvZG93bnJldi54bWxQSwUGAAAAAAQA&#10;BADzAAAAPwUAAAAA&#10;" strokecolor="windowText" strokeweight="1pt">
                 <v:stroke joinstyle="miter"/>
@@ -2062,7 +2014,6 @@
         <w:tc>
           <w:tcPr>
             <w:tcW w:w="4788" w:type="dxa"/>
-            <w:shd w:val="clear" w:color="auto" w:fill="auto"/>
             <w:vAlign w:val="center"/>
           </w:tcPr>
           <w:p>
@@ -2121,7 +2072,6 @@
         <w:tc>
           <w:tcPr>
             <w:tcW w:w="4788" w:type="dxa"/>
-            <w:shd w:val="clear" w:color="auto" w:fill="auto"/>
             <w:vAlign w:val="center"/>
           </w:tcPr>
           <w:p>
@@ -2174,7 +2124,6 @@
         <w:tc>
           <w:tcPr>
             <w:tcW w:w="4788" w:type="dxa"/>
-            <w:shd w:val="clear" w:color="auto" w:fill="auto"/>
             <w:vAlign w:val="center"/>
           </w:tcPr>
           <w:p>
@@ -2193,7 +2142,6 @@
         <w:tc>
           <w:tcPr>
             <w:tcW w:w="4788" w:type="dxa"/>
-            <w:shd w:val="clear" w:color="auto" w:fill="auto"/>
             <w:vAlign w:val="center"/>
           </w:tcPr>
           <w:p>
@@ -2217,7 +2165,6 @@
         <w:tc>
           <w:tcPr>
             <w:tcW w:w="4788" w:type="dxa"/>
-            <w:shd w:val="clear" w:color="auto" w:fill="auto"/>
             <w:vAlign w:val="center"/>
           </w:tcPr>
           <w:p>
@@ -2235,7 +2182,6 @@
         <w:tc>
           <w:tcPr>
             <w:tcW w:w="4788" w:type="dxa"/>
-            <w:shd w:val="clear" w:color="auto" w:fill="auto"/>
             <w:vAlign w:val="center"/>
           </w:tcPr>
           <w:p>
@@ -2269,7 +2215,6 @@
         <w:tc>
           <w:tcPr>
             <w:tcW w:w="4788" w:type="dxa"/>
-            <w:shd w:val="clear" w:color="auto" w:fill="auto"/>
             <w:vAlign w:val="center"/>
           </w:tcPr>
           <w:p>
@@ -2328,7 +2273,6 @@
         <w:tc>
           <w:tcPr>
             <w:tcW w:w="4788" w:type="dxa"/>
-            <w:shd w:val="clear" w:color="auto" w:fill="auto"/>
             <w:vAlign w:val="bottom"/>
           </w:tcPr>
           <w:p>
@@ -2863,7 +2807,6 @@
         </w:rPr>
         <w:t xml:space="preserve">My business address </w:t>
       </w:r>
-      <w:proofErr w:type="gramStart"/>
       <w:r>
         <w:rPr>
           <w:rFonts w:ascii="Arial" w:hAnsi="Arial" w:cs="Arial"/>
@@ -2893,19 +2836,7 @@
           <w:szCs w:val="18"/>
           <w:u w:val="single"/>
         </w:rPr>
-        <w:t>:</w:t>
-      </w:r>
-      <w:proofErr w:type="gramEnd"/>
-      <w:r>
-        <w:rPr>
-          <w:rFonts w:ascii="Arial" w:hAnsi="Arial" w:cs="Arial"/>
-          <w:b/>
-          <w:bCs/>
-          <w:sz w:val="18"/>
-          <w:szCs w:val="18"/>
-          <w:u w:val="single"/>
-        </w:rPr>
-        <w:t xml:space="preserve"> P.O. Box 261656</w:t>
+        <w:t>: P.O. Box 261656</w:t>
       </w:r>
       <w:r>
         <w:rPr>
@@ -7384,19 +7315,6 @@
     </w:p>
     <w:p>
       <w:pPr>
-        <w:pStyle w:val="Header"/>
-        <w:rPr>
-          <w:rFonts w:ascii="Footlight MT Light" w:hAnsi="Footlight MT Light" w:cs="Arial"/>
-          <w:b/>
-          <w:bCs/>
-          <w:color w:val="333333"/>
-          <w:sz w:val="51"/>
-          <w:szCs w:val="51"/>
-        </w:rPr>
-      </w:pPr>
-    </w:p>
-    <w:p>
-      <w:pPr>
         <w:tabs>
           <w:tab w:val="left" w:pos="633"/>
           <w:tab w:val="left" w:pos="4953"/>
@@ -7440,6 +7358,7 @@
           <w:szCs w:val="32"/>
           <w:u w:val="single"/>
         </w:rPr>
+        <w:lastRenderedPageBreak/>
         <w:t>Service List</w:t>
       </w:r>
     </w:p>
@@ -7476,7 +7395,6 @@
         <w:tc>
           <w:tcPr>
             <w:tcW w:w="4820" w:type="dxa"/>
-            <w:shd w:val="clear" w:color="auto" w:fill="auto"/>
             <w:vAlign w:val="center"/>
           </w:tcPr>
           <w:p>
@@ -7538,7 +7456,6 @@
         <w:tc>
           <w:tcPr>
             <w:tcW w:w="4540" w:type="dxa"/>
-            <w:shd w:val="clear" w:color="auto" w:fill="auto"/>
             <w:vAlign w:val="center"/>
           </w:tcPr>
           <w:p>
@@ -7589,7 +7506,6 @@
         <w:tc>
           <w:tcPr>
             <w:tcW w:w="4820" w:type="dxa"/>
-            <w:shd w:val="clear" w:color="auto" w:fill="auto"/>
             <w:vAlign w:val="center"/>
           </w:tcPr>
           <w:p>
@@ -7605,7 +7521,6 @@
         <w:tc>
           <w:tcPr>
             <w:tcW w:w="4540" w:type="dxa"/>
-            <w:shd w:val="clear" w:color="auto" w:fill="auto"/>
             <w:vAlign w:val="center"/>
           </w:tcPr>
           <w:p>
@@ -7627,7 +7542,6 @@
         <w:tc>
           <w:tcPr>
             <w:tcW w:w="4820" w:type="dxa"/>
-            <w:shd w:val="clear" w:color="auto" w:fill="auto"/>
             <w:vAlign w:val="center"/>
           </w:tcPr>
           <w:p>
@@ -7660,7 +7574,6 @@
         <w:tc>
           <w:tcPr>
             <w:tcW w:w="4540" w:type="dxa"/>
-            <w:shd w:val="clear" w:color="auto" w:fill="auto"/>
             <w:vAlign w:val="bottom"/>
           </w:tcPr>
           <w:p>
@@ -7873,36 +7786,28 @@
     </w:tbl>
     <w:p>
       <w:pPr>
-        <w:tabs>
-          <w:tab w:val="left" w:pos="633"/>
-          <w:tab w:val="left" w:pos="4953"/>
-          <w:tab w:val="left" w:pos="5904"/>
-        </w:tabs>
         <w:contextualSpacing/>
-        <w:jc w:val="center"/>
-        <w:rPr>
-          <w:rFonts w:ascii="Arial" w:hAnsi="Arial" w:cs="Arial"/>
-          <w:b/>
-          <w:bCs/>
-          <w:u w:val="single"/>
+        <w:rPr>
+          <w:rFonts w:ascii="Arial" w:hAnsi="Arial" w:cs="Arial"/>
+          <w:color w:val="000000"/>
         </w:rPr>
       </w:pPr>
     </w:p>
     <w:p>
       <w:pPr>
-        <w:tabs>
-          <w:tab w:val="left" w:pos="633"/>
-          <w:tab w:val="left" w:pos="4953"/>
-          <w:tab w:val="left" w:pos="5904"/>
-        </w:tabs>
         <w:contextualSpacing/>
-        <w:jc w:val="center"/>
-        <w:rPr>
-          <w:rFonts w:ascii="Arial" w:hAnsi="Arial" w:cs="Arial"/>
-          <w:b/>
-          <w:bCs/>
-        </w:rPr>
-      </w:pPr>
+        <w:rPr>
+          <w:rFonts w:ascii="Arial" w:hAnsi="Arial" w:cs="Arial"/>
+          <w:color w:val="000000"/>
+        </w:rPr>
+      </w:pPr>
+      <w:r>
+        <w:rPr>
+          <w:rFonts w:ascii="Arial" w:hAnsi="Arial" w:cs="Arial"/>
+          <w:color w:val="000000"/>
+        </w:rPr>
+        <w:t>##InjuryDetails.PrimaryInsuranceName##</w:t>
+      </w:r>
     </w:p>
     <w:p>
       <w:pPr>
@@ -7912,6 +7817,13 @@
           <w:color w:val="000000"/>
         </w:rPr>
       </w:pPr>
+      <w:r>
+        <w:rPr>
+          <w:rFonts w:ascii="Arial" w:hAnsi="Arial" w:cs="Arial"/>
+          <w:color w:val="000000"/>
+        </w:rPr>
+        <w:t>##InjuryDetails.PrimaryInsuranceStreet##</w:t>
+      </w:r>
     </w:p>
     <w:p>
       <w:pPr>
@@ -7921,6 +7833,74 @@
           <w:color w:val="000000"/>
         </w:rPr>
       </w:pPr>
+      <w:r>
+        <w:rPr>
+          <w:rFonts w:ascii="Arial" w:hAnsi="Arial" w:cs="Arial"/>
+          <w:color w:val="000000"/>
+        </w:rPr>
+        <w:fldChar w:fldCharType="begin"/>
+      </w:r>
+      <w:r>
+        <w:rPr>
+          <w:rFonts w:ascii="Arial" w:hAnsi="Arial" w:cs="Arial"/>
+          <w:color w:val="000000"/>
+        </w:rPr>
+        <w:instrText xml:space="preserve"> MERGEFIELD M_291 \* MERGEFORMAT </w:instrText>
+      </w:r>
+      <w:r>
+        <w:rPr>
+          <w:rFonts w:ascii="Arial" w:hAnsi="Arial" w:cs="Arial"/>
+          <w:color w:val="000000"/>
+        </w:rPr>
+        <w:fldChar w:fldCharType="separate"/>
+      </w:r>
+      <w:r>
+        <w:rPr>
+          <w:rFonts w:ascii="Arial" w:hAnsi="Arial" w:cs="Arial"/>
+          <w:noProof/>
+          <w:color w:val="000000"/>
+        </w:rPr>
+        <w:t>##InjuryDetails.PrimaryInsuranceCity##</w:t>
+      </w:r>
+      <w:r>
+        <w:rPr>
+          <w:rFonts w:ascii="Arial" w:hAnsi="Arial" w:cs="Arial"/>
+          <w:noProof/>
+          <w:color w:val="000000"/>
+        </w:rPr>
+        <w:t xml:space="preserve">, </w:t>
+      </w:r>
+      <w:r>
+        <w:rPr>
+          <w:rFonts w:ascii="Arial" w:hAnsi="Arial" w:cs="Arial"/>
+          <w:noProof/>
+          <w:color w:val="000000"/>
+        </w:rPr>
+        <w:t>##InjuryDetails.PrimaryInsuranceState##</w:t>
+      </w:r>
+      <w:r>
+        <w:rPr>
+          <w:rFonts w:ascii="Arial" w:hAnsi="Arial" w:cs="Arial"/>
+          <w:noProof/>
+          <w:color w:val="000000"/>
+        </w:rPr>
+        <w:t xml:space="preserve"> </w:t>
+      </w:r>
+      <w:r>
+        <w:rPr>
+          <w:rFonts w:ascii="Arial" w:hAnsi="Arial" w:cs="Arial"/>
+          <w:noProof/>
+          <w:color w:val="000000"/>
+        </w:rPr>
+        <w:t>##InjuryDetails.PrimaryInsuranceZip##</w:t>
+      </w:r>
+      <w:r>
+        <w:rPr>
+          <w:rFonts w:ascii="Arial" w:hAnsi="Arial" w:cs="Arial"/>
+          <w:color w:val="000000"/>
+        </w:rPr>
+        <w:fldChar w:fldCharType="end"/>
+      </w:r>
     </w:p>
     <w:p>
       <w:pPr>
@@ -7928,135 +7908,6 @@
         <w:rPr>
           <w:rFonts w:ascii="Arial" w:hAnsi="Arial" w:cs="Arial"/>
           <w:color w:val="000000"/>
-        </w:rPr>
-      </w:pPr>
-      <w:r>
-        <w:rPr>
-          <w:rFonts w:ascii="Arial" w:hAnsi="Arial" w:cs="Arial"/>
-          <w:color w:val="000000"/>
-        </w:rPr>
-        <w:t>##InjuryDetails.PrimaryInsuranceName##</w:t>
-      </w:r>
-    </w:p>
-    <w:p>
-      <w:pPr>
-        <w:contextualSpacing/>
-        <w:rPr>
-          <w:rFonts w:ascii="Arial" w:hAnsi="Arial" w:cs="Arial"/>
-          <w:color w:val="000000"/>
-        </w:rPr>
-      </w:pPr>
-      <w:r>
-        <w:rPr>
-          <w:rFonts w:ascii="Arial" w:hAnsi="Arial" w:cs="Arial"/>
-          <w:color w:val="000000"/>
-        </w:rPr>
-        <w:t>##InjuryDetails.PrimaryInsuranceStreet##</w:t>
-      </w:r>
-    </w:p>
-    <w:p>
-      <w:pPr>
-        <w:contextualSpacing/>
-        <w:rPr>
-          <w:rFonts w:ascii="Arial" w:hAnsi="Arial" w:cs="Arial"/>
-          <w:color w:val="000000"/>
-        </w:rPr>
-      </w:pPr>
-      <w:r>
-        <w:rPr>
-          <w:rFonts w:ascii="Arial" w:hAnsi="Arial" w:cs="Arial"/>
-          <w:color w:val="000000"/>
-        </w:rPr>
-        <w:fldChar w:fldCharType="begin"/>
-      </w:r>
-      <w:r>
-        <w:rPr>
-          <w:rFonts w:ascii="Arial" w:hAnsi="Arial" w:cs="Arial"/>
-          <w:color w:val="000000"/>
-        </w:rPr>
-        <w:instrText xml:space="preserve"> MERGEFIELD M_291 \* MERGEFORMAT </w:instrText>
-      </w:r>
-      <w:r>
-        <w:rPr>
-          <w:rFonts w:ascii="Arial" w:hAnsi="Arial" w:cs="Arial"/>
-          <w:color w:val="000000"/>
-        </w:rPr>
-        <w:fldChar w:fldCharType="separate"/>
-      </w:r>
-      <w:r>
-        <w:rPr>
-          <w:rFonts w:ascii="Arial" w:hAnsi="Arial" w:cs="Arial"/>
-          <w:noProof/>
-          <w:color w:val="000000"/>
-        </w:rPr>
-        <w:t>##InjuryDetails.PrimaryInsuranceCity##</w:t>
-      </w:r>
-      <w:r>
-        <w:rPr>
-          <w:rFonts w:ascii="Arial" w:hAnsi="Arial" w:cs="Arial"/>
-          <w:noProof/>
-          <w:color w:val="000000"/>
-        </w:rPr>
-        <w:t xml:space="preserve">, </w:t>
-      </w:r>
-      <w:r>
-        <w:rPr>
-          <w:rFonts w:ascii="Arial" w:hAnsi="Arial" w:cs="Arial"/>
-          <w:noProof/>
-          <w:color w:val="000000"/>
-        </w:rPr>
-        <w:t>##InjuryDetails.PrimaryInsuranceState##</w:t>
-      </w:r>
-      <w:r>
-        <w:rPr>
-          <w:rFonts w:ascii="Arial" w:hAnsi="Arial" w:cs="Arial"/>
-          <w:noProof/>
-          <w:color w:val="000000"/>
-        </w:rPr>
-        <w:t xml:space="preserve"> </w:t>
-      </w:r>
-      <w:r>
-        <w:rPr>
-          <w:rFonts w:ascii="Arial" w:hAnsi="Arial" w:cs="Arial"/>
-          <w:noProof/>
-          <w:color w:val="000000"/>
-        </w:rPr>
-        <w:t>##InjuryDetails.PrimaryInsuranceZip##</w:t>
-      </w:r>
-      <w:r>
-        <w:rPr>
-          <w:rFonts w:ascii="Arial" w:hAnsi="Arial" w:cs="Arial"/>
-          <w:color w:val="000000"/>
-        </w:rPr>
-        <w:fldChar w:fldCharType="end"/>
-      </w:r>
-    </w:p>
-    <w:p>
-      <w:pPr>
-        <w:contextualSpacing/>
-        <w:rPr>
-          <w:rFonts w:ascii="Arial" w:hAnsi="Arial" w:cs="Arial"/>
-          <w:color w:val="000000"/>
-        </w:rPr>
-      </w:pPr>
-    </w:p>
-    <w:p>
-      <w:pPr>
-        <w:contextualSpacing/>
-        <w:rPr>
-          <w:rFonts w:ascii="Arial" w:hAnsi="Arial" w:cs="Arial"/>
-          <w:color w:val="000000"/>
-          <w:highlight w:val="yellow"/>
-        </w:rPr>
-      </w:pPr>
-    </w:p>
-    <w:p>
-      <w:pPr>
-        <w:contextualSpacing/>
-        <w:rPr>
-          <w:rFonts w:ascii="Arial" w:hAnsi="Arial" w:cs="Arial"/>
-          <w:color w:val="000000"/>
-          <w:highlight w:val="yellow"/>
         </w:rPr>
       </w:pPr>
     </w:p>
@@ -8254,9 +8105,15 @@
         <w:rPr>
           <w:rFonts w:ascii="Arial" w:hAnsi="Arial" w:cs="Arial"/>
           <w:color w:val="000000"/>
-          <w:highlight w:val="yellow"/>
-        </w:rPr>
-      </w:pPr>
+        </w:rPr>
+      </w:pPr>
+      <w:r>
+        <w:rPr>
+          <w:rFonts w:ascii="Arial" w:hAnsi="Arial" w:cs="Arial"/>
+          <w:color w:val="000000"/>
+        </w:rPr>
+        <w:t>##DefenseAttorneys.AttorneyName##</w:t>
+      </w:r>
     </w:p>
     <w:p>
       <w:pPr>
@@ -8264,9 +8121,15 @@
         <w:rPr>
           <w:rFonts w:ascii="Arial" w:hAnsi="Arial" w:cs="Arial"/>
           <w:color w:val="000000"/>
-          <w:highlight w:val="yellow"/>
-        </w:rPr>
-      </w:pPr>
+        </w:rPr>
+      </w:pPr>
+      <w:r>
+        <w:rPr>
+          <w:rFonts w:ascii="Arial" w:hAnsi="Arial" w:cs="Arial"/>
+          <w:color w:val="000000"/>
+        </w:rPr>
+        <w:t>##DefenseAttorneys.Street##</w:t>
+      </w:r>
     </w:p>
     <w:p>
       <w:pPr>
@@ -8281,38 +8144,6 @@
           <w:rFonts w:ascii="Arial" w:hAnsi="Arial" w:cs="Arial"/>
           <w:color w:val="000000"/>
         </w:rPr>
-        <w:t>##DefenseAttorneys.AttorneyName##</w:t>
-      </w:r>
-    </w:p>
-    <w:p>
-      <w:pPr>
-        <w:contextualSpacing/>
-        <w:rPr>
-          <w:rFonts w:ascii="Arial" w:hAnsi="Arial" w:cs="Arial"/>
-          <w:color w:val="000000"/>
-        </w:rPr>
-      </w:pPr>
-      <w:r>
-        <w:rPr>
-          <w:rFonts w:ascii="Arial" w:hAnsi="Arial" w:cs="Arial"/>
-          <w:color w:val="000000"/>
-        </w:rPr>
-        <w:t>##DefenseAttorneys.Street##</w:t>
-      </w:r>
-    </w:p>
-    <w:p>
-      <w:pPr>
-        <w:contextualSpacing/>
-        <w:rPr>
-          <w:rFonts w:ascii="Arial" w:hAnsi="Arial" w:cs="Arial"/>
-          <w:color w:val="000000"/>
-        </w:rPr>
-      </w:pPr>
-      <w:r>
-        <w:rPr>
-          <w:rFonts w:ascii="Arial" w:hAnsi="Arial" w:cs="Arial"/>
-          <w:color w:val="000000"/>
-        </w:rPr>
         <w:fldChar w:fldCharType="begin"/>
       </w:r>
       <w:r>
@@ -8376,30 +8207,6 @@
         </w:rPr>
         <w:fldChar w:fldCharType="end"/>
       </w:r>
-    </w:p>
-    <w:p>
-      <w:pPr>
-        <w:spacing w:line="252" w:lineRule="auto"/>
-        <w:ind w:left="11"/>
-        <w:contextualSpacing/>
-        <w:rPr>
-          <w:rFonts w:ascii="Arial" w:hAnsi="Arial" w:cs="Arial"/>
-          <w:color w:val="000000"/>
-          <w:highlight w:val="yellow"/>
-        </w:rPr>
-      </w:pPr>
-    </w:p>
-    <w:p>
-      <w:pPr>
-        <w:spacing w:line="252" w:lineRule="auto"/>
-        <w:ind w:left="11"/>
-        <w:contextualSpacing/>
-        <w:rPr>
-          <w:rFonts w:ascii="Arial" w:hAnsi="Arial" w:cs="Arial"/>
-          <w:color w:val="000000"/>
-          <w:highlight w:val="yellow"/>
-        </w:rPr>
-      </w:pPr>
     </w:p>
     <w:p>
       <w:pPr>
@@ -8516,51 +8323,8 @@
     </w:p>
     <w:p>
       <w:pPr>
-        <w:spacing w:line="252" w:lineRule="auto"/>
-        <w:ind w:left="11"/>
-        <w:rPr>
-          <w:color w:val="000000"/>
-        </w:rPr>
-      </w:pPr>
-    </w:p>
-    <w:p>
-      <w:pPr>
-        <w:spacing w:line="252" w:lineRule="auto"/>
-        <w:ind w:left="11"/>
-        <w:rPr>
-          <w:color w:val="000000"/>
-        </w:rPr>
-      </w:pPr>
-    </w:p>
-    <w:p>
-      <w:pPr>
-        <w:spacing w:line="252" w:lineRule="auto"/>
-        <w:ind w:left="11"/>
-        <w:rPr>
-          <w:color w:val="000000"/>
-        </w:rPr>
-      </w:pPr>
-    </w:p>
-    <w:p>
-      <w:pPr>
-        <w:spacing w:line="252" w:lineRule="auto"/>
-        <w:rPr>
-          <w:color w:val="000000"/>
-        </w:rPr>
-      </w:pPr>
-    </w:p>
-    <w:p>
-      <w:pPr>
-        <w:rPr>
-          <w:rFonts w:ascii="Footlight MT Light" w:eastAsia="Times New Roman" w:hAnsi="Footlight MT Light" w:cs="Arial"/>
-          <w:b/>
-          <w:bCs/>
-          <w:color w:val="333333"/>
-          <w:sz w:val="51"/>
-          <w:szCs w:val="51"/>
-        </w:rPr>
-      </w:pPr>
-      <w:r>
+        <w:pStyle w:val="Header"/>
+        <w:contextualSpacing/>
         <w:rPr>
           <w:rFonts w:ascii="Footlight MT Light" w:hAnsi="Footlight MT Light" w:cs="Arial"/>
           <w:b/>
@@ -8569,8 +8333,7 @@
           <w:sz w:val="51"/>
           <w:szCs w:val="51"/>
         </w:rPr>
-        <w:br w:type="page"/>
-      </w:r>
+      </w:pPr>
     </w:p>
     <w:p>
       <w:pPr>
@@ -8585,9 +8348,11 @@
           <w:szCs w:val="51"/>
         </w:rPr>
       </w:pPr>
-      <w:bookmarkStart w:id="0" w:name="_GoBack"/>
-      <w:bookmarkEnd w:id="0"/>
-      <w:r>
+    </w:p>
+    <w:p>
+      <w:pPr>
+        <w:pStyle w:val="Header"/>
+        <w:contextualSpacing/>
         <w:rPr>
           <w:rFonts w:ascii="Footlight MT Light" w:hAnsi="Footlight MT Light" w:cs="Arial"/>
           <w:b/>
@@ -8596,10 +8361,12 @@
           <w:sz w:val="51"/>
           <w:szCs w:val="51"/>
         </w:rPr>
-        <w:lastRenderedPageBreak/>
-        <w:t>Yuri Falkinstein</w:t>
-      </w:r>
-      <w:r>
+      </w:pPr>
+    </w:p>
+    <w:p>
+      <w:pPr>
+        <w:pStyle w:val="Header"/>
+        <w:contextualSpacing/>
         <w:rPr>
           <w:rFonts w:ascii="Footlight MT Light" w:hAnsi="Footlight MT Light" w:cs="Arial"/>
           <w:b/>
@@ -8608,24 +8375,144 @@
           <w:sz w:val="51"/>
           <w:szCs w:val="51"/>
         </w:rPr>
-        <w:t>, M.D., FAAOS</w:t>
-      </w:r>
+      </w:pPr>
     </w:p>
     <w:p>
       <w:pPr>
         <w:pStyle w:val="Header"/>
         <w:contextualSpacing/>
-        <w:rPr>
-          <w:sz w:val="18"/>
-          <w:szCs w:val="18"/>
-        </w:rPr>
-      </w:pPr>
-      <w:r>
         <w:rPr>
           <w:rFonts w:ascii="Footlight MT Light" w:hAnsi="Footlight MT Light" w:cs="Arial"/>
           <w:b/>
           <w:bCs/>
           <w:color w:val="333333"/>
+          <w:sz w:val="51"/>
+          <w:szCs w:val="51"/>
+        </w:rPr>
+      </w:pPr>
+    </w:p>
+    <w:p>
+      <w:pPr>
+        <w:pStyle w:val="Header"/>
+        <w:contextualSpacing/>
+        <w:rPr>
+          <w:rFonts w:ascii="Footlight MT Light" w:hAnsi="Footlight MT Light" w:cs="Arial"/>
+          <w:b/>
+          <w:bCs/>
+          <w:color w:val="333333"/>
+          <w:sz w:val="51"/>
+          <w:szCs w:val="51"/>
+        </w:rPr>
+      </w:pPr>
+    </w:p>
+    <w:p>
+      <w:pPr>
+        <w:pStyle w:val="Header"/>
+        <w:contextualSpacing/>
+        <w:rPr>
+          <w:rFonts w:ascii="Footlight MT Light" w:hAnsi="Footlight MT Light" w:cs="Arial"/>
+          <w:b/>
+          <w:bCs/>
+          <w:color w:val="333333"/>
+          <w:sz w:val="51"/>
+          <w:szCs w:val="51"/>
+        </w:rPr>
+      </w:pPr>
+    </w:p>
+    <w:p>
+      <w:pPr>
+        <w:pStyle w:val="Header"/>
+        <w:contextualSpacing/>
+        <w:rPr>
+          <w:rFonts w:ascii="Footlight MT Light" w:hAnsi="Footlight MT Light" w:cs="Arial"/>
+          <w:b/>
+          <w:bCs/>
+          <w:color w:val="333333"/>
+          <w:sz w:val="51"/>
+          <w:szCs w:val="51"/>
+        </w:rPr>
+      </w:pPr>
+    </w:p>
+    <w:p>
+      <w:pPr>
+        <w:pStyle w:val="Header"/>
+        <w:contextualSpacing/>
+        <w:rPr>
+          <w:rFonts w:ascii="Footlight MT Light" w:hAnsi="Footlight MT Light" w:cs="Arial"/>
+          <w:b/>
+          <w:bCs/>
+          <w:color w:val="333333"/>
+          <w:sz w:val="51"/>
+          <w:szCs w:val="51"/>
+        </w:rPr>
+      </w:pPr>
+    </w:p>
+    <w:p>
+      <w:pPr>
+        <w:pStyle w:val="Header"/>
+        <w:contextualSpacing/>
+        <w:rPr>
+          <w:rFonts w:ascii="Footlight MT Light" w:hAnsi="Footlight MT Light" w:cs="Arial"/>
+          <w:b/>
+          <w:bCs/>
+          <w:color w:val="333333"/>
+          <w:sz w:val="51"/>
+          <w:szCs w:val="51"/>
+        </w:rPr>
+      </w:pPr>
+    </w:p>
+    <w:p>
+      <w:pPr>
+        <w:pStyle w:val="Header"/>
+        <w:contextualSpacing/>
+        <w:rPr>
+          <w:rFonts w:ascii="Footlight MT Light" w:hAnsi="Footlight MT Light" w:cs="Arial"/>
+          <w:b/>
+          <w:bCs/>
+          <w:color w:val="333333"/>
+          <w:sz w:val="51"/>
+          <w:szCs w:val="51"/>
+        </w:rPr>
+      </w:pPr>
+      <w:r>
+        <w:rPr>
+          <w:rFonts w:ascii="Footlight MT Light" w:hAnsi="Footlight MT Light" w:cs="Arial"/>
+          <w:b/>
+          <w:bCs/>
+          <w:color w:val="333333"/>
+          <w:sz w:val="51"/>
+          <w:szCs w:val="51"/>
+        </w:rPr>
+        <w:lastRenderedPageBreak/>
+        <w:t>Yuri Falkinstein</w:t>
+      </w:r>
+      <w:r>
+        <w:rPr>
+          <w:rFonts w:ascii="Footlight MT Light" w:hAnsi="Footlight MT Light" w:cs="Arial"/>
+          <w:b/>
+          <w:bCs/>
+          <w:color w:val="333333"/>
+          <w:sz w:val="51"/>
+          <w:szCs w:val="51"/>
+        </w:rPr>
+        <w:t>, M.D., FAAOS</w:t>
+      </w:r>
+    </w:p>
+    <w:p>
+      <w:pPr>
+        <w:pStyle w:val="Header"/>
+        <w:contextualSpacing/>
+        <w:rPr>
+          <w:sz w:val="18"/>
+          <w:szCs w:val="18"/>
+        </w:rPr>
+      </w:pPr>
+      <w:r>
+        <w:rPr>
+          <w:rFonts w:ascii="Footlight MT Light" w:hAnsi="Footlight MT Light" w:cs="Arial"/>
+          <w:b/>
+          <w:bCs/>
+          <w:color w:val="333333"/>
           <w:sz w:val="18"/>
           <w:szCs w:val="18"/>
         </w:rPr>
@@ -8700,16 +8587,15 @@
           <w:bCs/>
           <w:color w:val="000000"/>
         </w:rPr>
-        <w:t>##Patients.FirstName#</w:t>
-      </w:r>
-      <w:proofErr w:type="gramStart"/>
+        <w:t>##Patients.FirstName##</w:t>
+      </w:r>
       <w:r>
         <w:rPr>
           <w:b/>
           <w:bCs/>
           <w:color w:val="000000"/>
         </w:rPr>
-        <w:t>#</w:t>
+        <w:t xml:space="preserve">  </w:t>
       </w:r>
       <w:r>
         <w:rPr>
@@ -8717,7 +8603,192 @@
           <w:bCs/>
           <w:color w:val="000000"/>
         </w:rPr>
+        <w:t>##Patients.LastName##</w:t>
+      </w:r>
+    </w:p>
+    <w:p>
+      <w:pPr>
+        <w:spacing w:after="3" w:line="252" w:lineRule="auto"/>
+        <w:ind w:left="6" w:hanging="10"/>
+        <w:contextualSpacing/>
+        <w:rPr>
+          <w:color w:val="000000"/>
+          <w:highlight w:val="yellow"/>
+        </w:rPr>
+      </w:pPr>
+      <w:r>
+        <w:rPr>
+          <w:color w:val="000000"/>
+          <w:highlight w:val="yellow"/>
+        </w:rPr>
+        <w:fldChar w:fldCharType="begin"/>
+      </w:r>
+      <w:r>
+        <w:rPr>
+          <w:color w:val="000000"/>
+          <w:highlight w:val="yellow"/>
+        </w:rPr>
+        <w:instrText xml:space="preserve"> MERGEFIELD M_46 \* MERGEFORMAT </w:instrText>
+      </w:r>
+      <w:r>
+        <w:rPr>
+          <w:color w:val="000000"/>
+          <w:highlight w:val="yellow"/>
+        </w:rPr>
+        <w:fldChar w:fldCharType="separate"/>
+      </w:r>
+      <w:r>
+        <w:rPr>
+          <w:noProof/>
+          <w:color w:val="000000"/>
+        </w:rPr>
+        <w:t>##Patients.Street##</w:t>
+      </w:r>
+      <w:r>
+        <w:rPr>
+          <w:noProof/>
+          <w:color w:val="000000"/>
+          <w:highlight w:val="yellow"/>
+        </w:rPr>
+        <w:t xml:space="preserve"> </w:t>
+      </w:r>
+      <w:r>
+        <w:rPr>
+          <w:color w:val="000000"/>
+          <w:highlight w:val="yellow"/>
+        </w:rPr>
+        <w:fldChar w:fldCharType="end"/>
+      </w:r>
+    </w:p>
+    <w:p>
+      <w:pPr>
+        <w:spacing w:after="3" w:line="252" w:lineRule="auto"/>
+        <w:ind w:left="6" w:hanging="10"/>
+        <w:contextualSpacing/>
+        <w:rPr>
+          <w:color w:val="000000"/>
+          <w:highlight w:val="yellow"/>
+        </w:rPr>
+      </w:pPr>
+      <w:r>
+        <w:rPr>
+          <w:color w:val="000000"/>
+          <w:highlight w:val="yellow"/>
+        </w:rPr>
+        <w:fldChar w:fldCharType="begin"/>
+      </w:r>
+      <w:r>
+        <w:rPr>
+          <w:color w:val="000000"/>
+          <w:highlight w:val="yellow"/>
+        </w:rPr>
+        <w:instrText xml:space="preserve"> MERGEFIELD M_50 \* MERGEFORMAT </w:instrText>
+      </w:r>
+      <w:r>
+        <w:rPr>
+          <w:color w:val="000000"/>
+          <w:highlight w:val="yellow"/>
+        </w:rPr>
+        <w:fldChar w:fldCharType="separate"/>
+      </w:r>
+      <w:r>
+        <w:rPr>
+          <w:noProof/>
+          <w:color w:val="000000"/>
+        </w:rPr>
+        <w:t xml:space="preserve">##Patients.City##,  </w:t>
+      </w:r>
+      <w:r>
+        <w:rPr>
+          <w:noProof/>
+          <w:color w:val="000000"/>
+        </w:rPr>
+        <w:t>##Patients.State##</w:t>
+      </w:r>
+      <w:r>
+        <w:rPr>
+          <w:color w:val="000000"/>
+          <w:highlight w:val="yellow"/>
+        </w:rPr>
+        <w:fldChar w:fldCharType="end"/>
+      </w:r>
+      <w:r>
+        <w:rPr>
+          <w:color w:val="000000"/>
+        </w:rPr>
+        <w:t xml:space="preserve"> </w:t>
+      </w:r>
+      <w:r>
+        <w:rPr>
+          <w:color w:val="000000"/>
+        </w:rPr>
+        <w:t>##Patients.ZipCode##</w:t>
+      </w:r>
+    </w:p>
+    <w:p>
+      <w:pPr>
+        <w:spacing w:after="3" w:line="252" w:lineRule="auto"/>
+        <w:ind w:left="6" w:hanging="10"/>
+        <w:contextualSpacing/>
+        <w:rPr>
+          <w:color w:val="000000"/>
+          <w:highlight w:val="yellow"/>
+        </w:rPr>
+      </w:pPr>
+      <w:r>
+        <w:rPr>
+          <w:color w:val="000000"/>
+          <w:highlight w:val="yellow"/>
+        </w:rPr>
+        <w:fldChar w:fldCharType="begin"/>
+      </w:r>
+      <w:r>
+        <w:rPr>
+          <w:color w:val="000000"/>
+          <w:highlight w:val="yellow"/>
+        </w:rPr>
+        <w:instrText xml:space="preserve"> MERGEFIELD M_50 \* MERGEFORMAT </w:instrText>
+      </w:r>
+      <w:r>
+        <w:rPr>
+          <w:color w:val="000000"/>
+          <w:highlight w:val="yellow"/>
+        </w:rPr>
+        <w:fldChar w:fldCharType="end"/>
+      </w:r>
+    </w:p>
+    <w:p>
+      <w:pPr>
+        <w:spacing w:line="252" w:lineRule="auto"/>
+        <w:ind w:left="11"/>
+        <w:contextualSpacing/>
+        <w:rPr>
+          <w:color w:val="000000"/>
+          <w:highlight w:val="yellow"/>
+        </w:rPr>
+      </w:pPr>
+      <w:r>
+        <w:rPr>
+          <w:color w:val="000000"/>
+          <w:highlight w:val="yellow"/>
+        </w:rPr>
         <w:t xml:space="preserve">  </w:t>
+      </w:r>
+    </w:p>
+    <w:p>
+      <w:pPr>
+        <w:spacing w:after="3" w:line="252" w:lineRule="auto"/>
+        <w:ind w:left="6" w:hanging="10"/>
+        <w:contextualSpacing/>
+        <w:rPr>
+          <w:color w:val="000000"/>
+        </w:rPr>
+      </w:pPr>
+      <w:r>
+        <w:rPr>
+          <w:color w:val="000000"/>
+        </w:rPr>
+        <w:t xml:space="preserve">Dear Mr. /Mrs.: </w:t>
       </w:r>
       <w:r>
         <w:rPr>
@@ -8725,16 +8796,37 @@
           <w:bCs/>
           <w:color w:val="000000"/>
         </w:rPr>
-        <w:t>#</w:t>
-      </w:r>
-      <w:proofErr w:type="gramEnd"/>
+        <w:t>##Patients.FirstName##</w:t>
+      </w:r>
       <w:r>
         <w:rPr>
           <w:b/>
           <w:bCs/>
           <w:color w:val="000000"/>
         </w:rPr>
-        <w:t>#Patients.LastName##</w:t>
+        <w:t xml:space="preserve">  ##Patients.LastName##</w:t>
+      </w:r>
+      <w:r>
+        <w:rPr>
+          <w:color w:val="000000"/>
+        </w:rPr>
+        <w:t xml:space="preserve"> </w:t>
+      </w:r>
+    </w:p>
+    <w:p>
+      <w:pPr>
+        <w:spacing w:line="252" w:lineRule="auto"/>
+        <w:ind w:left="11"/>
+        <w:contextualSpacing/>
+        <w:rPr>
+          <w:color w:val="000000"/>
+        </w:rPr>
+      </w:pPr>
+      <w:r>
+        <w:rPr>
+          <w:color w:val="000000"/>
+        </w:rPr>
+        <w:t xml:space="preserve">  </w:t>
       </w:r>
     </w:p>
     <w:p>
@@ -8744,308 +8836,25 @@
         <w:contextualSpacing/>
         <w:rPr>
           <w:color w:val="000000"/>
-          <w:highlight w:val="yellow"/>
         </w:rPr>
       </w:pPr>
       <w:r>
         <w:rPr>
           <w:color w:val="000000"/>
-          <w:highlight w:val="yellow"/>
-        </w:rPr>
-        <w:fldChar w:fldCharType="begin"/>
+        </w:rPr>
+        <w:t xml:space="preserve">Please be advised that an appointment has been scheduled for you to see Yuri Falkinstein, M.D. on </w:t>
       </w:r>
       <w:r>
         <w:rPr>
           <w:color w:val="000000"/>
-          <w:highlight w:val="yellow"/>
-        </w:rPr>
-        <w:instrText xml:space="preserve"> MERGEFIELD M_46 \* MERGEFORMAT </w:instrText>
+        </w:rPr>
+        <w:t xml:space="preserve">##Appointments.AvailableDate## at  </w:t>
       </w:r>
       <w:r>
         <w:rPr>
           <w:color w:val="000000"/>
-          <w:highlight w:val="yellow"/>
-        </w:rPr>
-        <w:fldChar w:fldCharType="separate"/>
-      </w:r>
-      <w:r>
-        <w:rPr>
-          <w:noProof/>
-          <w:color w:val="000000"/>
-        </w:rPr>
-        <w:t>##Patients.Street##</w:t>
-      </w:r>
-      <w:r>
-        <w:rPr>
-          <w:noProof/>
-          <w:color w:val="000000"/>
-          <w:highlight w:val="yellow"/>
-        </w:rPr>
-        <w:t xml:space="preserve"> </w:t>
-      </w:r>
-      <w:r>
-        <w:rPr>
-          <w:color w:val="000000"/>
-          <w:highlight w:val="yellow"/>
-        </w:rPr>
-        <w:fldChar w:fldCharType="end"/>
-      </w:r>
-    </w:p>
-    <w:p>
-      <w:pPr>
-        <w:spacing w:after="3" w:line="252" w:lineRule="auto"/>
-        <w:ind w:left="6" w:hanging="10"/>
-        <w:contextualSpacing/>
-        <w:rPr>
-          <w:color w:val="000000"/>
-          <w:highlight w:val="yellow"/>
-        </w:rPr>
-      </w:pPr>
-      <w:r>
-        <w:rPr>
-          <w:color w:val="000000"/>
-          <w:highlight w:val="yellow"/>
-        </w:rPr>
-        <w:fldChar w:fldCharType="begin"/>
-      </w:r>
-      <w:r>
-        <w:rPr>
-          <w:color w:val="000000"/>
-          <w:highlight w:val="yellow"/>
-        </w:rPr>
-        <w:instrText xml:space="preserve"> MERGEFIELD M_50 \* MERGEFORMAT </w:instrText>
-      </w:r>
-      <w:r>
-        <w:rPr>
-          <w:color w:val="000000"/>
-          <w:highlight w:val="yellow"/>
-        </w:rPr>
-        <w:fldChar w:fldCharType="separate"/>
-      </w:r>
-      <w:r>
-        <w:rPr>
-          <w:noProof/>
-          <w:color w:val="000000"/>
-        </w:rPr>
-        <w:t xml:space="preserve">##Patients.City##,  </w:t>
-      </w:r>
-      <w:r>
-        <w:rPr>
-          <w:noProof/>
-          <w:color w:val="000000"/>
-        </w:rPr>
-        <w:t>##Patients.State##</w:t>
-      </w:r>
-      <w:r>
-        <w:rPr>
-          <w:color w:val="000000"/>
-          <w:highlight w:val="yellow"/>
-        </w:rPr>
-        <w:fldChar w:fldCharType="end"/>
-      </w:r>
-      <w:r>
-        <w:rPr>
-          <w:color w:val="000000"/>
-        </w:rPr>
-        <w:t xml:space="preserve"> </w:t>
-      </w:r>
-      <w:r>
-        <w:rPr>
-          <w:color w:val="000000"/>
-        </w:rPr>
-        <w:t>##Patients.ZipCode##</w:t>
-      </w:r>
-    </w:p>
-    <w:p>
-      <w:pPr>
-        <w:spacing w:after="3" w:line="252" w:lineRule="auto"/>
-        <w:ind w:left="6" w:hanging="10"/>
-        <w:contextualSpacing/>
-        <w:rPr>
-          <w:color w:val="000000"/>
-          <w:highlight w:val="yellow"/>
-        </w:rPr>
-      </w:pPr>
-      <w:r>
-        <w:rPr>
-          <w:color w:val="000000"/>
-          <w:highlight w:val="yellow"/>
-        </w:rPr>
-        <w:fldChar w:fldCharType="begin"/>
-      </w:r>
-      <w:r>
-        <w:rPr>
-          <w:color w:val="000000"/>
-          <w:highlight w:val="yellow"/>
-        </w:rPr>
-        <w:instrText xml:space="preserve"> MERGEFIELD M_50 \* MERGEFORMAT </w:instrText>
-      </w:r>
-      <w:r>
-        <w:rPr>
-          <w:color w:val="000000"/>
-          <w:highlight w:val="yellow"/>
-        </w:rPr>
-        <w:fldChar w:fldCharType="end"/>
-      </w:r>
-    </w:p>
-    <w:p>
-      <w:pPr>
-        <w:spacing w:line="252" w:lineRule="auto"/>
-        <w:ind w:left="11"/>
-        <w:contextualSpacing/>
-        <w:rPr>
-          <w:color w:val="000000"/>
-          <w:highlight w:val="yellow"/>
-        </w:rPr>
-      </w:pPr>
-      <w:r>
-        <w:rPr>
-          <w:color w:val="000000"/>
-          <w:highlight w:val="yellow"/>
-        </w:rPr>
-        <w:t xml:space="preserve">  </w:t>
-      </w:r>
-    </w:p>
-    <w:p>
-      <w:pPr>
-        <w:spacing w:after="3" w:line="252" w:lineRule="auto"/>
-        <w:ind w:left="6" w:hanging="10"/>
-        <w:contextualSpacing/>
-        <w:rPr>
-          <w:color w:val="000000"/>
-        </w:rPr>
-      </w:pPr>
-      <w:r>
-        <w:rPr>
-          <w:color w:val="000000"/>
-        </w:rPr>
-        <w:t xml:space="preserve">Dear Mr. /Mrs.: </w:t>
-      </w:r>
-      <w:r>
-        <w:rPr>
-          <w:b/>
-          <w:bCs/>
-          <w:color w:val="000000"/>
-        </w:rPr>
-        <w:t>##Patients.FirstName#</w:t>
-      </w:r>
-      <w:proofErr w:type="gramStart"/>
-      <w:r>
-        <w:rPr>
-          <w:b/>
-          <w:bCs/>
-          <w:color w:val="000000"/>
-        </w:rPr>
-        <w:t>#</w:t>
-      </w:r>
-      <w:r>
-        <w:rPr>
-          <w:b/>
-          <w:bCs/>
-          <w:color w:val="000000"/>
-        </w:rPr>
-        <w:t xml:space="preserve">  #</w:t>
-      </w:r>
-      <w:proofErr w:type="gramEnd"/>
-      <w:r>
-        <w:rPr>
-          <w:b/>
-          <w:bCs/>
-          <w:color w:val="000000"/>
-        </w:rPr>
-        <w:t>#Patients.LastName##</w:t>
-      </w:r>
-      <w:r>
-        <w:rPr>
-          <w:color w:val="000000"/>
-        </w:rPr>
-        <w:t xml:space="preserve"> </w:t>
-      </w:r>
-    </w:p>
-    <w:p>
-      <w:pPr>
-        <w:spacing w:line="252" w:lineRule="auto"/>
-        <w:ind w:left="11"/>
-        <w:contextualSpacing/>
-        <w:rPr>
-          <w:color w:val="000000"/>
-        </w:rPr>
-      </w:pPr>
-      <w:r>
-        <w:rPr>
-          <w:color w:val="000000"/>
-        </w:rPr>
-        <w:t xml:space="preserve">  </w:t>
-      </w:r>
-    </w:p>
-    <w:p>
-      <w:pPr>
-        <w:spacing w:after="3" w:line="252" w:lineRule="auto"/>
-        <w:ind w:left="6" w:hanging="10"/>
-        <w:contextualSpacing/>
-        <w:rPr>
-          <w:color w:val="000000"/>
-        </w:rPr>
-      </w:pPr>
-      <w:r>
-        <w:rPr>
-          <w:color w:val="000000"/>
-        </w:rPr>
-        <w:t xml:space="preserve">Please be advised that an appointment has been scheduled for you to see Yuri Falkinstein, M.D. on </w:t>
-      </w:r>
-      <w:r>
-        <w:rPr>
-          <w:color w:val="000000"/>
-        </w:rPr>
-        <w:t>##</w:t>
-      </w:r>
-      <w:proofErr w:type="spellStart"/>
-      <w:r>
-        <w:rPr>
-          <w:color w:val="000000"/>
-        </w:rPr>
-        <w:t>Appointments.AvailableDate</w:t>
-      </w:r>
-      <w:proofErr w:type="spellEnd"/>
-      <w:r>
-        <w:rPr>
-          <w:color w:val="000000"/>
-        </w:rPr>
-        <w:t xml:space="preserve">## </w:t>
-      </w:r>
-      <w:proofErr w:type="gramStart"/>
-      <w:r>
-        <w:rPr>
-          <w:color w:val="000000"/>
-        </w:rPr>
-        <w:t xml:space="preserve">at  </w:t>
-      </w:r>
-      <w:r>
-        <w:rPr>
-          <w:color w:val="000000"/>
-        </w:rPr>
-        <w:t>#</w:t>
-      </w:r>
-      <w:proofErr w:type="gramEnd"/>
-      <w:r>
-        <w:rPr>
-          <w:color w:val="000000"/>
-        </w:rPr>
-        <w:t>#</w:t>
-      </w:r>
-      <w:proofErr w:type="spellStart"/>
-      <w:r>
-        <w:rPr>
-          <w:color w:val="000000"/>
-        </w:rPr>
-        <w:t>Appointments.AppointmenTime</w:t>
-      </w:r>
-      <w:proofErr w:type="spellEnd"/>
-      <w:r>
-        <w:rPr>
-          <w:color w:val="000000"/>
-        </w:rPr>
-        <w:t>##</w:t>
+        </w:rPr>
+        <w:t>##Appointments.AppointmenTime##</w:t>
       </w:r>
       <w:r>
         <w:rPr>
@@ -9285,7 +9094,7 @@
         </w:rPr>
         <w:br/>
       </w:r>
-      <w:bookmarkStart w:id="1" w:name="_Hlk78194904"/>
+      <w:bookmarkStart w:id="0" w:name="_Hlk78194904"/>
       <w:r>
         <w:rPr>
           <w:color w:val="333333"/>
@@ -9363,7 +9172,7 @@
         </w:rPr>
         <w:t xml:space="preserve"> to your scheduled appointment time with proof of identification.</w:t>
       </w:r>
-      <w:bookmarkEnd w:id="1"/>
+      <w:bookmarkEnd w:id="0"/>
       <w:r>
         <w:rPr>
           <w:color w:val="333333"/>
@@ -11908,17 +11717,6 @@
         </w:rPr>
         <w:t>required)</w:t>
       </w:r>
-    </w:p>
-    <w:p>
-      <w:pPr>
-        <w:contextualSpacing/>
-        <w:jc w:val="center"/>
-        <w:rPr>
-          <w:spacing w:val="-2"/>
-          <w:sz w:val="20"/>
-          <w:u w:val="single"/>
-        </w:rPr>
-      </w:pPr>
     </w:p>
     <w:tbl>
       <w:tblPr>
@@ -11943,7 +11741,6 @@
               <w:bottom w:val="single" w:sz="4" w:space="0" w:color="auto"/>
               <w:right w:val="nil"/>
             </w:tcBorders>
-            <w:shd w:val="clear" w:color="auto" w:fill="auto"/>
             <w:hideMark/>
           </w:tcPr>
           <w:p>
@@ -11976,7 +11773,6 @@
               <w:bottom w:val="single" w:sz="4" w:space="0" w:color="auto"/>
               <w:right w:val="nil"/>
             </w:tcBorders>
-            <w:shd w:val="clear" w:color="auto" w:fill="auto"/>
             <w:hideMark/>
           </w:tcPr>
           <w:p>
@@ -12005,6 +11801,9 @@
         </w:tc>
       </w:tr>
       <w:tr>
+        <w:trPr>
+          <w:trHeight w:val="70"/>
+        </w:trPr>
         <w:tc>
           <w:tcPr>
             <w:tcW w:w="7290" w:type="dxa"/>
@@ -12014,7 +11813,6 @@
               <w:bottom w:val="nil"/>
               <w:right w:val="nil"/>
             </w:tcBorders>
-            <w:shd w:val="clear" w:color="auto" w:fill="auto"/>
             <w:hideMark/>
           </w:tcPr>
           <w:p>
@@ -12063,7 +11861,6 @@
               <w:bottom w:val="nil"/>
               <w:right w:val="nil"/>
             </w:tcBorders>
-            <w:shd w:val="clear" w:color="auto" w:fill="auto"/>
             <w:hideMark/>
           </w:tcPr>
           <w:p>
@@ -12130,26 +11927,6 @@
         </w:tc>
       </w:tr>
     </w:tbl>
-    <w:p>
-      <w:pPr>
-        <w:ind w:left="3218" w:right="3163"/>
-        <w:contextualSpacing/>
-        <w:jc w:val="center"/>
-        <w:rPr>
-          <w:sz w:val="18"/>
-          <w:szCs w:val="20"/>
-          <w:highlight w:val="yellow"/>
-        </w:rPr>
-      </w:pPr>
-      <w:r>
-        <w:rPr>
-          <w:sz w:val="18"/>
-          <w:szCs w:val="20"/>
-          <w:highlight w:val="yellow"/>
-        </w:rPr>
-        <w:t xml:space="preserve">                                                 </w:t>
-      </w:r>
-    </w:p>
     <w:tbl>
       <w:tblPr>
         <w:tblpPr w:leftFromText="180" w:rightFromText="180" w:topFromText="44" w:vertAnchor="text" w:horzAnchor="margin" w:tblpY="70"/>
@@ -12171,14 +11948,13 @@
         </w:trPr>
         <w:tc>
           <w:tcPr>
-            <w:tcW w:w="5395" w:type="dxa"/>
+            <w:tcW w:w="5340" w:type="dxa"/>
             <w:tcBorders>
               <w:top w:val="nil"/>
               <w:left w:val="nil"/>
               <w:bottom w:val="single" w:sz="4" w:space="0" w:color="auto"/>
               <w:right w:val="nil"/>
             </w:tcBorders>
-            <w:shd w:val="clear" w:color="auto" w:fill="auto"/>
             <w:hideMark/>
           </w:tcPr>
           <w:p>
@@ -12207,14 +11983,13 @@
         </w:tc>
         <w:tc>
           <w:tcPr>
-            <w:tcW w:w="2209" w:type="dxa"/>
+            <w:tcW w:w="2200" w:type="dxa"/>
             <w:tcBorders>
               <w:top w:val="nil"/>
               <w:left w:val="nil"/>
               <w:bottom w:val="single" w:sz="4" w:space="0" w:color="auto"/>
               <w:right w:val="nil"/>
             </w:tcBorders>
-            <w:shd w:val="clear" w:color="auto" w:fill="auto"/>
             <w:hideMark/>
           </w:tcPr>
           <w:p>
@@ -12242,14 +12017,13 @@
         </w:tc>
         <w:tc>
           <w:tcPr>
-            <w:tcW w:w="1680" w:type="dxa"/>
+            <w:tcW w:w="1750" w:type="dxa"/>
             <w:tcBorders>
               <w:top w:val="nil"/>
               <w:left w:val="nil"/>
               <w:bottom w:val="single" w:sz="4" w:space="0" w:color="auto"/>
               <w:right w:val="nil"/>
             </w:tcBorders>
-            <w:shd w:val="clear" w:color="auto" w:fill="auto"/>
             <w:hideMark/>
           </w:tcPr>
           <w:p>
@@ -12278,14 +12052,13 @@
         </w:tc>
         <w:tc>
           <w:tcPr>
-            <w:tcW w:w="2376" w:type="dxa"/>
+            <w:tcW w:w="2370" w:type="dxa"/>
             <w:tcBorders>
               <w:top w:val="nil"/>
               <w:left w:val="nil"/>
               <w:bottom w:val="single" w:sz="4" w:space="0" w:color="auto"/>
               <w:right w:val="nil"/>
             </w:tcBorders>
-            <w:shd w:val="clear" w:color="auto" w:fill="auto"/>
             <w:hideMark/>
           </w:tcPr>
           <w:p>
@@ -12315,14 +12088,13 @@
       <w:tr>
         <w:tc>
           <w:tcPr>
-            <w:tcW w:w="5395" w:type="dxa"/>
+            <w:tcW w:w="5340" w:type="dxa"/>
             <w:tcBorders>
               <w:top w:val="single" w:sz="4" w:space="0" w:color="auto"/>
               <w:left w:val="nil"/>
               <w:bottom w:val="nil"/>
               <w:right w:val="nil"/>
             </w:tcBorders>
-            <w:shd w:val="clear" w:color="auto" w:fill="auto"/>
             <w:hideMark/>
           </w:tcPr>
           <w:p>
@@ -12344,14 +12116,13 @@
         </w:tc>
         <w:tc>
           <w:tcPr>
-            <w:tcW w:w="2209" w:type="dxa"/>
+            <w:tcW w:w="2200" w:type="dxa"/>
             <w:tcBorders>
               <w:top w:val="single" w:sz="4" w:space="0" w:color="auto"/>
               <w:left w:val="nil"/>
               <w:bottom w:val="nil"/>
               <w:right w:val="nil"/>
             </w:tcBorders>
-            <w:shd w:val="clear" w:color="auto" w:fill="auto"/>
             <w:hideMark/>
           </w:tcPr>
           <w:p>
@@ -12374,14 +12145,13 @@
         </w:tc>
         <w:tc>
           <w:tcPr>
-            <w:tcW w:w="1680" w:type="dxa"/>
+            <w:tcW w:w="1750" w:type="dxa"/>
             <w:tcBorders>
               <w:top w:val="single" w:sz="4" w:space="0" w:color="auto"/>
               <w:left w:val="nil"/>
               <w:bottom w:val="nil"/>
               <w:right w:val="nil"/>
             </w:tcBorders>
-            <w:shd w:val="clear" w:color="auto" w:fill="auto"/>
             <w:hideMark/>
           </w:tcPr>
           <w:p>
@@ -12404,14 +12174,13 @@
         </w:tc>
         <w:tc>
           <w:tcPr>
-            <w:tcW w:w="2376" w:type="dxa"/>
+            <w:tcW w:w="2370" w:type="dxa"/>
             <w:tcBorders>
               <w:top w:val="single" w:sz="4" w:space="0" w:color="auto"/>
               <w:left w:val="nil"/>
               <w:bottom w:val="nil"/>
               <w:right w:val="nil"/>
             </w:tcBorders>
-            <w:shd w:val="clear" w:color="auto" w:fill="auto"/>
             <w:hideMark/>
           </w:tcPr>
           <w:p>
@@ -12434,11 +12203,6 @@
         </w:tc>
       </w:tr>
     </w:tbl>
-    <w:p>
-      <w:pPr>
-        <w:contextualSpacing/>
-      </w:pPr>
-    </w:p>
     <w:tbl>
       <w:tblPr>
         <w:tblW w:w="0" w:type="auto"/>
@@ -12454,10 +12218,12 @@
         <w:gridCol w:w="3672"/>
       </w:tblGrid>
       <w:tr>
+        <w:trPr>
+          <w:trHeight w:val="80"/>
+        </w:trPr>
         <w:tc>
           <w:tcPr>
-            <w:tcW w:w="3420" w:type="dxa"/>
-            <w:shd w:val="clear" w:color="auto" w:fill="auto"/>
+            <w:tcW w:w="3404" w:type="dxa"/>
           </w:tcPr>
           <w:p>
             <w:pPr>
@@ -12484,8 +12250,7 @@
         </w:tc>
         <w:tc>
           <w:tcPr>
-            <w:tcW w:w="3328" w:type="dxa"/>
-            <w:shd w:val="clear" w:color="auto" w:fill="auto"/>
+            <w:tcW w:w="3319" w:type="dxa"/>
           </w:tcPr>
           <w:p>
             <w:pPr>
@@ -12551,8 +12316,7 @@
         </w:tc>
         <w:tc>
           <w:tcPr>
-            <w:tcW w:w="3692" w:type="dxa"/>
-            <w:shd w:val="clear" w:color="auto" w:fill="auto"/>
+            <w:tcW w:w="3672" w:type="dxa"/>
           </w:tcPr>
           <w:p>
             <w:pPr>
@@ -12581,8 +12345,7 @@
       <w:tr>
         <w:tc>
           <w:tcPr>
-            <w:tcW w:w="3420" w:type="dxa"/>
-            <w:shd w:val="clear" w:color="auto" w:fill="auto"/>
+            <w:tcW w:w="3404" w:type="dxa"/>
           </w:tcPr>
           <w:p>
             <w:pPr>
@@ -12605,8 +12368,7 @@
         </w:tc>
         <w:tc>
           <w:tcPr>
-            <w:tcW w:w="3328" w:type="dxa"/>
-            <w:shd w:val="clear" w:color="auto" w:fill="auto"/>
+            <w:tcW w:w="3319" w:type="dxa"/>
           </w:tcPr>
           <w:p>
             <w:pPr>
@@ -12629,8 +12391,7 @@
         </w:tc>
         <w:tc>
           <w:tcPr>
-            <w:tcW w:w="3692" w:type="dxa"/>
-            <w:shd w:val="clear" w:color="auto" w:fill="auto"/>
+            <w:tcW w:w="3672" w:type="dxa"/>
           </w:tcPr>
           <w:p>
             <w:pPr>
@@ -12700,7 +12461,6 @@
               <w:bottom w:val="single" w:sz="4" w:space="0" w:color="auto"/>
               <w:right w:val="nil"/>
             </w:tcBorders>
-            <w:shd w:val="clear" w:color="auto" w:fill="auto"/>
           </w:tcPr>
           <w:p>
             <w:pPr>
@@ -12736,7 +12496,6 @@
               <w:bottom w:val="nil"/>
               <w:right w:val="nil"/>
             </w:tcBorders>
-            <w:shd w:val="clear" w:color="auto" w:fill="auto"/>
           </w:tcPr>
           <w:p>
             <w:pPr>
@@ -12768,7 +12527,6 @@
               <w:bottom w:val="single" w:sz="4" w:space="0" w:color="auto"/>
               <w:right w:val="nil"/>
             </w:tcBorders>
-            <w:shd w:val="clear" w:color="auto" w:fill="auto"/>
           </w:tcPr>
           <w:p>
             <w:pPr>
@@ -12839,7 +12597,6 @@
               <w:bottom w:val="single" w:sz="4" w:space="0" w:color="auto"/>
               <w:right w:val="nil"/>
             </w:tcBorders>
-            <w:shd w:val="clear" w:color="auto" w:fill="auto"/>
           </w:tcPr>
           <w:p>
             <w:pPr>
@@ -12893,7 +12650,6 @@
               <w:bottom w:val="single" w:sz="4" w:space="0" w:color="auto"/>
               <w:right w:val="nil"/>
             </w:tcBorders>
-            <w:shd w:val="clear" w:color="auto" w:fill="auto"/>
           </w:tcPr>
           <w:p>
             <w:pPr>
@@ -12947,7 +12703,6 @@
               <w:bottom w:val="single" w:sz="4" w:space="0" w:color="auto"/>
               <w:right w:val="nil"/>
             </w:tcBorders>
-            <w:shd w:val="clear" w:color="auto" w:fill="auto"/>
           </w:tcPr>
           <w:p>
             <w:pPr>
@@ -12995,7 +12750,7 @@
       </w:tr>
       <w:tr>
         <w:trPr>
-          <w:trHeight w:val="413"/>
+          <w:trHeight w:val="227"/>
         </w:trPr>
         <w:tc>
           <w:tcPr>
@@ -13006,7 +12761,6 @@
               <w:bottom w:val="nil"/>
               <w:right w:val="nil"/>
             </w:tcBorders>
-            <w:shd w:val="clear" w:color="auto" w:fill="auto"/>
           </w:tcPr>
           <w:p>
             <w:pPr>
@@ -13036,7 +12790,6 @@
               <w:bottom w:val="nil"/>
               <w:right w:val="nil"/>
             </w:tcBorders>
-            <w:shd w:val="clear" w:color="auto" w:fill="auto"/>
           </w:tcPr>
           <w:p>
             <w:pPr>
@@ -13066,7 +12819,6 @@
               <w:bottom w:val="nil"/>
               <w:right w:val="nil"/>
             </w:tcBorders>
-            <w:shd w:val="clear" w:color="auto" w:fill="auto"/>
           </w:tcPr>
           <w:p>
             <w:pPr>
@@ -13096,7 +12848,6 @@
               <w:bottom w:val="nil"/>
               <w:right w:val="nil"/>
             </w:tcBorders>
-            <w:shd w:val="clear" w:color="auto" w:fill="auto"/>
           </w:tcPr>
           <w:p>
             <w:pPr>
@@ -13169,15 +12920,51 @@
         <w:tblLook w:val="04A0" w:firstRow="1" w:lastRow="0" w:firstColumn="1" w:lastColumn="0" w:noHBand="0" w:noVBand="1"/>
       </w:tblPr>
       <w:tblGrid>
-        <w:gridCol w:w="2675"/>
-        <w:gridCol w:w="2532"/>
-        <w:gridCol w:w="2618"/>
-        <w:gridCol w:w="3375"/>
+        <w:gridCol w:w="2832"/>
+        <w:gridCol w:w="2679"/>
+        <w:gridCol w:w="1195"/>
+        <w:gridCol w:w="393"/>
+        <w:gridCol w:w="1259"/>
+        <w:gridCol w:w="467"/>
+        <w:gridCol w:w="2375"/>
       </w:tblGrid>
       <w:tr>
+        <w:trPr>
+          <w:trHeight w:val="390"/>
+        </w:trPr>
         <w:tc>
           <w:tcPr>
-            <w:tcW w:w="8497" w:type="dxa"/>
+            <w:tcW w:w="7100" w:type="dxa"/>
+            <w:gridSpan w:val="4"/>
+            <w:tcBorders>
+              <w:top w:val="nil"/>
+              <w:left w:val="nil"/>
+              <w:bottom w:val="single" w:sz="4" w:space="0" w:color="auto"/>
+              <w:right w:val="nil"/>
+            </w:tcBorders>
+          </w:tcPr>
+          <w:p>
+            <w:pPr>
+              <w:contextualSpacing/>
+              <w:rPr>
+                <w:rFonts w:eastAsia="Calibri"/>
+                <w:sz w:val="20"/>
+                <w:szCs w:val="20"/>
+                <w:highlight w:val="yellow"/>
+              </w:rPr>
+            </w:pPr>
+            <w:r>
+              <w:rPr>
+                <w:rFonts w:ascii="Calibri" w:hAnsi="Calibri" w:cs="Calibri"/>
+                <w:lang w:val="en"/>
+              </w:rPr>
+              <w:t>##InjuryDetails.ClaimExaminerName##</w:t>
+            </w:r>
+          </w:p>
+        </w:tc>
+        <w:tc>
+          <w:tcPr>
+            <w:tcW w:w="4100" w:type="dxa"/>
             <w:gridSpan w:val="3"/>
             <w:tcBorders>
               <w:top w:val="nil"/>
@@ -13185,37 +12972,6 @@
               <w:bottom w:val="single" w:sz="4" w:space="0" w:color="auto"/>
               <w:right w:val="nil"/>
             </w:tcBorders>
-            <w:shd w:val="clear" w:color="auto" w:fill="auto"/>
-          </w:tcPr>
-          <w:p>
-            <w:pPr>
-              <w:contextualSpacing/>
-              <w:rPr>
-                <w:rFonts w:eastAsia="Calibri"/>
-                <w:sz w:val="20"/>
-                <w:szCs w:val="20"/>
-                <w:highlight w:val="yellow"/>
-              </w:rPr>
-            </w:pPr>
-            <w:r>
-              <w:rPr>
-                <w:rFonts w:ascii="Calibri" w:hAnsi="Calibri" w:cs="Calibri"/>
-                <w:lang w:val="en"/>
-              </w:rPr>
-              <w:t>##InjuryDetails.ClaimExaminerName##</w:t>
-            </w:r>
-          </w:p>
-        </w:tc>
-        <w:tc>
-          <w:tcPr>
-            <w:tcW w:w="2833" w:type="dxa"/>
-            <w:tcBorders>
-              <w:top w:val="nil"/>
-              <w:left w:val="nil"/>
-              <w:bottom w:val="single" w:sz="4" w:space="0" w:color="auto"/>
-              <w:right w:val="nil"/>
-            </w:tcBorders>
-            <w:shd w:val="clear" w:color="auto" w:fill="auto"/>
           </w:tcPr>
           <w:p>
             <w:pPr>
@@ -13240,19 +12996,18 @@
       </w:tr>
       <w:tr>
         <w:trPr>
-          <w:trHeight w:val="440"/>
+          <w:trHeight w:val="218"/>
         </w:trPr>
         <w:tc>
           <w:tcPr>
-            <w:tcW w:w="8497" w:type="dxa"/>
-            <w:gridSpan w:val="3"/>
+            <w:tcW w:w="8351" w:type="dxa"/>
+            <w:gridSpan w:val="6"/>
             <w:tcBorders>
               <w:top w:val="single" w:sz="4" w:space="0" w:color="auto"/>
               <w:left w:val="nil"/>
               <w:bottom w:val="nil"/>
               <w:right w:val="nil"/>
             </w:tcBorders>
-            <w:shd w:val="clear" w:color="auto" w:fill="auto"/>
           </w:tcPr>
           <w:p>
             <w:pPr>
@@ -13276,14 +13031,13 @@
         </w:tc>
         <w:tc>
           <w:tcPr>
-            <w:tcW w:w="2833" w:type="dxa"/>
+            <w:tcW w:w="2849" w:type="dxa"/>
             <w:tcBorders>
               <w:top w:val="single" w:sz="4" w:space="0" w:color="auto"/>
               <w:left w:val="nil"/>
               <w:bottom w:val="nil"/>
               <w:right w:val="nil"/>
             </w:tcBorders>
-            <w:shd w:val="clear" w:color="auto" w:fill="auto"/>
           </w:tcPr>
           <w:p>
             <w:pPr>
@@ -13309,7 +13063,7 @@
       <w:tr>
         <w:tc>
           <w:tcPr>
-            <w:tcW w:w="8497" w:type="dxa"/>
+            <w:tcW w:w="6884" w:type="dxa"/>
             <w:gridSpan w:val="3"/>
             <w:tcBorders>
               <w:top w:val="nil"/>
@@ -13317,7 +13071,6 @@
               <w:bottom w:val="single" w:sz="4" w:space="0" w:color="auto"/>
               <w:right w:val="nil"/>
             </w:tcBorders>
-            <w:shd w:val="clear" w:color="auto" w:fill="auto"/>
           </w:tcPr>
           <w:p>
             <w:pPr>
@@ -13341,14 +13094,14 @@
         </w:tc>
         <w:tc>
           <w:tcPr>
-            <w:tcW w:w="2833" w:type="dxa"/>
+            <w:tcW w:w="4316" w:type="dxa"/>
+            <w:gridSpan w:val="4"/>
             <w:tcBorders>
               <w:top w:val="nil"/>
               <w:left w:val="nil"/>
               <w:bottom w:val="single" w:sz="4" w:space="0" w:color="auto"/>
               <w:right w:val="nil"/>
             </w:tcBorders>
-            <w:shd w:val="clear" w:color="auto" w:fill="auto"/>
           </w:tcPr>
           <w:p>
             <w:pPr>
@@ -13373,19 +13126,18 @@
       </w:tr>
       <w:tr>
         <w:trPr>
-          <w:trHeight w:val="404"/>
+          <w:trHeight w:val="227"/>
         </w:trPr>
         <w:tc>
           <w:tcPr>
-            <w:tcW w:w="8497" w:type="dxa"/>
-            <w:gridSpan w:val="3"/>
+            <w:tcW w:w="8351" w:type="dxa"/>
+            <w:gridSpan w:val="6"/>
             <w:tcBorders>
               <w:top w:val="single" w:sz="4" w:space="0" w:color="auto"/>
               <w:left w:val="nil"/>
               <w:bottom w:val="nil"/>
               <w:right w:val="nil"/>
             </w:tcBorders>
-            <w:shd w:val="clear" w:color="auto" w:fill="auto"/>
           </w:tcPr>
           <w:p>
             <w:pPr>
@@ -13409,14 +13161,13 @@
         </w:tc>
         <w:tc>
           <w:tcPr>
-            <w:tcW w:w="2833" w:type="dxa"/>
+            <w:tcW w:w="2849" w:type="dxa"/>
             <w:tcBorders>
               <w:top w:val="single" w:sz="4" w:space="0" w:color="auto"/>
               <w:left w:val="nil"/>
               <w:bottom w:val="nil"/>
               <w:right w:val="nil"/>
             </w:tcBorders>
-            <w:shd w:val="clear" w:color="auto" w:fill="auto"/>
           </w:tcPr>
           <w:p>
             <w:pPr>
@@ -13441,14 +13192,13 @@
       <w:tr>
         <w:tc>
           <w:tcPr>
-            <w:tcW w:w="4495" w:type="dxa"/>
+            <w:tcW w:w="2829" w:type="dxa"/>
             <w:tcBorders>
               <w:top w:val="nil"/>
               <w:left w:val="nil"/>
               <w:bottom w:val="single" w:sz="4" w:space="0" w:color="auto"/>
               <w:right w:val="nil"/>
             </w:tcBorders>
-            <w:shd w:val="clear" w:color="auto" w:fill="auto"/>
           </w:tcPr>
           <w:p>
             <w:pPr>
@@ -13472,14 +13222,13 @@
         </w:tc>
         <w:tc>
           <w:tcPr>
-            <w:tcW w:w="2790" w:type="dxa"/>
+            <w:tcW w:w="2677" w:type="dxa"/>
             <w:tcBorders>
               <w:top w:val="nil"/>
               <w:left w:val="nil"/>
               <w:bottom w:val="single" w:sz="4" w:space="0" w:color="auto"/>
               <w:right w:val="nil"/>
             </w:tcBorders>
-            <w:shd w:val="clear" w:color="auto" w:fill="auto"/>
           </w:tcPr>
           <w:p>
             <w:pPr>
@@ -13503,14 +13252,14 @@
         </w:tc>
         <w:tc>
           <w:tcPr>
-            <w:tcW w:w="1212" w:type="dxa"/>
+            <w:tcW w:w="2324" w:type="dxa"/>
+            <w:gridSpan w:val="3"/>
             <w:tcBorders>
               <w:top w:val="nil"/>
               <w:left w:val="nil"/>
               <w:bottom w:val="single" w:sz="4" w:space="0" w:color="auto"/>
               <w:right w:val="nil"/>
             </w:tcBorders>
-            <w:shd w:val="clear" w:color="auto" w:fill="auto"/>
           </w:tcPr>
           <w:p>
             <w:pPr>
@@ -13534,14 +13283,14 @@
         </w:tc>
         <w:tc>
           <w:tcPr>
-            <w:tcW w:w="2833" w:type="dxa"/>
+            <w:tcW w:w="3370" w:type="dxa"/>
+            <w:gridSpan w:val="2"/>
             <w:tcBorders>
               <w:top w:val="nil"/>
               <w:left w:val="nil"/>
               <w:bottom w:val="single" w:sz="4" w:space="0" w:color="auto"/>
               <w:right w:val="nil"/>
             </w:tcBorders>
-            <w:shd w:val="clear" w:color="auto" w:fill="auto"/>
           </w:tcPr>
           <w:p>
             <w:pPr>
@@ -13565,18 +13314,17 @@
       </w:tr>
       <w:tr>
         <w:trPr>
-          <w:trHeight w:val="440"/>
+          <w:trHeight w:val="497"/>
         </w:trPr>
         <w:tc>
           <w:tcPr>
-            <w:tcW w:w="4495" w:type="dxa"/>
+            <w:tcW w:w="2829" w:type="dxa"/>
             <w:tcBorders>
               <w:top w:val="single" w:sz="4" w:space="0" w:color="auto"/>
               <w:left w:val="nil"/>
               <w:bottom w:val="nil"/>
               <w:right w:val="nil"/>
             </w:tcBorders>
-            <w:shd w:val="clear" w:color="auto" w:fill="auto"/>
           </w:tcPr>
           <w:p>
             <w:pPr>
@@ -13599,14 +13347,13 @@
         </w:tc>
         <w:tc>
           <w:tcPr>
-            <w:tcW w:w="2790" w:type="dxa"/>
+            <w:tcW w:w="2677" w:type="dxa"/>
             <w:tcBorders>
               <w:top w:val="single" w:sz="4" w:space="0" w:color="auto"/>
               <w:left w:val="nil"/>
               <w:bottom w:val="nil"/>
               <w:right w:val="nil"/>
             </w:tcBorders>
-            <w:shd w:val="clear" w:color="auto" w:fill="auto"/>
           </w:tcPr>
           <w:p>
             <w:pPr>
@@ -13629,14 +13376,14 @@
         </w:tc>
         <w:tc>
           <w:tcPr>
-            <w:tcW w:w="1212" w:type="dxa"/>
+            <w:tcW w:w="2845" w:type="dxa"/>
+            <w:gridSpan w:val="4"/>
             <w:tcBorders>
               <w:top w:val="single" w:sz="4" w:space="0" w:color="auto"/>
               <w:left w:val="nil"/>
               <w:bottom w:val="nil"/>
               <w:right w:val="nil"/>
             </w:tcBorders>
-            <w:shd w:val="clear" w:color="auto" w:fill="auto"/>
           </w:tcPr>
           <w:p>
             <w:pPr>
@@ -13659,14 +13406,13 @@
         </w:tc>
         <w:tc>
           <w:tcPr>
-            <w:tcW w:w="2833" w:type="dxa"/>
+            <w:tcW w:w="2849" w:type="dxa"/>
             <w:tcBorders>
               <w:top w:val="single" w:sz="4" w:space="0" w:color="auto"/>
               <w:left w:val="nil"/>
               <w:bottom w:val="nil"/>
               <w:right w:val="nil"/>
             </w:tcBorders>
-            <w:shd w:val="clear" w:color="auto" w:fill="auto"/>
           </w:tcPr>
           <w:p>
             <w:pPr>
@@ -13754,15 +13500,7 @@
           <w:sz w:val="20"/>
           <w:szCs w:val="20"/>
         </w:rPr>
-        <w:t xml:space="preserve">                      Date of Appointment:</w:t>
-      </w:r>
-      <w:r>
-        <w:rPr>
-          <w:b/>
-          <w:sz w:val="20"/>
-          <w:szCs w:val="20"/>
-        </w:rPr>
-        <w:t xml:space="preserve"> </w:t>
+        <w:t xml:space="preserve">               Date of Appointment:</w:t>
       </w:r>
       <w:r>
         <w:rPr>
@@ -13848,7 +13586,6 @@
         <w:tc>
           <w:tcPr>
             <w:tcW w:w="4945" w:type="dxa"/>
-            <w:shd w:val="clear" w:color="auto" w:fill="auto"/>
           </w:tcPr>
           <w:p>
             <w:pPr>
@@ -13877,7 +13614,6 @@
         <w:tc>
           <w:tcPr>
             <w:tcW w:w="2520" w:type="dxa"/>
-            <w:shd w:val="clear" w:color="auto" w:fill="auto"/>
           </w:tcPr>
           <w:p>
             <w:pPr>
@@ -13906,7 +13642,6 @@
         <w:tc>
           <w:tcPr>
             <w:tcW w:w="1022" w:type="dxa"/>
-            <w:shd w:val="clear" w:color="auto" w:fill="auto"/>
           </w:tcPr>
           <w:p>
             <w:pPr>
@@ -13928,7 +13663,6 @@
         <w:tc>
           <w:tcPr>
             <w:tcW w:w="2843" w:type="dxa"/>
-            <w:shd w:val="clear" w:color="auto" w:fill="auto"/>
           </w:tcPr>
           <w:p>
             <w:pPr>
@@ -13962,7 +13696,6 @@
         <w:tc>
           <w:tcPr>
             <w:tcW w:w="4945" w:type="dxa"/>
-            <w:shd w:val="clear" w:color="auto" w:fill="auto"/>
           </w:tcPr>
           <w:p>
             <w:pPr>
@@ -13986,7 +13719,6 @@
         <w:tc>
           <w:tcPr>
             <w:tcW w:w="2520" w:type="dxa"/>
-            <w:shd w:val="clear" w:color="auto" w:fill="auto"/>
           </w:tcPr>
           <w:p>
             <w:pPr>
@@ -14010,7 +13742,6 @@
         <w:tc>
           <w:tcPr>
             <w:tcW w:w="1022" w:type="dxa"/>
-            <w:shd w:val="clear" w:color="auto" w:fill="auto"/>
           </w:tcPr>
           <w:p>
             <w:pPr>
@@ -14034,7 +13765,6 @@
         <w:tc>
           <w:tcPr>
             <w:tcW w:w="2843" w:type="dxa"/>
-            <w:shd w:val="clear" w:color="auto" w:fill="auto"/>
           </w:tcPr>
           <w:p>
             <w:pPr>
@@ -14224,15 +13954,10 @@
     </w:p>
     <w:p>
       <w:pPr>
-        <w:contextualSpacing/>
-        <w:rPr>
-          <w:sz w:val="20"/>
-        </w:rPr>
-      </w:pPr>
-    </w:p>
-    <w:p>
-      <w:pPr>
         <w:pStyle w:val="BodyText"/>
+        <w:rPr>
+          <w:noProof/>
+        </w:rPr>
       </w:pPr>
       <w:r>
         <w:rPr>
@@ -14338,10 +14063,7 @@
     </w:p>
     <w:p>
       <w:pPr>
-        <w:contextualSpacing/>
-        <w:rPr>
-          <w:sz w:val="20"/>
-        </w:rPr>
+        <w:pStyle w:val="BodyText"/>
       </w:pPr>
     </w:p>
     <w:p>
@@ -14355,9 +14077,6 @@
         </w:rPr>
       </w:pPr>
       <w:r>
-        <w:t xml:space="preserve"> </w:t>
-      </w:r>
-      <w:r>
         <w:rPr>
           <w:i/>
           <w:iCs/>
@@ -14372,46 +14091,9 @@
           <w:sz w:val="18"/>
           <w:szCs w:val="20"/>
         </w:rPr>
-        <w:t xml:space="preserve">: The Administrative Director's regulation 10160 requires you to forward a completed, DWC-AD form 101(DEU) (Request for Summary Rating Determination of Qualified Medical Evaluator's Report) (see, 8 Cal. Code Regs. §§ 10160 and 10161) together with all medical </w:t>
-      </w:r>
-      <w:r>
-        <w:rPr>
-          <w:i/>
-          <w:sz w:val="18"/>
-          <w:szCs w:val="20"/>
-        </w:rPr>
-        <w:lastRenderedPageBreak/>
-        <w:t>reports and medical records prior to the scheduled examination with the QME. You must also provide the employee with a DWC-AD form 100 (DEU) (Employee's Disability Questionnaire</w:t>
-      </w:r>
-      <w:proofErr w:type="gramStart"/>
-      <w:r>
-        <w:rPr>
-          <w:i/>
-          <w:sz w:val="18"/>
-          <w:szCs w:val="20"/>
-        </w:rPr>
-        <w:t>)(</w:t>
-      </w:r>
-      <w:proofErr w:type="gramEnd"/>
-      <w:r>
-        <w:rPr>
-          <w:i/>
-          <w:sz w:val="18"/>
-          <w:szCs w:val="20"/>
-        </w:rPr>
-        <w:t>See, 8 Cal. Code Regs. §§ 10160 and 10161) prior to the examination.</w:t>
+        <w:t>: The Administrative Director's regulation 10160 requires you to forward a completed, DWC-AD form 101(DEU) (Request for Summary Rating Determination of Qualified Medical Evaluator's Report) (see, 8 Cal. Code Regs. §§ 10160 and 10161) together with all medical reports and medical records prior to the scheduled examination with the QME. You must also provide the employee with a DWC-AD form 100 (DEU) (Employee's Disability Questionnaire)(See, 8 Cal. Code Regs. §§ 10160 and 10161) prior to the examination.</w:t>
       </w:r>
     </w:p>
-    <w:p>
-      <w:pPr>
-        <w:pStyle w:val="BodyText"/>
-        <w:kinsoku w:val="0"/>
-        <w:overflowPunct w:val="0"/>
-        <w:ind w:left="0" w:firstLine="0"/>
-        <w:contextualSpacing/>
-      </w:pPr>
-    </w:p>
-    <w:p/>
     <w:sectPr>
       <w:pgSz w:w="12240" w:h="15840"/>
       <w:pgMar w:top="780" w:right="520" w:bottom="450" w:left="520" w:header="0" w:footer="0" w:gutter="0"/>
@@ -14426,7 +14108,7 @@
 </file>
 
 <file path=word/endnotes.xml><?xml version="1.0" encoding="utf-8"?>
-<w:endnotes xmlns:wpc="http://schemas.microsoft.com/office/word/2010/wordprocessingCanvas" xmlns:cx="http://schemas.microsoft.com/office/drawing/2014/chartex" xmlns:cx1="http://schemas.microsoft.com/office/drawing/2015/9/8/chartex" xmlns:mc="http://schemas.openxmlformats.org/markup-compatibility/2006" xmlns:o="urn:schemas-microsoft-com:office:office" xmlns:r="http://schemas.openxmlformats.org/officeDocument/2006/relationships" xmlns:m="http://schemas.openxmlformats.org/officeDocument/2006/math" xmlns:v="urn:schemas-microsoft-com:vml" xmlns:wp14="http://schemas.microsoft.com/office/word/2010/wordprocessingDrawing" xmlns:wp="http://schemas.openxmlformats.org/drawingml/2006/wordprocessingDrawing" xmlns:w10="urn:schemas-microsoft-com:office:word" xmlns:w="http://schemas.openxmlformats.org/wordprocessingml/2006/main" xmlns:w14="http://schemas.microsoft.com/office/word/2010/wordml" xmlns:w15="http://schemas.microsoft.com/office/word/2012/wordml" xmlns:w16se="http://schemas.microsoft.com/office/word/2015/wordml/symex" xmlns:wpg="http://schemas.microsoft.com/office/word/2010/wordprocessingGroup" xmlns:wpi="http://schemas.microsoft.com/office/word/2010/wordprocessingInk" xmlns:wne="http://schemas.microsoft.com/office/word/2006/wordml" xmlns:wps="http://schemas.microsoft.com/office/word/2010/wordprocessingShape" mc:Ignorable="w14 w15 w16se wp14">
+<w:endnotes xmlns:wpc="http://schemas.microsoft.com/office/word/2010/wordprocessingCanvas" xmlns:cx="http://schemas.microsoft.com/office/drawing/2014/chartex" xmlns:cx1="http://schemas.microsoft.com/office/drawing/2015/9/8/chartex" xmlns:cx2="http://schemas.microsoft.com/office/drawing/2015/10/21/chartex" xmlns:cx3="http://schemas.microsoft.com/office/drawing/2016/5/9/chartex" xmlns:cx4="http://schemas.microsoft.com/office/drawing/2016/5/10/chartex" xmlns:cx5="http://schemas.microsoft.com/office/drawing/2016/5/11/chartex" xmlns:cx6="http://schemas.microsoft.com/office/drawing/2016/5/12/chartex" xmlns:cx7="http://schemas.microsoft.com/office/drawing/2016/5/13/chartex" xmlns:cx8="http://schemas.microsoft.com/office/drawing/2016/5/14/chartex" xmlns:mc="http://schemas.openxmlformats.org/markup-compatibility/2006" xmlns:aink="http://schemas.microsoft.com/office/drawing/2016/ink" xmlns:am3d="http://schemas.microsoft.com/office/drawing/2017/model3d" xmlns:o="urn:schemas-microsoft-com:office:office" xmlns:oel="http://schemas.microsoft.com/office/2019/extlst" xmlns:r="http://schemas.openxmlformats.org/officeDocument/2006/relationships" xmlns:m="http://schemas.openxmlformats.org/officeDocument/2006/math" xmlns:v="urn:schemas-microsoft-com:vml" xmlns:wp14="http://schemas.microsoft.com/office/word/2010/wordprocessingDrawing" xmlns:wp="http://schemas.openxmlformats.org/drawingml/2006/wordprocessingDrawing" xmlns:w10="urn:schemas-microsoft-com:office:word" xmlns:w="http://schemas.openxmlformats.org/wordprocessingml/2006/main" xmlns:w14="http://schemas.microsoft.com/office/word/2010/wordml" xmlns:w15="http://schemas.microsoft.com/office/word/2012/wordml" xmlns:w16cex="http://schemas.microsoft.com/office/word/2018/wordml/cex" xmlns:w16cid="http://schemas.microsoft.com/office/word/2016/wordml/cid" xmlns:w16="http://schemas.microsoft.com/office/word/2018/wordml" xmlns:w16du="http://schemas.microsoft.com/office/word/2023/wordml/word16du" xmlns:w16sdtdh="http://schemas.microsoft.com/office/word/2020/wordml/sdtdatahash" xmlns:w16sdtfl="http://schemas.microsoft.com/office/word/2024/wordml/sdtformatlock" xmlns:w16se="http://schemas.microsoft.com/office/word/2015/wordml/symex" xmlns:wpg="http://schemas.microsoft.com/office/word/2010/wordprocessingGroup" xmlns:wpi="http://schemas.microsoft.com/office/word/2010/wordprocessingInk" xmlns:wne="http://schemas.microsoft.com/office/word/2006/wordml" xmlns:wps="http://schemas.microsoft.com/office/word/2010/wordprocessingShape" mc:Ignorable="w14 w15 w16se w16cid w16 w16cex w16sdtdh w16sdtfl w16du wp14">
   <w:endnote w:type="separator" w:id="-1">
     <w:p>
       <w:pPr>
@@ -14451,7 +14133,7 @@
 </file>
 
 <file path=word/footer1.xml><?xml version="1.0" encoding="utf-8"?>
-<w:ftr xmlns:wpc="http://schemas.microsoft.com/office/word/2010/wordprocessingCanvas" xmlns:cx="http://schemas.microsoft.com/office/drawing/2014/chartex" xmlns:cx1="http://schemas.microsoft.com/office/drawing/2015/9/8/chartex" xmlns:mc="http://schemas.openxmlformats.org/markup-compatibility/2006" xmlns:o="urn:schemas-microsoft-com:office:office" xmlns:r="http://schemas.openxmlformats.org/officeDocument/2006/relationships" xmlns:m="http://schemas.openxmlformats.org/officeDocument/2006/math" xmlns:v="urn:schemas-microsoft-com:vml" xmlns:wp14="http://schemas.microsoft.com/office/word/2010/wordprocessingDrawing" xmlns:wp="http://schemas.openxmlformats.org/drawingml/2006/wordprocessingDrawing" xmlns:w10="urn:schemas-microsoft-com:office:word" xmlns:w="http://schemas.openxmlformats.org/wordprocessingml/2006/main" xmlns:w14="http://schemas.microsoft.com/office/word/2010/wordml" xmlns:w15="http://schemas.microsoft.com/office/word/2012/wordml" xmlns:w16se="http://schemas.microsoft.com/office/word/2015/wordml/symex" xmlns:wpg="http://schemas.microsoft.com/office/word/2010/wordprocessingGroup" xmlns:wpi="http://schemas.microsoft.com/office/word/2010/wordprocessingInk" xmlns:wne="http://schemas.microsoft.com/office/word/2006/wordml" xmlns:wps="http://schemas.microsoft.com/office/word/2010/wordprocessingShape" mc:Ignorable="w14 w15 w16se wp14">
+<w:ftr xmlns:wpc="http://schemas.microsoft.com/office/word/2010/wordprocessingCanvas" xmlns:cx="http://schemas.microsoft.com/office/drawing/2014/chartex" xmlns:cx1="http://schemas.microsoft.com/office/drawing/2015/9/8/chartex" xmlns:cx2="http://schemas.microsoft.com/office/drawing/2015/10/21/chartex" xmlns:cx3="http://schemas.microsoft.com/office/drawing/2016/5/9/chartex" xmlns:cx4="http://schemas.microsoft.com/office/drawing/2016/5/10/chartex" xmlns:cx5="http://schemas.microsoft.com/office/drawing/2016/5/11/chartex" xmlns:cx6="http://schemas.microsoft.com/office/drawing/2016/5/12/chartex" xmlns:cx7="http://schemas.microsoft.com/office/drawing/2016/5/13/chartex" xmlns:cx8="http://schemas.microsoft.com/office/drawing/2016/5/14/chartex" xmlns:mc="http://schemas.openxmlformats.org/markup-compatibility/2006" xmlns:aink="http://schemas.microsoft.com/office/drawing/2016/ink" xmlns:am3d="http://schemas.microsoft.com/office/drawing/2017/model3d" xmlns:o="urn:schemas-microsoft-com:office:office" xmlns:oel="http://schemas.microsoft.com/office/2019/extlst" xmlns:r="http://schemas.openxmlformats.org/officeDocument/2006/relationships" xmlns:m="http://schemas.openxmlformats.org/officeDocument/2006/math" xmlns:v="urn:schemas-microsoft-com:vml" xmlns:wp14="http://schemas.microsoft.com/office/word/2010/wordprocessingDrawing" xmlns:wp="http://schemas.openxmlformats.org/drawingml/2006/wordprocessingDrawing" xmlns:w10="urn:schemas-microsoft-com:office:word" xmlns:w="http://schemas.openxmlformats.org/wordprocessingml/2006/main" xmlns:w14="http://schemas.microsoft.com/office/word/2010/wordml" xmlns:w15="http://schemas.microsoft.com/office/word/2012/wordml" xmlns:w16cex="http://schemas.microsoft.com/office/word/2018/wordml/cex" xmlns:w16cid="http://schemas.microsoft.com/office/word/2016/wordml/cid" xmlns:w16="http://schemas.microsoft.com/office/word/2018/wordml" xmlns:w16du="http://schemas.microsoft.com/office/word/2023/wordml/word16du" xmlns:w16sdtdh="http://schemas.microsoft.com/office/word/2020/wordml/sdtdatahash" xmlns:w16sdtfl="http://schemas.microsoft.com/office/word/2024/wordml/sdtformatlock" xmlns:w16se="http://schemas.microsoft.com/office/word/2015/wordml/symex" xmlns:wpg="http://schemas.microsoft.com/office/word/2010/wordprocessingGroup" xmlns:wpi="http://schemas.microsoft.com/office/word/2010/wordprocessingInk" xmlns:wne="http://schemas.microsoft.com/office/word/2006/wordml" xmlns:wps="http://schemas.microsoft.com/office/word/2010/wordprocessingShape" mc:Ignorable="w14 w15 w16se w16cid w16 w16cex w16sdtdh w16sdtfl w16du wp14">
   <w:p>
     <w:pPr>
       <w:contextualSpacing/>
@@ -14499,7 +14181,7 @@
 </file>
 
 <file path=word/footer2.xml><?xml version="1.0" encoding="utf-8"?>
-<w:ftr xmlns:wpc="http://schemas.microsoft.com/office/word/2010/wordprocessingCanvas" xmlns:cx="http://schemas.microsoft.com/office/drawing/2014/chartex" xmlns:cx1="http://schemas.microsoft.com/office/drawing/2015/9/8/chartex" xmlns:mc="http://schemas.openxmlformats.org/markup-compatibility/2006" xmlns:o="urn:schemas-microsoft-com:office:office" xmlns:r="http://schemas.openxmlformats.org/officeDocument/2006/relationships" xmlns:m="http://schemas.openxmlformats.org/officeDocument/2006/math" xmlns:v="urn:schemas-microsoft-com:vml" xmlns:wp14="http://schemas.microsoft.com/office/word/2010/wordprocessingDrawing" xmlns:wp="http://schemas.openxmlformats.org/drawingml/2006/wordprocessingDrawing" xmlns:w10="urn:schemas-microsoft-com:office:word" xmlns:w="http://schemas.openxmlformats.org/wordprocessingml/2006/main" xmlns:w14="http://schemas.microsoft.com/office/word/2010/wordml" xmlns:w15="http://schemas.microsoft.com/office/word/2012/wordml" xmlns:w16se="http://schemas.microsoft.com/office/word/2015/wordml/symex" xmlns:wpg="http://schemas.microsoft.com/office/word/2010/wordprocessingGroup" xmlns:wpi="http://schemas.microsoft.com/office/word/2010/wordprocessingInk" xmlns:wne="http://schemas.microsoft.com/office/word/2006/wordml" xmlns:wps="http://schemas.microsoft.com/office/word/2010/wordprocessingShape" mc:Ignorable="w14 w15 w16se wp14">
+<w:ftr xmlns:wpc="http://schemas.microsoft.com/office/word/2010/wordprocessingCanvas" xmlns:cx="http://schemas.microsoft.com/office/drawing/2014/chartex" xmlns:cx1="http://schemas.microsoft.com/office/drawing/2015/9/8/chartex" xmlns:cx2="http://schemas.microsoft.com/office/drawing/2015/10/21/chartex" xmlns:cx3="http://schemas.microsoft.com/office/drawing/2016/5/9/chartex" xmlns:cx4="http://schemas.microsoft.com/office/drawing/2016/5/10/chartex" xmlns:cx5="http://schemas.microsoft.com/office/drawing/2016/5/11/chartex" xmlns:cx6="http://schemas.microsoft.com/office/drawing/2016/5/12/chartex" xmlns:cx7="http://schemas.microsoft.com/office/drawing/2016/5/13/chartex" xmlns:cx8="http://schemas.microsoft.com/office/drawing/2016/5/14/chartex" xmlns:mc="http://schemas.openxmlformats.org/markup-compatibility/2006" xmlns:aink="http://schemas.microsoft.com/office/drawing/2016/ink" xmlns:am3d="http://schemas.microsoft.com/office/drawing/2017/model3d" xmlns:o="urn:schemas-microsoft-com:office:office" xmlns:oel="http://schemas.microsoft.com/office/2019/extlst" xmlns:r="http://schemas.openxmlformats.org/officeDocument/2006/relationships" xmlns:m="http://schemas.openxmlformats.org/officeDocument/2006/math" xmlns:v="urn:schemas-microsoft-com:vml" xmlns:wp14="http://schemas.microsoft.com/office/word/2010/wordprocessingDrawing" xmlns:wp="http://schemas.openxmlformats.org/drawingml/2006/wordprocessingDrawing" xmlns:w10="urn:schemas-microsoft-com:office:word" xmlns:w="http://schemas.openxmlformats.org/wordprocessingml/2006/main" xmlns:w14="http://schemas.microsoft.com/office/word/2010/wordml" xmlns:w15="http://schemas.microsoft.com/office/word/2012/wordml" xmlns:w16cex="http://schemas.microsoft.com/office/word/2018/wordml/cex" xmlns:w16cid="http://schemas.microsoft.com/office/word/2016/wordml/cid" xmlns:w16="http://schemas.microsoft.com/office/word/2018/wordml" xmlns:w16du="http://schemas.microsoft.com/office/word/2023/wordml/word16du" xmlns:w16sdtdh="http://schemas.microsoft.com/office/word/2020/wordml/sdtdatahash" xmlns:w16sdtfl="http://schemas.microsoft.com/office/word/2024/wordml/sdtformatlock" xmlns:w16se="http://schemas.microsoft.com/office/word/2015/wordml/symex" xmlns:wpg="http://schemas.microsoft.com/office/word/2010/wordprocessingGroup" xmlns:wpi="http://schemas.microsoft.com/office/word/2010/wordprocessingInk" xmlns:wne="http://schemas.microsoft.com/office/word/2006/wordml" xmlns:wps="http://schemas.microsoft.com/office/word/2010/wordprocessingShape" mc:Ignorable="w14 w15 w16se w16cid w16 w16cex w16sdtdh w16sdtfl w16du wp14">
   <w:p>
     <w:pPr>
       <w:pStyle w:val="Footer"/>
@@ -14509,7 +14191,7 @@
 </file>
 
 <file path=word/footnotes.xml><?xml version="1.0" encoding="utf-8"?>
-<w:footnotes xmlns:wpc="http://schemas.microsoft.com/office/word/2010/wordprocessingCanvas" xmlns:cx="http://schemas.microsoft.com/office/drawing/2014/chartex" xmlns:cx1="http://schemas.microsoft.com/office/drawing/2015/9/8/chartex" xmlns:mc="http://schemas.openxmlformats.org/markup-compatibility/2006" xmlns:o="urn:schemas-microsoft-com:office:office" xmlns:r="http://schemas.openxmlformats.org/officeDocument/2006/relationships" xmlns:m="http://schemas.openxmlformats.org/officeDocument/2006/math" xmlns:v="urn:schemas-microsoft-com:vml" xmlns:wp14="http://schemas.microsoft.com/office/word/2010/wordprocessingDrawing" xmlns:wp="http://schemas.openxmlformats.org/drawingml/2006/wordprocessingDrawing" xmlns:w10="urn:schemas-microsoft-com:office:word" xmlns:w="http://schemas.openxmlformats.org/wordprocessingml/2006/main" xmlns:w14="http://schemas.microsoft.com/office/word/2010/wordml" xmlns:w15="http://schemas.microsoft.com/office/word/2012/wordml" xmlns:w16se="http://schemas.microsoft.com/office/word/2015/wordml/symex" xmlns:wpg="http://schemas.microsoft.com/office/word/2010/wordprocessingGroup" xmlns:wpi="http://schemas.microsoft.com/office/word/2010/wordprocessingInk" xmlns:wne="http://schemas.microsoft.com/office/word/2006/wordml" xmlns:wps="http://schemas.microsoft.com/office/word/2010/wordprocessingShape" mc:Ignorable="w14 w15 w16se wp14">
+<w:footnotes xmlns:wpc="http://schemas.microsoft.com/office/word/2010/wordprocessingCanvas" xmlns:cx="http://schemas.microsoft.com/office/drawing/2014/chartex" xmlns:cx1="http://schemas.microsoft.com/office/drawing/2015/9/8/chartex" xmlns:cx2="http://schemas.microsoft.com/office/drawing/2015/10/21/chartex" xmlns:cx3="http://schemas.microsoft.com/office/drawing/2016/5/9/chartex" xmlns:cx4="http://schemas.microsoft.com/office/drawing/2016/5/10/chartex" xmlns:cx5="http://schemas.microsoft.com/office/drawing/2016/5/11/chartex" xmlns:cx6="http://schemas.microsoft.com/office/drawing/2016/5/12/chartex" xmlns:cx7="http://schemas.microsoft.com/office/drawing/2016/5/13/chartex" xmlns:cx8="http://schemas.microsoft.com/office/drawing/2016/5/14/chartex" xmlns:mc="http://schemas.openxmlformats.org/markup-compatibility/2006" xmlns:aink="http://schemas.microsoft.com/office/drawing/2016/ink" xmlns:am3d="http://schemas.microsoft.com/office/drawing/2017/model3d" xmlns:o="urn:schemas-microsoft-com:office:office" xmlns:oel="http://schemas.microsoft.com/office/2019/extlst" xmlns:r="http://schemas.openxmlformats.org/officeDocument/2006/relationships" xmlns:m="http://schemas.openxmlformats.org/officeDocument/2006/math" xmlns:v="urn:schemas-microsoft-com:vml" xmlns:wp14="http://schemas.microsoft.com/office/word/2010/wordprocessingDrawing" xmlns:wp="http://schemas.openxmlformats.org/drawingml/2006/wordprocessingDrawing" xmlns:w10="urn:schemas-microsoft-com:office:word" xmlns:w="http://schemas.openxmlformats.org/wordprocessingml/2006/main" xmlns:w14="http://schemas.microsoft.com/office/word/2010/wordml" xmlns:w15="http://schemas.microsoft.com/office/word/2012/wordml" xmlns:w16cex="http://schemas.microsoft.com/office/word/2018/wordml/cex" xmlns:w16cid="http://schemas.microsoft.com/office/word/2016/wordml/cid" xmlns:w16="http://schemas.microsoft.com/office/word/2018/wordml" xmlns:w16du="http://schemas.microsoft.com/office/word/2023/wordml/word16du" xmlns:w16sdtdh="http://schemas.microsoft.com/office/word/2020/wordml/sdtdatahash" xmlns:w16sdtfl="http://schemas.microsoft.com/office/word/2024/wordml/sdtformatlock" xmlns:w16se="http://schemas.microsoft.com/office/word/2015/wordml/symex" xmlns:wpg="http://schemas.microsoft.com/office/word/2010/wordprocessingGroup" xmlns:wpi="http://schemas.microsoft.com/office/word/2010/wordprocessingInk" xmlns:wne="http://schemas.microsoft.com/office/word/2006/wordml" xmlns:wps="http://schemas.microsoft.com/office/word/2010/wordprocessingShape" mc:Ignorable="w14 w15 w16se w16cid w16 w16cex w16sdtdh w16sdtfl w16du wp14">
   <w:footnote w:type="separator" w:id="-1">
     <w:p>
       <w:pPr>
@@ -14534,7 +14216,7 @@
 </file>
 
 <file path=word/numbering.xml><?xml version="1.0" encoding="utf-8"?>
-<w:numbering xmlns:wpc="http://schemas.microsoft.com/office/word/2010/wordprocessingCanvas" xmlns:cx="http://schemas.microsoft.com/office/drawing/2014/chartex" xmlns:cx1="http://schemas.microsoft.com/office/drawing/2015/9/8/chartex" xmlns:mc="http://schemas.openxmlformats.org/markup-compatibility/2006" xmlns:o="urn:schemas-microsoft-com:office:office" xmlns:r="http://schemas.openxmlformats.org/officeDocument/2006/relationships" xmlns:m="http://schemas.openxmlformats.org/officeDocument/2006/math" xmlns:v="urn:schemas-microsoft-com:vml" xmlns:wp14="http://schemas.microsoft.com/office/word/2010/wordprocessingDrawing" xmlns:wp="http://schemas.openxmlformats.org/drawingml/2006/wordprocessingDrawing" xmlns:w10="urn:schemas-microsoft-com:office:word" xmlns:w="http://schemas.openxmlformats.org/wordprocessingml/2006/main" xmlns:w14="http://schemas.microsoft.com/office/word/2010/wordml" xmlns:w15="http://schemas.microsoft.com/office/word/2012/wordml" xmlns:w16se="http://schemas.microsoft.com/office/word/2015/wordml/symex" xmlns:wpg="http://schemas.microsoft.com/office/word/2010/wordprocessingGroup" xmlns:wpi="http://schemas.microsoft.com/office/word/2010/wordprocessingInk" xmlns:wne="http://schemas.microsoft.com/office/word/2006/wordml" xmlns:wps="http://schemas.microsoft.com/office/word/2010/wordprocessingShape" mc:Ignorable="w14 w15 w16se wp14">
+<w:numbering xmlns:wpc="http://schemas.microsoft.com/office/word/2010/wordprocessingCanvas" xmlns:cx="http://schemas.microsoft.com/office/drawing/2014/chartex" xmlns:cx1="http://schemas.microsoft.com/office/drawing/2015/9/8/chartex" xmlns:cx2="http://schemas.microsoft.com/office/drawing/2015/10/21/chartex" xmlns:cx3="http://schemas.microsoft.com/office/drawing/2016/5/9/chartex" xmlns:cx4="http://schemas.microsoft.com/office/drawing/2016/5/10/chartex" xmlns:cx5="http://schemas.microsoft.com/office/drawing/2016/5/11/chartex" xmlns:cx6="http://schemas.microsoft.com/office/drawing/2016/5/12/chartex" xmlns:cx7="http://schemas.microsoft.com/office/drawing/2016/5/13/chartex" xmlns:cx8="http://schemas.microsoft.com/office/drawing/2016/5/14/chartex" xmlns:mc="http://schemas.openxmlformats.org/markup-compatibility/2006" xmlns:aink="http://schemas.microsoft.com/office/drawing/2016/ink" xmlns:am3d="http://schemas.microsoft.com/office/drawing/2017/model3d" xmlns:o="urn:schemas-microsoft-com:office:office" xmlns:oel="http://schemas.microsoft.com/office/2019/extlst" xmlns:r="http://schemas.openxmlformats.org/officeDocument/2006/relationships" xmlns:m="http://schemas.openxmlformats.org/officeDocument/2006/math" xmlns:v="urn:schemas-microsoft-com:vml" xmlns:wp14="http://schemas.microsoft.com/office/word/2010/wordprocessingDrawing" xmlns:wp="http://schemas.openxmlformats.org/drawingml/2006/wordprocessingDrawing" xmlns:w10="urn:schemas-microsoft-com:office:word" xmlns:w="http://schemas.openxmlformats.org/wordprocessingml/2006/main" xmlns:w14="http://schemas.microsoft.com/office/word/2010/wordml" xmlns:w15="http://schemas.microsoft.com/office/word/2012/wordml" xmlns:w16cex="http://schemas.microsoft.com/office/word/2018/wordml/cex" xmlns:w16cid="http://schemas.microsoft.com/office/word/2016/wordml/cid" xmlns:w16="http://schemas.microsoft.com/office/word/2018/wordml" xmlns:w16du="http://schemas.microsoft.com/office/word/2023/wordml/word16du" xmlns:w16sdtdh="http://schemas.microsoft.com/office/word/2020/wordml/sdtdatahash" xmlns:w16sdtfl="http://schemas.microsoft.com/office/word/2024/wordml/sdtformatlock" xmlns:w16se="http://schemas.microsoft.com/office/word/2015/wordml/symex" xmlns:wpg="http://schemas.microsoft.com/office/word/2010/wordprocessingGroup" xmlns:wpi="http://schemas.microsoft.com/office/word/2010/wordprocessingInk" xmlns:wne="http://schemas.microsoft.com/office/word/2006/wordml" xmlns:wps="http://schemas.microsoft.com/office/word/2010/wordprocessingShape" mc:Ignorable="w14 w15 w16se w16cid w16 w16cex w16sdtdh w16sdtfl w16du wp14">
   <w:abstractNum w:abstractNumId="0" w15:restartNumberingAfterBreak="0">
     <w:nsid w:val="00000402"/>
     <w:multiLevelType w:val="multilevel"/>
@@ -16690,86 +16372,86 @@
       </w:pPr>
     </w:lvl>
   </w:abstractNum>
-  <w:num w:numId="1">
+  <w:num w:numId="1" w16cid:durableId="1713923740">
     <w:abstractNumId w:val="3"/>
   </w:num>
-  <w:num w:numId="2">
+  <w:num w:numId="2" w16cid:durableId="1517190501">
     <w:abstractNumId w:val="2"/>
   </w:num>
-  <w:num w:numId="3">
+  <w:num w:numId="3" w16cid:durableId="532573591">
     <w:abstractNumId w:val="1"/>
   </w:num>
-  <w:num w:numId="4">
+  <w:num w:numId="4" w16cid:durableId="1138110683">
     <w:abstractNumId w:val="0"/>
   </w:num>
-  <w:num w:numId="5">
+  <w:num w:numId="5" w16cid:durableId="713579895">
     <w:abstractNumId w:val="4"/>
   </w:num>
-  <w:num w:numId="6">
+  <w:num w:numId="6" w16cid:durableId="1272323191">
     <w:abstractNumId w:val="5"/>
   </w:num>
-  <w:num w:numId="7">
+  <w:num w:numId="7" w16cid:durableId="559634690">
     <w:abstractNumId w:val="10"/>
   </w:num>
-  <w:num w:numId="8">
+  <w:num w:numId="8" w16cid:durableId="108084723">
     <w:abstractNumId w:val="23"/>
   </w:num>
-  <w:num w:numId="9">
+  <w:num w:numId="9" w16cid:durableId="867723793">
     <w:abstractNumId w:val="6"/>
   </w:num>
-  <w:num w:numId="10">
+  <w:num w:numId="10" w16cid:durableId="1864711252">
     <w:abstractNumId w:val="13"/>
   </w:num>
-  <w:num w:numId="11">
+  <w:num w:numId="11" w16cid:durableId="1604533041">
     <w:abstractNumId w:val="14"/>
   </w:num>
-  <w:num w:numId="12">
+  <w:num w:numId="12" w16cid:durableId="1057431343">
     <w:abstractNumId w:val="17"/>
   </w:num>
-  <w:num w:numId="13">
+  <w:num w:numId="13" w16cid:durableId="8878517">
     <w:abstractNumId w:val="19"/>
   </w:num>
-  <w:num w:numId="14">
+  <w:num w:numId="14" w16cid:durableId="146673430">
     <w:abstractNumId w:val="22"/>
   </w:num>
-  <w:num w:numId="15">
+  <w:num w:numId="15" w16cid:durableId="613102191">
     <w:abstractNumId w:val="12"/>
   </w:num>
-  <w:num w:numId="16">
+  <w:num w:numId="16" w16cid:durableId="2123258649">
     <w:abstractNumId w:val="8"/>
   </w:num>
-  <w:num w:numId="17">
+  <w:num w:numId="17" w16cid:durableId="1200899068">
     <w:abstractNumId w:val="21"/>
   </w:num>
-  <w:num w:numId="18">
+  <w:num w:numId="18" w16cid:durableId="1572740624">
     <w:abstractNumId w:val="16"/>
   </w:num>
-  <w:num w:numId="19">
+  <w:num w:numId="19" w16cid:durableId="1034578151">
     <w:abstractNumId w:val="18"/>
   </w:num>
-  <w:num w:numId="20">
+  <w:num w:numId="20" w16cid:durableId="786968518">
     <w:abstractNumId w:val="20"/>
   </w:num>
-  <w:num w:numId="21">
+  <w:num w:numId="21" w16cid:durableId="1127771576">
     <w:abstractNumId w:val="9"/>
   </w:num>
-  <w:num w:numId="22">
+  <w:num w:numId="22" w16cid:durableId="1628781752">
     <w:abstractNumId w:val="15"/>
   </w:num>
-  <w:num w:numId="23">
+  <w:num w:numId="23" w16cid:durableId="1130243029">
     <w:abstractNumId w:val="7"/>
   </w:num>
-  <w:num w:numId="24">
+  <w:num w:numId="24" w16cid:durableId="2009013351">
     <w:abstractNumId w:val="11"/>
   </w:num>
-  <w:num w:numId="25">
+  <w:num w:numId="25" w16cid:durableId="465438464">
     <w:abstractNumId w:val="11"/>
   </w:num>
 </w:numbering>
 </file>
 
 <file path=word/styles.xml><?xml version="1.0" encoding="utf-8"?>
-<w:styles xmlns:mc="http://schemas.openxmlformats.org/markup-compatibility/2006" xmlns:r="http://schemas.openxmlformats.org/officeDocument/2006/relationships" xmlns:w="http://schemas.openxmlformats.org/wordprocessingml/2006/main" xmlns:w14="http://schemas.microsoft.com/office/word/2010/wordml" xmlns:w15="http://schemas.microsoft.com/office/word/2012/wordml" xmlns:w16se="http://schemas.microsoft.com/office/word/2015/wordml/symex" mc:Ignorable="w14 w15 w16se">
+<w:styles xmlns:mc="http://schemas.openxmlformats.org/markup-compatibility/2006" xmlns:r="http://schemas.openxmlformats.org/officeDocument/2006/relationships" xmlns:w="http://schemas.openxmlformats.org/wordprocessingml/2006/main" xmlns:w14="http://schemas.microsoft.com/office/word/2010/wordml" xmlns:w15="http://schemas.microsoft.com/office/word/2012/wordml" xmlns:w16cex="http://schemas.microsoft.com/office/word/2018/wordml/cex" xmlns:w16cid="http://schemas.microsoft.com/office/word/2016/wordml/cid" xmlns:w16="http://schemas.microsoft.com/office/word/2018/wordml" xmlns:w16du="http://schemas.microsoft.com/office/word/2023/wordml/word16du" xmlns:w16sdtdh="http://schemas.microsoft.com/office/word/2020/wordml/sdtdatahash" xmlns:w16sdtfl="http://schemas.microsoft.com/office/word/2024/wordml/sdtformatlock" xmlns:w16se="http://schemas.microsoft.com/office/word/2015/wordml/symex" mc:Ignorable="w14 w15 w16se w16cid w16 w16cex w16sdtdh w16sdtfl w16du">
   <w:docDefaults>
     <w:rPrDefault>
       <w:rPr>
@@ -16785,7 +16467,7 @@
       </w:pPr>
     </w:pPrDefault>
   </w:docDefaults>
-  <w:latentStyles w:defLockedState="0" w:defUIPriority="99" w:defSemiHidden="0" w:defUnhideWhenUsed="0" w:defQFormat="0" w:count="371">
+  <w:latentStyles w:defLockedState="0" w:defUIPriority="99" w:defSemiHidden="0" w:defUnhideWhenUsed="0" w:defQFormat="0" w:count="376">
     <w:lsdException w:name="Normal" w:uiPriority="0" w:qFormat="1"/>
     <w:lsdException w:name="heading 1" w:uiPriority="1" w:qFormat="1"/>
     <w:lsdException w:name="heading 2" w:semiHidden="1" w:uiPriority="1" w:unhideWhenUsed="1" w:qFormat="1"/>
@@ -17157,6 +16839,11 @@
     <w:lsdException w:name="List Table 5 Dark Accent 6" w:uiPriority="50"/>
     <w:lsdException w:name="List Table 6 Colorful Accent 6" w:uiPriority="51"/>
     <w:lsdException w:name="List Table 7 Colorful Accent 6" w:uiPriority="52"/>
+    <w:lsdException w:name="Mention" w:semiHidden="1" w:unhideWhenUsed="1"/>
+    <w:lsdException w:name="Smart Hyperlink" w:semiHidden="1" w:unhideWhenUsed="1"/>
+    <w:lsdException w:name="Hashtag" w:semiHidden="1" w:unhideWhenUsed="1"/>
+    <w:lsdException w:name="Unresolved Mention" w:semiHidden="1" w:unhideWhenUsed="1"/>
+    <w:lsdException w:name="Smart Link" w:semiHidden="1" w:unhideWhenUsed="1"/>
   </w:latentStyles>
   <w:style w:type="paragraph" w:default="1" w:styleId="Normal">
     <w:name w:val="Normal"/>

</xml_diff>

<commit_message>
fix(appointments): correct appointment packet templates
- Refresh AttorneyClaimExaminer, Doctor, and Patient packet
  templates with corrected content
- Binary .docx resources consumed by packet generation
</commit_message>
<xml_diff>
--- a/src/HealthcareSupport.CaseEvaluation.Domain/AppointmentDocuments/Templates/Resources/AttorneyClaimExaminerPacket.docx
+++ b/src/HealthcareSupport.CaseEvaluation.Domain/AppointmentDocuments/Templates/Resources/AttorneyClaimExaminerPacket.docx
@@ -1,6 +1,6 @@
 
 <file path=word/document.xml><?xml version="1.0" encoding="utf-8"?>
-<w:document xmlns:wpc="http://schemas.microsoft.com/office/word/2010/wordprocessingCanvas" xmlns:cx="http://schemas.microsoft.com/office/drawing/2014/chartex" xmlns:cx1="http://schemas.microsoft.com/office/drawing/2015/9/8/chartex" xmlns:mc="http://schemas.openxmlformats.org/markup-compatibility/2006" xmlns:o="urn:schemas-microsoft-com:office:office" xmlns:r="http://schemas.openxmlformats.org/officeDocument/2006/relationships" xmlns:m="http://schemas.openxmlformats.org/officeDocument/2006/math" xmlns:v="urn:schemas-microsoft-com:vml" xmlns:wp14="http://schemas.microsoft.com/office/word/2010/wordprocessingDrawing" xmlns:wp="http://schemas.openxmlformats.org/drawingml/2006/wordprocessingDrawing" xmlns:w10="urn:schemas-microsoft-com:office:word" xmlns:w="http://schemas.openxmlformats.org/wordprocessingml/2006/main" xmlns:w14="http://schemas.microsoft.com/office/word/2010/wordml" xmlns:w15="http://schemas.microsoft.com/office/word/2012/wordml" xmlns:w16se="http://schemas.microsoft.com/office/word/2015/wordml/symex" xmlns:wpg="http://schemas.microsoft.com/office/word/2010/wordprocessingGroup" xmlns:wpi="http://schemas.microsoft.com/office/word/2010/wordprocessingInk" xmlns:wne="http://schemas.microsoft.com/office/word/2006/wordml" xmlns:wps="http://schemas.microsoft.com/office/word/2010/wordprocessingShape" mc:Ignorable="w14 w15 w16se wp14">
+<w:document xmlns:wpc="http://schemas.microsoft.com/office/word/2010/wordprocessingCanvas" xmlns:cx="http://schemas.microsoft.com/office/drawing/2014/chartex" xmlns:cx1="http://schemas.microsoft.com/office/drawing/2015/9/8/chartex" xmlns:cx2="http://schemas.microsoft.com/office/drawing/2015/10/21/chartex" xmlns:cx3="http://schemas.microsoft.com/office/drawing/2016/5/9/chartex" xmlns:cx4="http://schemas.microsoft.com/office/drawing/2016/5/10/chartex" xmlns:cx5="http://schemas.microsoft.com/office/drawing/2016/5/11/chartex" xmlns:cx6="http://schemas.microsoft.com/office/drawing/2016/5/12/chartex" xmlns:cx7="http://schemas.microsoft.com/office/drawing/2016/5/13/chartex" xmlns:cx8="http://schemas.microsoft.com/office/drawing/2016/5/14/chartex" xmlns:mc="http://schemas.openxmlformats.org/markup-compatibility/2006" xmlns:aink="http://schemas.microsoft.com/office/drawing/2016/ink" xmlns:am3d="http://schemas.microsoft.com/office/drawing/2017/model3d" xmlns:o="urn:schemas-microsoft-com:office:office" xmlns:oel="http://schemas.microsoft.com/office/2019/extlst" xmlns:r="http://schemas.openxmlformats.org/officeDocument/2006/relationships" xmlns:m="http://schemas.openxmlformats.org/officeDocument/2006/math" xmlns:v="urn:schemas-microsoft-com:vml" xmlns:wp14="http://schemas.microsoft.com/office/word/2010/wordprocessingDrawing" xmlns:wp="http://schemas.openxmlformats.org/drawingml/2006/wordprocessingDrawing" xmlns:w10="urn:schemas-microsoft-com:office:word" xmlns:w="http://schemas.openxmlformats.org/wordprocessingml/2006/main" xmlns:w14="http://schemas.microsoft.com/office/word/2010/wordml" xmlns:w15="http://schemas.microsoft.com/office/word/2012/wordml" xmlns:w16cex="http://schemas.microsoft.com/office/word/2018/wordml/cex" xmlns:w16cid="http://schemas.microsoft.com/office/word/2016/wordml/cid" xmlns:w16="http://schemas.microsoft.com/office/word/2018/wordml" xmlns:w16du="http://schemas.microsoft.com/office/word/2023/wordml/word16du" xmlns:w16sdtdh="http://schemas.microsoft.com/office/word/2020/wordml/sdtdatahash" xmlns:w16sdtfl="http://schemas.microsoft.com/office/word/2024/wordml/sdtformatlock" xmlns:w16se="http://schemas.microsoft.com/office/word/2015/wordml/symex" xmlns:wpg="http://schemas.microsoft.com/office/word/2010/wordprocessingGroup" xmlns:wpi="http://schemas.microsoft.com/office/word/2010/wordprocessingInk" xmlns:wne="http://schemas.microsoft.com/office/word/2006/wordml" xmlns:wps="http://schemas.microsoft.com/office/word/2010/wordprocessingShape" mc:Ignorable="w14 w15 w16se w16cid w16 w16cex w16sdtdh w16sdtfl w16du wp14">
   <w:body>
     <w:p>
       <w:pPr>
@@ -410,76 +410,28 @@
           <w:u w:val="single"/>
           <w:lang w:val="en"/>
         </w:rPr>
-        <w:t xml:space="preserve"> ##</w:t>
-      </w:r>
-      <w:proofErr w:type="spellStart"/>
+        <w:t xml:space="preserve"> ##Appointments.AvailableDate## </w:t>
+      </w:r>
       <w:r>
         <w:rPr>
           <w:rFonts w:ascii="Arial" w:hAnsi="Arial" w:cs="Arial"/>
           <w:color w:val="000000"/>
           <w:sz w:val="20"/>
           <w:szCs w:val="20"/>
+          <w:lang w:val="en"/>
+        </w:rPr>
+        <w:t xml:space="preserve"> at </w:t>
+      </w:r>
+      <w:r>
+        <w:rPr>
+          <w:rFonts w:ascii="Arial" w:hAnsi="Arial" w:cs="Arial"/>
+          <w:color w:val="000000"/>
+          <w:sz w:val="20"/>
+          <w:szCs w:val="20"/>
           <w:u w:val="single"/>
           <w:lang w:val="en"/>
         </w:rPr>
-        <w:t>Appointments.AvailableDate</w:t>
-      </w:r>
-      <w:proofErr w:type="spellEnd"/>
-      <w:r>
-        <w:rPr>
-          <w:rFonts w:ascii="Arial" w:hAnsi="Arial" w:cs="Arial"/>
-          <w:color w:val="000000"/>
-          <w:sz w:val="20"/>
-          <w:szCs w:val="20"/>
-          <w:u w:val="single"/>
-          <w:lang w:val="en"/>
-        </w:rPr>
-        <w:t xml:space="preserve">## </w:t>
-      </w:r>
-      <w:r>
-        <w:rPr>
-          <w:rFonts w:ascii="Arial" w:hAnsi="Arial" w:cs="Arial"/>
-          <w:color w:val="000000"/>
-          <w:sz w:val="20"/>
-          <w:szCs w:val="20"/>
-          <w:lang w:val="en"/>
-        </w:rPr>
-        <w:t xml:space="preserve"> at </w:t>
-      </w:r>
-      <w:r>
-        <w:rPr>
-          <w:rFonts w:ascii="Arial" w:hAnsi="Arial" w:cs="Arial"/>
-          <w:color w:val="000000"/>
-          <w:sz w:val="20"/>
-          <w:szCs w:val="20"/>
-          <w:u w:val="single"/>
-          <w:lang w:val="en"/>
-        </w:rPr>
-        <w:t>##</w:t>
-      </w:r>
-      <w:proofErr w:type="spellStart"/>
-      <w:r>
-        <w:rPr>
-          <w:rFonts w:ascii="Arial" w:hAnsi="Arial" w:cs="Arial"/>
-          <w:color w:val="000000"/>
-          <w:sz w:val="20"/>
-          <w:szCs w:val="20"/>
-          <w:u w:val="single"/>
-          <w:lang w:val="en"/>
-        </w:rPr>
-        <w:t>Appointments.AppointmenTime</w:t>
-      </w:r>
-      <w:proofErr w:type="spellEnd"/>
-      <w:r>
-        <w:rPr>
-          <w:rFonts w:ascii="Arial" w:hAnsi="Arial" w:cs="Arial"/>
-          <w:color w:val="000000"/>
-          <w:sz w:val="20"/>
-          <w:szCs w:val="20"/>
-          <w:u w:val="single"/>
-          <w:lang w:val="en"/>
-        </w:rPr>
-        <w:t>##</w:t>
+        <w:t>##Appointments.AppointmenTime##</w:t>
       </w:r>
       <w:r>
         <w:rPr>
@@ -2035,7 +1987,7 @@
               </wp:anchor>
             </w:drawing>
           </mc:Choice>
-          <mc:Fallback xmlns:cx2="http://schemas.microsoft.com/office/drawing/2015/10/21/chartex" xmlns:cx3="http://schemas.microsoft.com/office/drawing/2016/5/9/chartex" xmlns:cx4="http://schemas.microsoft.com/office/drawing/2016/5/10/chartex" xmlns:cx5="http://schemas.microsoft.com/office/drawing/2016/5/11/chartex" xmlns:cx6="http://schemas.microsoft.com/office/drawing/2016/5/12/chartex" xmlns:cx7="http://schemas.microsoft.com/office/drawing/2016/5/13/chartex" xmlns:cx8="http://schemas.microsoft.com/office/drawing/2016/5/14/chartex" xmlns:aink="http://schemas.microsoft.com/office/drawing/2016/ink" xmlns:am3d="http://schemas.microsoft.com/office/drawing/2017/model3d" xmlns:w16cex="http://schemas.microsoft.com/office/word/2018/wordml/cex" xmlns:w16cid="http://schemas.microsoft.com/office/word/2016/wordml/cid" xmlns:w16="http://schemas.microsoft.com/office/word/2018/wordml" xmlns:w16sdtdh="http://schemas.microsoft.com/office/word/2020/wordml/sdtdatahash">
+          <mc:Fallback>
             <w:pict>
               <v:line w14:anchorId="0CBFD5C6" id="Straight Connector 9" o:spid="_x0000_s1026" style="position:absolute;z-index:251703296;visibility:visible;mso-wrap-style:square;mso-width-percent:0;mso-height-percent:0;mso-wrap-distance-left:9pt;mso-wrap-distance-top:-3e-5mm;mso-wrap-distance-right:9pt;mso-wrap-distance-bottom:-3e-5mm;mso-position-horizontal:absolute;mso-position-horizontal-relative:text;mso-position-vertical:absolute;mso-position-vertical-relative:text;mso-width-percent:0;mso-height-percent:0;mso-width-relative:page;mso-height-relative:page" from="-27.6pt,12.7pt" to="497.35pt,12.7pt" o:gfxdata="UEsDBBQABgAIAAAAIQC2gziS/gAAAOEBAAATAAAAW0NvbnRlbnRfVHlwZXNdLnhtbJSRQU7DMBBF&#10;90jcwfIWJU67QAgl6YK0S0CoHGBkTxKLZGx5TGhvj5O2G0SRWNoz/78nu9wcxkFMGNg6quQqL6RA&#10;0s5Y6ir5vt9lD1JwBDIwOMJKHpHlpr69KfdHjyxSmriSfYz+USnWPY7AufNIadK6MEJMx9ApD/oD&#10;OlTrorhX2lFEilmcO2RdNtjC5xDF9pCuTyYBB5bi6bQ4syoJ3g9WQ0ymaiLzg5KdCXlKLjvcW893&#10;SUOqXwnz5DrgnHtJTxOsQfEKIT7DmDSUCaxw7Rqn8787ZsmRM9e2VmPeBN4uqYvTtW7jvijg9N/y&#10;JsXecLq0q+WD6m8AAAD//wMAUEsDBBQABgAIAAAAIQA4/SH/1gAAAJQBAAALAAAAX3JlbHMvLnJl&#10;bHOkkMFqwzAMhu+DvYPRfXGawxijTi+j0GvpHsDYimMaW0Yy2fr2M4PBMnrbUb/Q94l/f/hMi1qR&#10;JVI2sOt6UJgd+ZiDgffL8ekFlFSbvV0oo4EbChzGx4f9GRdb25HMsYhqlCwG5lrLq9biZkxWOiqY&#10;22YiTra2kYMu1l1tQD30/bPm3wwYN0x18gb45AdQl1tp5j/sFB2T0FQ7R0nTNEV3j6o9feQzro1i&#10;OWA14Fm+Q8a1a8+Bvu/d/dMb2JY5uiPbhG/ktn4cqGU/er3pcvwCAAD//wMAUEsDBBQABgAIAAAA&#10;IQB23TVL2gEAAKUDAAAOAAAAZHJzL2Uyb0RvYy54bWysU01v2zAMvQ/YfxB0b5wGaJYacXpI0F2K&#10;LUC6H8DKsi1MEgVRi5N/P0r5WNrdhvkgSCL5yPf0vHw6OCv2OpJB38j7yVQK7RW2xveN/PH6fLeQ&#10;ghL4Fix63cijJvm0+vxpOYZaz3BA2+ooGMRTPYZGDimFuqpIDdoBTTBoz8EOo4PEx9hXbYSR0Z2t&#10;ZtPpvBoxtiGi0kR8uzkF5argd51W6XvXkU7CNpJnS2WNZX3La7VaQt1HCINR5zHgH6ZwYDw3vUJt&#10;IIH4Fc1fUM6oiIRdmih0FXadUbpwYDb30w9sdgMEXbiwOBSuMtH/g1Xf9tsoTNvIRyk8OH6iXYpg&#10;+iGJNXrPAmIUj1mnMVDN6Wu/jZmpOvhdeEH1kzhWvQvmA4VT2qGLLqczVXEouh+vuutDEoov5/wt&#10;5g9SqEusgvpSGCKlrxqdyJtGWuOzJFDD/oVSbg31JSVfe3w21pZntV6M7MnZlym/vAJ2V2ch8dYF&#10;5ku+lwJsz7ZVKRZIQmvaXJ6B6EhrG8Ue2DlsuBbHV55XCguUOMAkypeV4RHeleZ5NkDDqbiETkZz&#10;JrHbrXGNXNxWW5876uLXM6s/GubdG7bHbbwIzV4oTc++zWa7PfP+9u9a/QYAAP//AwBQSwMEFAAG&#10;AAgAAAAhANh8U+reAAAACQEAAA8AAABkcnMvZG93bnJldi54bWxMj8FOg0AQhu8mvsNmTLy1i6RU&#10;QZbGaOxJD9Y+wABToN2dRXah6NO7xoMeZ+bLP9+fb2ajxUSD6ywruFlGIIgrW3fcKNi/Py/uQDiP&#10;XKO2TAo+ycGmuLzIMavtmd9o2vlGhBB2GSpove8zKV3VkkG3tD1xuB3sYNCHcWhkPeA5hBst4yha&#10;S4Mdhw8t9vTYUnXajUbBdv5KXnQ1PZXpfowPevvxise1UtdX88M9CE+z/4PhRz+oQxGcSjty7YRW&#10;sEiSOKAK4mQFIgBpuroFUf4uZJHL/w2KbwAAAP//AwBQSwECLQAUAAYACAAAACEAtoM4kv4AAADh&#10;AQAAEwAAAAAAAAAAAAAAAAAAAAAAW0NvbnRlbnRfVHlwZXNdLnhtbFBLAQItABQABgAIAAAAIQA4&#10;/SH/1gAAAJQBAAALAAAAAAAAAAAAAAAAAC8BAABfcmVscy8ucmVsc1BLAQItABQABgAIAAAAIQB2&#10;3TVL2gEAAKUDAAAOAAAAAAAAAAAAAAAAAC4CAABkcnMvZTJvRG9jLnhtbFBLAQItABQABgAIAAAA&#10;IQDYfFPq3gAAAAkBAAAPAAAAAAAAAAAAAAAAADQEAABkcnMvZG93bnJldi54bWxQSwUGAAAAAAQA&#10;BADzAAAAPwUAAAAA&#10;" strokecolor="windowText" strokeweight="1pt">
                 <v:stroke joinstyle="miter"/>
@@ -2062,7 +2014,6 @@
         <w:tc>
           <w:tcPr>
             <w:tcW w:w="4788" w:type="dxa"/>
-            <w:shd w:val="clear" w:color="auto" w:fill="auto"/>
             <w:vAlign w:val="center"/>
           </w:tcPr>
           <w:p>
@@ -2121,7 +2072,6 @@
         <w:tc>
           <w:tcPr>
             <w:tcW w:w="4788" w:type="dxa"/>
-            <w:shd w:val="clear" w:color="auto" w:fill="auto"/>
             <w:vAlign w:val="center"/>
           </w:tcPr>
           <w:p>
@@ -2174,7 +2124,6 @@
         <w:tc>
           <w:tcPr>
             <w:tcW w:w="4788" w:type="dxa"/>
-            <w:shd w:val="clear" w:color="auto" w:fill="auto"/>
             <w:vAlign w:val="center"/>
           </w:tcPr>
           <w:p>
@@ -2193,7 +2142,6 @@
         <w:tc>
           <w:tcPr>
             <w:tcW w:w="4788" w:type="dxa"/>
-            <w:shd w:val="clear" w:color="auto" w:fill="auto"/>
             <w:vAlign w:val="center"/>
           </w:tcPr>
           <w:p>
@@ -2217,7 +2165,6 @@
         <w:tc>
           <w:tcPr>
             <w:tcW w:w="4788" w:type="dxa"/>
-            <w:shd w:val="clear" w:color="auto" w:fill="auto"/>
             <w:vAlign w:val="center"/>
           </w:tcPr>
           <w:p>
@@ -2235,7 +2182,6 @@
         <w:tc>
           <w:tcPr>
             <w:tcW w:w="4788" w:type="dxa"/>
-            <w:shd w:val="clear" w:color="auto" w:fill="auto"/>
             <w:vAlign w:val="center"/>
           </w:tcPr>
           <w:p>
@@ -2269,7 +2215,6 @@
         <w:tc>
           <w:tcPr>
             <w:tcW w:w="4788" w:type="dxa"/>
-            <w:shd w:val="clear" w:color="auto" w:fill="auto"/>
             <w:vAlign w:val="center"/>
           </w:tcPr>
           <w:p>
@@ -2328,7 +2273,6 @@
         <w:tc>
           <w:tcPr>
             <w:tcW w:w="4788" w:type="dxa"/>
-            <w:shd w:val="clear" w:color="auto" w:fill="auto"/>
             <w:vAlign w:val="bottom"/>
           </w:tcPr>
           <w:p>
@@ -2863,7 +2807,6 @@
         </w:rPr>
         <w:t xml:space="preserve">My business address </w:t>
       </w:r>
-      <w:proofErr w:type="gramStart"/>
       <w:r>
         <w:rPr>
           <w:rFonts w:ascii="Arial" w:hAnsi="Arial" w:cs="Arial"/>
@@ -2893,19 +2836,7 @@
           <w:szCs w:val="18"/>
           <w:u w:val="single"/>
         </w:rPr>
-        <w:t>:</w:t>
-      </w:r>
-      <w:proofErr w:type="gramEnd"/>
-      <w:r>
-        <w:rPr>
-          <w:rFonts w:ascii="Arial" w:hAnsi="Arial" w:cs="Arial"/>
-          <w:b/>
-          <w:bCs/>
-          <w:sz w:val="18"/>
-          <w:szCs w:val="18"/>
-          <w:u w:val="single"/>
-        </w:rPr>
-        <w:t xml:space="preserve"> P.O. Box 261656</w:t>
+        <w:t>: P.O. Box 261656</w:t>
       </w:r>
       <w:r>
         <w:rPr>
@@ -7384,19 +7315,6 @@
     </w:p>
     <w:p>
       <w:pPr>
-        <w:pStyle w:val="Header"/>
-        <w:rPr>
-          <w:rFonts w:ascii="Footlight MT Light" w:hAnsi="Footlight MT Light" w:cs="Arial"/>
-          <w:b/>
-          <w:bCs/>
-          <w:color w:val="333333"/>
-          <w:sz w:val="51"/>
-          <w:szCs w:val="51"/>
-        </w:rPr>
-      </w:pPr>
-    </w:p>
-    <w:p>
-      <w:pPr>
         <w:tabs>
           <w:tab w:val="left" w:pos="633"/>
           <w:tab w:val="left" w:pos="4953"/>
@@ -7440,6 +7358,7 @@
           <w:szCs w:val="32"/>
           <w:u w:val="single"/>
         </w:rPr>
+        <w:lastRenderedPageBreak/>
         <w:t>Service List</w:t>
       </w:r>
     </w:p>
@@ -7476,7 +7395,6 @@
         <w:tc>
           <w:tcPr>
             <w:tcW w:w="4820" w:type="dxa"/>
-            <w:shd w:val="clear" w:color="auto" w:fill="auto"/>
             <w:vAlign w:val="center"/>
           </w:tcPr>
           <w:p>
@@ -7538,7 +7456,6 @@
         <w:tc>
           <w:tcPr>
             <w:tcW w:w="4540" w:type="dxa"/>
-            <w:shd w:val="clear" w:color="auto" w:fill="auto"/>
             <w:vAlign w:val="center"/>
           </w:tcPr>
           <w:p>
@@ -7589,7 +7506,6 @@
         <w:tc>
           <w:tcPr>
             <w:tcW w:w="4820" w:type="dxa"/>
-            <w:shd w:val="clear" w:color="auto" w:fill="auto"/>
             <w:vAlign w:val="center"/>
           </w:tcPr>
           <w:p>
@@ -7605,7 +7521,6 @@
         <w:tc>
           <w:tcPr>
             <w:tcW w:w="4540" w:type="dxa"/>
-            <w:shd w:val="clear" w:color="auto" w:fill="auto"/>
             <w:vAlign w:val="center"/>
           </w:tcPr>
           <w:p>
@@ -7627,7 +7542,6 @@
         <w:tc>
           <w:tcPr>
             <w:tcW w:w="4820" w:type="dxa"/>
-            <w:shd w:val="clear" w:color="auto" w:fill="auto"/>
             <w:vAlign w:val="center"/>
           </w:tcPr>
           <w:p>
@@ -7660,7 +7574,6 @@
         <w:tc>
           <w:tcPr>
             <w:tcW w:w="4540" w:type="dxa"/>
-            <w:shd w:val="clear" w:color="auto" w:fill="auto"/>
             <w:vAlign w:val="bottom"/>
           </w:tcPr>
           <w:p>
@@ -7873,36 +7786,28 @@
     </w:tbl>
     <w:p>
       <w:pPr>
-        <w:tabs>
-          <w:tab w:val="left" w:pos="633"/>
-          <w:tab w:val="left" w:pos="4953"/>
-          <w:tab w:val="left" w:pos="5904"/>
-        </w:tabs>
         <w:contextualSpacing/>
-        <w:jc w:val="center"/>
-        <w:rPr>
-          <w:rFonts w:ascii="Arial" w:hAnsi="Arial" w:cs="Arial"/>
-          <w:b/>
-          <w:bCs/>
-          <w:u w:val="single"/>
+        <w:rPr>
+          <w:rFonts w:ascii="Arial" w:hAnsi="Arial" w:cs="Arial"/>
+          <w:color w:val="000000"/>
         </w:rPr>
       </w:pPr>
     </w:p>
     <w:p>
       <w:pPr>
-        <w:tabs>
-          <w:tab w:val="left" w:pos="633"/>
-          <w:tab w:val="left" w:pos="4953"/>
-          <w:tab w:val="left" w:pos="5904"/>
-        </w:tabs>
         <w:contextualSpacing/>
-        <w:jc w:val="center"/>
-        <w:rPr>
-          <w:rFonts w:ascii="Arial" w:hAnsi="Arial" w:cs="Arial"/>
-          <w:b/>
-          <w:bCs/>
-        </w:rPr>
-      </w:pPr>
+        <w:rPr>
+          <w:rFonts w:ascii="Arial" w:hAnsi="Arial" w:cs="Arial"/>
+          <w:color w:val="000000"/>
+        </w:rPr>
+      </w:pPr>
+      <w:r>
+        <w:rPr>
+          <w:rFonts w:ascii="Arial" w:hAnsi="Arial" w:cs="Arial"/>
+          <w:color w:val="000000"/>
+        </w:rPr>
+        <w:t>##InjuryDetails.PrimaryInsuranceName##</w:t>
+      </w:r>
     </w:p>
     <w:p>
       <w:pPr>
@@ -7912,6 +7817,13 @@
           <w:color w:val="000000"/>
         </w:rPr>
       </w:pPr>
+      <w:r>
+        <w:rPr>
+          <w:rFonts w:ascii="Arial" w:hAnsi="Arial" w:cs="Arial"/>
+          <w:color w:val="000000"/>
+        </w:rPr>
+        <w:t>##InjuryDetails.PrimaryInsuranceStreet##</w:t>
+      </w:r>
     </w:p>
     <w:p>
       <w:pPr>
@@ -7921,6 +7833,74 @@
           <w:color w:val="000000"/>
         </w:rPr>
       </w:pPr>
+      <w:r>
+        <w:rPr>
+          <w:rFonts w:ascii="Arial" w:hAnsi="Arial" w:cs="Arial"/>
+          <w:color w:val="000000"/>
+        </w:rPr>
+        <w:fldChar w:fldCharType="begin"/>
+      </w:r>
+      <w:r>
+        <w:rPr>
+          <w:rFonts w:ascii="Arial" w:hAnsi="Arial" w:cs="Arial"/>
+          <w:color w:val="000000"/>
+        </w:rPr>
+        <w:instrText xml:space="preserve"> MERGEFIELD M_291 \* MERGEFORMAT </w:instrText>
+      </w:r>
+      <w:r>
+        <w:rPr>
+          <w:rFonts w:ascii="Arial" w:hAnsi="Arial" w:cs="Arial"/>
+          <w:color w:val="000000"/>
+        </w:rPr>
+        <w:fldChar w:fldCharType="separate"/>
+      </w:r>
+      <w:r>
+        <w:rPr>
+          <w:rFonts w:ascii="Arial" w:hAnsi="Arial" w:cs="Arial"/>
+          <w:noProof/>
+          <w:color w:val="000000"/>
+        </w:rPr>
+        <w:t>##InjuryDetails.PrimaryInsuranceCity##</w:t>
+      </w:r>
+      <w:r>
+        <w:rPr>
+          <w:rFonts w:ascii="Arial" w:hAnsi="Arial" w:cs="Arial"/>
+          <w:noProof/>
+          <w:color w:val="000000"/>
+        </w:rPr>
+        <w:t xml:space="preserve">, </w:t>
+      </w:r>
+      <w:r>
+        <w:rPr>
+          <w:rFonts w:ascii="Arial" w:hAnsi="Arial" w:cs="Arial"/>
+          <w:noProof/>
+          <w:color w:val="000000"/>
+        </w:rPr>
+        <w:t>##InjuryDetails.PrimaryInsuranceState##</w:t>
+      </w:r>
+      <w:r>
+        <w:rPr>
+          <w:rFonts w:ascii="Arial" w:hAnsi="Arial" w:cs="Arial"/>
+          <w:noProof/>
+          <w:color w:val="000000"/>
+        </w:rPr>
+        <w:t xml:space="preserve"> </w:t>
+      </w:r>
+      <w:r>
+        <w:rPr>
+          <w:rFonts w:ascii="Arial" w:hAnsi="Arial" w:cs="Arial"/>
+          <w:noProof/>
+          <w:color w:val="000000"/>
+        </w:rPr>
+        <w:t>##InjuryDetails.PrimaryInsuranceZip##</w:t>
+      </w:r>
+      <w:r>
+        <w:rPr>
+          <w:rFonts w:ascii="Arial" w:hAnsi="Arial" w:cs="Arial"/>
+          <w:color w:val="000000"/>
+        </w:rPr>
+        <w:fldChar w:fldCharType="end"/>
+      </w:r>
     </w:p>
     <w:p>
       <w:pPr>
@@ -7928,135 +7908,6 @@
         <w:rPr>
           <w:rFonts w:ascii="Arial" w:hAnsi="Arial" w:cs="Arial"/>
           <w:color w:val="000000"/>
-        </w:rPr>
-      </w:pPr>
-      <w:r>
-        <w:rPr>
-          <w:rFonts w:ascii="Arial" w:hAnsi="Arial" w:cs="Arial"/>
-          <w:color w:val="000000"/>
-        </w:rPr>
-        <w:t>##InjuryDetails.PrimaryInsuranceName##</w:t>
-      </w:r>
-    </w:p>
-    <w:p>
-      <w:pPr>
-        <w:contextualSpacing/>
-        <w:rPr>
-          <w:rFonts w:ascii="Arial" w:hAnsi="Arial" w:cs="Arial"/>
-          <w:color w:val="000000"/>
-        </w:rPr>
-      </w:pPr>
-      <w:r>
-        <w:rPr>
-          <w:rFonts w:ascii="Arial" w:hAnsi="Arial" w:cs="Arial"/>
-          <w:color w:val="000000"/>
-        </w:rPr>
-        <w:t>##InjuryDetails.PrimaryInsuranceStreet##</w:t>
-      </w:r>
-    </w:p>
-    <w:p>
-      <w:pPr>
-        <w:contextualSpacing/>
-        <w:rPr>
-          <w:rFonts w:ascii="Arial" w:hAnsi="Arial" w:cs="Arial"/>
-          <w:color w:val="000000"/>
-        </w:rPr>
-      </w:pPr>
-      <w:r>
-        <w:rPr>
-          <w:rFonts w:ascii="Arial" w:hAnsi="Arial" w:cs="Arial"/>
-          <w:color w:val="000000"/>
-        </w:rPr>
-        <w:fldChar w:fldCharType="begin"/>
-      </w:r>
-      <w:r>
-        <w:rPr>
-          <w:rFonts w:ascii="Arial" w:hAnsi="Arial" w:cs="Arial"/>
-          <w:color w:val="000000"/>
-        </w:rPr>
-        <w:instrText xml:space="preserve"> MERGEFIELD M_291 \* MERGEFORMAT </w:instrText>
-      </w:r>
-      <w:r>
-        <w:rPr>
-          <w:rFonts w:ascii="Arial" w:hAnsi="Arial" w:cs="Arial"/>
-          <w:color w:val="000000"/>
-        </w:rPr>
-        <w:fldChar w:fldCharType="separate"/>
-      </w:r>
-      <w:r>
-        <w:rPr>
-          <w:rFonts w:ascii="Arial" w:hAnsi="Arial" w:cs="Arial"/>
-          <w:noProof/>
-          <w:color w:val="000000"/>
-        </w:rPr>
-        <w:t>##InjuryDetails.PrimaryInsuranceCity##</w:t>
-      </w:r>
-      <w:r>
-        <w:rPr>
-          <w:rFonts w:ascii="Arial" w:hAnsi="Arial" w:cs="Arial"/>
-          <w:noProof/>
-          <w:color w:val="000000"/>
-        </w:rPr>
-        <w:t xml:space="preserve">, </w:t>
-      </w:r>
-      <w:r>
-        <w:rPr>
-          <w:rFonts w:ascii="Arial" w:hAnsi="Arial" w:cs="Arial"/>
-          <w:noProof/>
-          <w:color w:val="000000"/>
-        </w:rPr>
-        <w:t>##InjuryDetails.PrimaryInsuranceState##</w:t>
-      </w:r>
-      <w:r>
-        <w:rPr>
-          <w:rFonts w:ascii="Arial" w:hAnsi="Arial" w:cs="Arial"/>
-          <w:noProof/>
-          <w:color w:val="000000"/>
-        </w:rPr>
-        <w:t xml:space="preserve"> </w:t>
-      </w:r>
-      <w:r>
-        <w:rPr>
-          <w:rFonts w:ascii="Arial" w:hAnsi="Arial" w:cs="Arial"/>
-          <w:noProof/>
-          <w:color w:val="000000"/>
-        </w:rPr>
-        <w:t>##InjuryDetails.PrimaryInsuranceZip##</w:t>
-      </w:r>
-      <w:r>
-        <w:rPr>
-          <w:rFonts w:ascii="Arial" w:hAnsi="Arial" w:cs="Arial"/>
-          <w:color w:val="000000"/>
-        </w:rPr>
-        <w:fldChar w:fldCharType="end"/>
-      </w:r>
-    </w:p>
-    <w:p>
-      <w:pPr>
-        <w:contextualSpacing/>
-        <w:rPr>
-          <w:rFonts w:ascii="Arial" w:hAnsi="Arial" w:cs="Arial"/>
-          <w:color w:val="000000"/>
-        </w:rPr>
-      </w:pPr>
-    </w:p>
-    <w:p>
-      <w:pPr>
-        <w:contextualSpacing/>
-        <w:rPr>
-          <w:rFonts w:ascii="Arial" w:hAnsi="Arial" w:cs="Arial"/>
-          <w:color w:val="000000"/>
-          <w:highlight w:val="yellow"/>
-        </w:rPr>
-      </w:pPr>
-    </w:p>
-    <w:p>
-      <w:pPr>
-        <w:contextualSpacing/>
-        <w:rPr>
-          <w:rFonts w:ascii="Arial" w:hAnsi="Arial" w:cs="Arial"/>
-          <w:color w:val="000000"/>
-          <w:highlight w:val="yellow"/>
         </w:rPr>
       </w:pPr>
     </w:p>
@@ -8254,9 +8105,15 @@
         <w:rPr>
           <w:rFonts w:ascii="Arial" w:hAnsi="Arial" w:cs="Arial"/>
           <w:color w:val="000000"/>
-          <w:highlight w:val="yellow"/>
-        </w:rPr>
-      </w:pPr>
+        </w:rPr>
+      </w:pPr>
+      <w:r>
+        <w:rPr>
+          <w:rFonts w:ascii="Arial" w:hAnsi="Arial" w:cs="Arial"/>
+          <w:color w:val="000000"/>
+        </w:rPr>
+        <w:t>##DefenseAttorneys.AttorneyName##</w:t>
+      </w:r>
     </w:p>
     <w:p>
       <w:pPr>
@@ -8264,9 +8121,15 @@
         <w:rPr>
           <w:rFonts w:ascii="Arial" w:hAnsi="Arial" w:cs="Arial"/>
           <w:color w:val="000000"/>
-          <w:highlight w:val="yellow"/>
-        </w:rPr>
-      </w:pPr>
+        </w:rPr>
+      </w:pPr>
+      <w:r>
+        <w:rPr>
+          <w:rFonts w:ascii="Arial" w:hAnsi="Arial" w:cs="Arial"/>
+          <w:color w:val="000000"/>
+        </w:rPr>
+        <w:t>##DefenseAttorneys.Street##</w:t>
+      </w:r>
     </w:p>
     <w:p>
       <w:pPr>
@@ -8281,38 +8144,6 @@
           <w:rFonts w:ascii="Arial" w:hAnsi="Arial" w:cs="Arial"/>
           <w:color w:val="000000"/>
         </w:rPr>
-        <w:t>##DefenseAttorneys.AttorneyName##</w:t>
-      </w:r>
-    </w:p>
-    <w:p>
-      <w:pPr>
-        <w:contextualSpacing/>
-        <w:rPr>
-          <w:rFonts w:ascii="Arial" w:hAnsi="Arial" w:cs="Arial"/>
-          <w:color w:val="000000"/>
-        </w:rPr>
-      </w:pPr>
-      <w:r>
-        <w:rPr>
-          <w:rFonts w:ascii="Arial" w:hAnsi="Arial" w:cs="Arial"/>
-          <w:color w:val="000000"/>
-        </w:rPr>
-        <w:t>##DefenseAttorneys.Street##</w:t>
-      </w:r>
-    </w:p>
-    <w:p>
-      <w:pPr>
-        <w:contextualSpacing/>
-        <w:rPr>
-          <w:rFonts w:ascii="Arial" w:hAnsi="Arial" w:cs="Arial"/>
-          <w:color w:val="000000"/>
-        </w:rPr>
-      </w:pPr>
-      <w:r>
-        <w:rPr>
-          <w:rFonts w:ascii="Arial" w:hAnsi="Arial" w:cs="Arial"/>
-          <w:color w:val="000000"/>
-        </w:rPr>
         <w:fldChar w:fldCharType="begin"/>
       </w:r>
       <w:r>
@@ -8376,30 +8207,6 @@
         </w:rPr>
         <w:fldChar w:fldCharType="end"/>
       </w:r>
-    </w:p>
-    <w:p>
-      <w:pPr>
-        <w:spacing w:line="252" w:lineRule="auto"/>
-        <w:ind w:left="11"/>
-        <w:contextualSpacing/>
-        <w:rPr>
-          <w:rFonts w:ascii="Arial" w:hAnsi="Arial" w:cs="Arial"/>
-          <w:color w:val="000000"/>
-          <w:highlight w:val="yellow"/>
-        </w:rPr>
-      </w:pPr>
-    </w:p>
-    <w:p>
-      <w:pPr>
-        <w:spacing w:line="252" w:lineRule="auto"/>
-        <w:ind w:left="11"/>
-        <w:contextualSpacing/>
-        <w:rPr>
-          <w:rFonts w:ascii="Arial" w:hAnsi="Arial" w:cs="Arial"/>
-          <w:color w:val="000000"/>
-          <w:highlight w:val="yellow"/>
-        </w:rPr>
-      </w:pPr>
     </w:p>
     <w:p>
       <w:pPr>
@@ -8516,51 +8323,8 @@
     </w:p>
     <w:p>
       <w:pPr>
-        <w:spacing w:line="252" w:lineRule="auto"/>
-        <w:ind w:left="11"/>
-        <w:rPr>
-          <w:color w:val="000000"/>
-        </w:rPr>
-      </w:pPr>
-    </w:p>
-    <w:p>
-      <w:pPr>
-        <w:spacing w:line="252" w:lineRule="auto"/>
-        <w:ind w:left="11"/>
-        <w:rPr>
-          <w:color w:val="000000"/>
-        </w:rPr>
-      </w:pPr>
-    </w:p>
-    <w:p>
-      <w:pPr>
-        <w:spacing w:line="252" w:lineRule="auto"/>
-        <w:ind w:left="11"/>
-        <w:rPr>
-          <w:color w:val="000000"/>
-        </w:rPr>
-      </w:pPr>
-    </w:p>
-    <w:p>
-      <w:pPr>
-        <w:spacing w:line="252" w:lineRule="auto"/>
-        <w:rPr>
-          <w:color w:val="000000"/>
-        </w:rPr>
-      </w:pPr>
-    </w:p>
-    <w:p>
-      <w:pPr>
-        <w:rPr>
-          <w:rFonts w:ascii="Footlight MT Light" w:eastAsia="Times New Roman" w:hAnsi="Footlight MT Light" w:cs="Arial"/>
-          <w:b/>
-          <w:bCs/>
-          <w:color w:val="333333"/>
-          <w:sz w:val="51"/>
-          <w:szCs w:val="51"/>
-        </w:rPr>
-      </w:pPr>
-      <w:r>
+        <w:pStyle w:val="Header"/>
+        <w:contextualSpacing/>
         <w:rPr>
           <w:rFonts w:ascii="Footlight MT Light" w:hAnsi="Footlight MT Light" w:cs="Arial"/>
           <w:b/>
@@ -8569,8 +8333,7 @@
           <w:sz w:val="51"/>
           <w:szCs w:val="51"/>
         </w:rPr>
-        <w:br w:type="page"/>
-      </w:r>
+      </w:pPr>
     </w:p>
     <w:p>
       <w:pPr>
@@ -8585,9 +8348,11 @@
           <w:szCs w:val="51"/>
         </w:rPr>
       </w:pPr>
-      <w:bookmarkStart w:id="0" w:name="_GoBack"/>
-      <w:bookmarkEnd w:id="0"/>
-      <w:r>
+    </w:p>
+    <w:p>
+      <w:pPr>
+        <w:pStyle w:val="Header"/>
+        <w:contextualSpacing/>
         <w:rPr>
           <w:rFonts w:ascii="Footlight MT Light" w:hAnsi="Footlight MT Light" w:cs="Arial"/>
           <w:b/>
@@ -8596,10 +8361,12 @@
           <w:sz w:val="51"/>
           <w:szCs w:val="51"/>
         </w:rPr>
-        <w:lastRenderedPageBreak/>
-        <w:t>Yuri Falkinstein</w:t>
-      </w:r>
-      <w:r>
+      </w:pPr>
+    </w:p>
+    <w:p>
+      <w:pPr>
+        <w:pStyle w:val="Header"/>
+        <w:contextualSpacing/>
         <w:rPr>
           <w:rFonts w:ascii="Footlight MT Light" w:hAnsi="Footlight MT Light" w:cs="Arial"/>
           <w:b/>
@@ -8608,24 +8375,144 @@
           <w:sz w:val="51"/>
           <w:szCs w:val="51"/>
         </w:rPr>
-        <w:t>, M.D., FAAOS</w:t>
-      </w:r>
+      </w:pPr>
     </w:p>
     <w:p>
       <w:pPr>
         <w:pStyle w:val="Header"/>
         <w:contextualSpacing/>
-        <w:rPr>
-          <w:sz w:val="18"/>
-          <w:szCs w:val="18"/>
-        </w:rPr>
-      </w:pPr>
-      <w:r>
         <w:rPr>
           <w:rFonts w:ascii="Footlight MT Light" w:hAnsi="Footlight MT Light" w:cs="Arial"/>
           <w:b/>
           <w:bCs/>
           <w:color w:val="333333"/>
+          <w:sz w:val="51"/>
+          <w:szCs w:val="51"/>
+        </w:rPr>
+      </w:pPr>
+    </w:p>
+    <w:p>
+      <w:pPr>
+        <w:pStyle w:val="Header"/>
+        <w:contextualSpacing/>
+        <w:rPr>
+          <w:rFonts w:ascii="Footlight MT Light" w:hAnsi="Footlight MT Light" w:cs="Arial"/>
+          <w:b/>
+          <w:bCs/>
+          <w:color w:val="333333"/>
+          <w:sz w:val="51"/>
+          <w:szCs w:val="51"/>
+        </w:rPr>
+      </w:pPr>
+    </w:p>
+    <w:p>
+      <w:pPr>
+        <w:pStyle w:val="Header"/>
+        <w:contextualSpacing/>
+        <w:rPr>
+          <w:rFonts w:ascii="Footlight MT Light" w:hAnsi="Footlight MT Light" w:cs="Arial"/>
+          <w:b/>
+          <w:bCs/>
+          <w:color w:val="333333"/>
+          <w:sz w:val="51"/>
+          <w:szCs w:val="51"/>
+        </w:rPr>
+      </w:pPr>
+    </w:p>
+    <w:p>
+      <w:pPr>
+        <w:pStyle w:val="Header"/>
+        <w:contextualSpacing/>
+        <w:rPr>
+          <w:rFonts w:ascii="Footlight MT Light" w:hAnsi="Footlight MT Light" w:cs="Arial"/>
+          <w:b/>
+          <w:bCs/>
+          <w:color w:val="333333"/>
+          <w:sz w:val="51"/>
+          <w:szCs w:val="51"/>
+        </w:rPr>
+      </w:pPr>
+    </w:p>
+    <w:p>
+      <w:pPr>
+        <w:pStyle w:val="Header"/>
+        <w:contextualSpacing/>
+        <w:rPr>
+          <w:rFonts w:ascii="Footlight MT Light" w:hAnsi="Footlight MT Light" w:cs="Arial"/>
+          <w:b/>
+          <w:bCs/>
+          <w:color w:val="333333"/>
+          <w:sz w:val="51"/>
+          <w:szCs w:val="51"/>
+        </w:rPr>
+      </w:pPr>
+    </w:p>
+    <w:p>
+      <w:pPr>
+        <w:pStyle w:val="Header"/>
+        <w:contextualSpacing/>
+        <w:rPr>
+          <w:rFonts w:ascii="Footlight MT Light" w:hAnsi="Footlight MT Light" w:cs="Arial"/>
+          <w:b/>
+          <w:bCs/>
+          <w:color w:val="333333"/>
+          <w:sz w:val="51"/>
+          <w:szCs w:val="51"/>
+        </w:rPr>
+      </w:pPr>
+    </w:p>
+    <w:p>
+      <w:pPr>
+        <w:pStyle w:val="Header"/>
+        <w:contextualSpacing/>
+        <w:rPr>
+          <w:rFonts w:ascii="Footlight MT Light" w:hAnsi="Footlight MT Light" w:cs="Arial"/>
+          <w:b/>
+          <w:bCs/>
+          <w:color w:val="333333"/>
+          <w:sz w:val="51"/>
+          <w:szCs w:val="51"/>
+        </w:rPr>
+      </w:pPr>
+      <w:r>
+        <w:rPr>
+          <w:rFonts w:ascii="Footlight MT Light" w:hAnsi="Footlight MT Light" w:cs="Arial"/>
+          <w:b/>
+          <w:bCs/>
+          <w:color w:val="333333"/>
+          <w:sz w:val="51"/>
+          <w:szCs w:val="51"/>
+        </w:rPr>
+        <w:lastRenderedPageBreak/>
+        <w:t>Yuri Falkinstein</w:t>
+      </w:r>
+      <w:r>
+        <w:rPr>
+          <w:rFonts w:ascii="Footlight MT Light" w:hAnsi="Footlight MT Light" w:cs="Arial"/>
+          <w:b/>
+          <w:bCs/>
+          <w:color w:val="333333"/>
+          <w:sz w:val="51"/>
+          <w:szCs w:val="51"/>
+        </w:rPr>
+        <w:t>, M.D., FAAOS</w:t>
+      </w:r>
+    </w:p>
+    <w:p>
+      <w:pPr>
+        <w:pStyle w:val="Header"/>
+        <w:contextualSpacing/>
+        <w:rPr>
+          <w:sz w:val="18"/>
+          <w:szCs w:val="18"/>
+        </w:rPr>
+      </w:pPr>
+      <w:r>
+        <w:rPr>
+          <w:rFonts w:ascii="Footlight MT Light" w:hAnsi="Footlight MT Light" w:cs="Arial"/>
+          <w:b/>
+          <w:bCs/>
+          <w:color w:val="333333"/>
           <w:sz w:val="18"/>
           <w:szCs w:val="18"/>
         </w:rPr>
@@ -8700,16 +8587,15 @@
           <w:bCs/>
           <w:color w:val="000000"/>
         </w:rPr>
-        <w:t>##Patients.FirstName#</w:t>
-      </w:r>
-      <w:proofErr w:type="gramStart"/>
+        <w:t>##Patients.FirstName##</w:t>
+      </w:r>
       <w:r>
         <w:rPr>
           <w:b/>
           <w:bCs/>
           <w:color w:val="000000"/>
         </w:rPr>
-        <w:t>#</w:t>
+        <w:t xml:space="preserve">  </w:t>
       </w:r>
       <w:r>
         <w:rPr>
@@ -8717,7 +8603,192 @@
           <w:bCs/>
           <w:color w:val="000000"/>
         </w:rPr>
+        <w:t>##Patients.LastName##</w:t>
+      </w:r>
+    </w:p>
+    <w:p>
+      <w:pPr>
+        <w:spacing w:after="3" w:line="252" w:lineRule="auto"/>
+        <w:ind w:left="6" w:hanging="10"/>
+        <w:contextualSpacing/>
+        <w:rPr>
+          <w:color w:val="000000"/>
+          <w:highlight w:val="yellow"/>
+        </w:rPr>
+      </w:pPr>
+      <w:r>
+        <w:rPr>
+          <w:color w:val="000000"/>
+          <w:highlight w:val="yellow"/>
+        </w:rPr>
+        <w:fldChar w:fldCharType="begin"/>
+      </w:r>
+      <w:r>
+        <w:rPr>
+          <w:color w:val="000000"/>
+          <w:highlight w:val="yellow"/>
+        </w:rPr>
+        <w:instrText xml:space="preserve"> MERGEFIELD M_46 \* MERGEFORMAT </w:instrText>
+      </w:r>
+      <w:r>
+        <w:rPr>
+          <w:color w:val="000000"/>
+          <w:highlight w:val="yellow"/>
+        </w:rPr>
+        <w:fldChar w:fldCharType="separate"/>
+      </w:r>
+      <w:r>
+        <w:rPr>
+          <w:noProof/>
+          <w:color w:val="000000"/>
+        </w:rPr>
+        <w:t>##Patients.Street##</w:t>
+      </w:r>
+      <w:r>
+        <w:rPr>
+          <w:noProof/>
+          <w:color w:val="000000"/>
+          <w:highlight w:val="yellow"/>
+        </w:rPr>
+        <w:t xml:space="preserve"> </w:t>
+      </w:r>
+      <w:r>
+        <w:rPr>
+          <w:color w:val="000000"/>
+          <w:highlight w:val="yellow"/>
+        </w:rPr>
+        <w:fldChar w:fldCharType="end"/>
+      </w:r>
+    </w:p>
+    <w:p>
+      <w:pPr>
+        <w:spacing w:after="3" w:line="252" w:lineRule="auto"/>
+        <w:ind w:left="6" w:hanging="10"/>
+        <w:contextualSpacing/>
+        <w:rPr>
+          <w:color w:val="000000"/>
+          <w:highlight w:val="yellow"/>
+        </w:rPr>
+      </w:pPr>
+      <w:r>
+        <w:rPr>
+          <w:color w:val="000000"/>
+          <w:highlight w:val="yellow"/>
+        </w:rPr>
+        <w:fldChar w:fldCharType="begin"/>
+      </w:r>
+      <w:r>
+        <w:rPr>
+          <w:color w:val="000000"/>
+          <w:highlight w:val="yellow"/>
+        </w:rPr>
+        <w:instrText xml:space="preserve"> MERGEFIELD M_50 \* MERGEFORMAT </w:instrText>
+      </w:r>
+      <w:r>
+        <w:rPr>
+          <w:color w:val="000000"/>
+          <w:highlight w:val="yellow"/>
+        </w:rPr>
+        <w:fldChar w:fldCharType="separate"/>
+      </w:r>
+      <w:r>
+        <w:rPr>
+          <w:noProof/>
+          <w:color w:val="000000"/>
+        </w:rPr>
+        <w:t xml:space="preserve">##Patients.City##,  </w:t>
+      </w:r>
+      <w:r>
+        <w:rPr>
+          <w:noProof/>
+          <w:color w:val="000000"/>
+        </w:rPr>
+        <w:t>##Patients.State##</w:t>
+      </w:r>
+      <w:r>
+        <w:rPr>
+          <w:color w:val="000000"/>
+          <w:highlight w:val="yellow"/>
+        </w:rPr>
+        <w:fldChar w:fldCharType="end"/>
+      </w:r>
+      <w:r>
+        <w:rPr>
+          <w:color w:val="000000"/>
+        </w:rPr>
+        <w:t xml:space="preserve"> </w:t>
+      </w:r>
+      <w:r>
+        <w:rPr>
+          <w:color w:val="000000"/>
+        </w:rPr>
+        <w:t>##Patients.ZipCode##</w:t>
+      </w:r>
+    </w:p>
+    <w:p>
+      <w:pPr>
+        <w:spacing w:after="3" w:line="252" w:lineRule="auto"/>
+        <w:ind w:left="6" w:hanging="10"/>
+        <w:contextualSpacing/>
+        <w:rPr>
+          <w:color w:val="000000"/>
+          <w:highlight w:val="yellow"/>
+        </w:rPr>
+      </w:pPr>
+      <w:r>
+        <w:rPr>
+          <w:color w:val="000000"/>
+          <w:highlight w:val="yellow"/>
+        </w:rPr>
+        <w:fldChar w:fldCharType="begin"/>
+      </w:r>
+      <w:r>
+        <w:rPr>
+          <w:color w:val="000000"/>
+          <w:highlight w:val="yellow"/>
+        </w:rPr>
+        <w:instrText xml:space="preserve"> MERGEFIELD M_50 \* MERGEFORMAT </w:instrText>
+      </w:r>
+      <w:r>
+        <w:rPr>
+          <w:color w:val="000000"/>
+          <w:highlight w:val="yellow"/>
+        </w:rPr>
+        <w:fldChar w:fldCharType="end"/>
+      </w:r>
+    </w:p>
+    <w:p>
+      <w:pPr>
+        <w:spacing w:line="252" w:lineRule="auto"/>
+        <w:ind w:left="11"/>
+        <w:contextualSpacing/>
+        <w:rPr>
+          <w:color w:val="000000"/>
+          <w:highlight w:val="yellow"/>
+        </w:rPr>
+      </w:pPr>
+      <w:r>
+        <w:rPr>
+          <w:color w:val="000000"/>
+          <w:highlight w:val="yellow"/>
+        </w:rPr>
         <w:t xml:space="preserve">  </w:t>
+      </w:r>
+    </w:p>
+    <w:p>
+      <w:pPr>
+        <w:spacing w:after="3" w:line="252" w:lineRule="auto"/>
+        <w:ind w:left="6" w:hanging="10"/>
+        <w:contextualSpacing/>
+        <w:rPr>
+          <w:color w:val="000000"/>
+        </w:rPr>
+      </w:pPr>
+      <w:r>
+        <w:rPr>
+          <w:color w:val="000000"/>
+        </w:rPr>
+        <w:t xml:space="preserve">Dear Mr. /Mrs.: </w:t>
       </w:r>
       <w:r>
         <w:rPr>
@@ -8725,16 +8796,37 @@
           <w:bCs/>
           <w:color w:val="000000"/>
         </w:rPr>
-        <w:t>#</w:t>
-      </w:r>
-      <w:proofErr w:type="gramEnd"/>
+        <w:t>##Patients.FirstName##</w:t>
+      </w:r>
       <w:r>
         <w:rPr>
           <w:b/>
           <w:bCs/>
           <w:color w:val="000000"/>
         </w:rPr>
-        <w:t>#Patients.LastName##</w:t>
+        <w:t xml:space="preserve">  ##Patients.LastName##</w:t>
+      </w:r>
+      <w:r>
+        <w:rPr>
+          <w:color w:val="000000"/>
+        </w:rPr>
+        <w:t xml:space="preserve"> </w:t>
+      </w:r>
+    </w:p>
+    <w:p>
+      <w:pPr>
+        <w:spacing w:line="252" w:lineRule="auto"/>
+        <w:ind w:left="11"/>
+        <w:contextualSpacing/>
+        <w:rPr>
+          <w:color w:val="000000"/>
+        </w:rPr>
+      </w:pPr>
+      <w:r>
+        <w:rPr>
+          <w:color w:val="000000"/>
+        </w:rPr>
+        <w:t xml:space="preserve">  </w:t>
       </w:r>
     </w:p>
     <w:p>
@@ -8744,308 +8836,25 @@
         <w:contextualSpacing/>
         <w:rPr>
           <w:color w:val="000000"/>
-          <w:highlight w:val="yellow"/>
         </w:rPr>
       </w:pPr>
       <w:r>
         <w:rPr>
           <w:color w:val="000000"/>
-          <w:highlight w:val="yellow"/>
-        </w:rPr>
-        <w:fldChar w:fldCharType="begin"/>
+        </w:rPr>
+        <w:t xml:space="preserve">Please be advised that an appointment has been scheduled for you to see Yuri Falkinstein, M.D. on </w:t>
       </w:r>
       <w:r>
         <w:rPr>
           <w:color w:val="000000"/>
-          <w:highlight w:val="yellow"/>
-        </w:rPr>
-        <w:instrText xml:space="preserve"> MERGEFIELD M_46 \* MERGEFORMAT </w:instrText>
+        </w:rPr>
+        <w:t xml:space="preserve">##Appointments.AvailableDate## at  </w:t>
       </w:r>
       <w:r>
         <w:rPr>
           <w:color w:val="000000"/>
-          <w:highlight w:val="yellow"/>
-        </w:rPr>
-        <w:fldChar w:fldCharType="separate"/>
-      </w:r>
-      <w:r>
-        <w:rPr>
-          <w:noProof/>
-          <w:color w:val="000000"/>
-        </w:rPr>
-        <w:t>##Patients.Street##</w:t>
-      </w:r>
-      <w:r>
-        <w:rPr>
-          <w:noProof/>
-          <w:color w:val="000000"/>
-          <w:highlight w:val="yellow"/>
-        </w:rPr>
-        <w:t xml:space="preserve"> </w:t>
-      </w:r>
-      <w:r>
-        <w:rPr>
-          <w:color w:val="000000"/>
-          <w:highlight w:val="yellow"/>
-        </w:rPr>
-        <w:fldChar w:fldCharType="end"/>
-      </w:r>
-    </w:p>
-    <w:p>
-      <w:pPr>
-        <w:spacing w:after="3" w:line="252" w:lineRule="auto"/>
-        <w:ind w:left="6" w:hanging="10"/>
-        <w:contextualSpacing/>
-        <w:rPr>
-          <w:color w:val="000000"/>
-          <w:highlight w:val="yellow"/>
-        </w:rPr>
-      </w:pPr>
-      <w:r>
-        <w:rPr>
-          <w:color w:val="000000"/>
-          <w:highlight w:val="yellow"/>
-        </w:rPr>
-        <w:fldChar w:fldCharType="begin"/>
-      </w:r>
-      <w:r>
-        <w:rPr>
-          <w:color w:val="000000"/>
-          <w:highlight w:val="yellow"/>
-        </w:rPr>
-        <w:instrText xml:space="preserve"> MERGEFIELD M_50 \* MERGEFORMAT </w:instrText>
-      </w:r>
-      <w:r>
-        <w:rPr>
-          <w:color w:val="000000"/>
-          <w:highlight w:val="yellow"/>
-        </w:rPr>
-        <w:fldChar w:fldCharType="separate"/>
-      </w:r>
-      <w:r>
-        <w:rPr>
-          <w:noProof/>
-          <w:color w:val="000000"/>
-        </w:rPr>
-        <w:t xml:space="preserve">##Patients.City##,  </w:t>
-      </w:r>
-      <w:r>
-        <w:rPr>
-          <w:noProof/>
-          <w:color w:val="000000"/>
-        </w:rPr>
-        <w:t>##Patients.State##</w:t>
-      </w:r>
-      <w:r>
-        <w:rPr>
-          <w:color w:val="000000"/>
-          <w:highlight w:val="yellow"/>
-        </w:rPr>
-        <w:fldChar w:fldCharType="end"/>
-      </w:r>
-      <w:r>
-        <w:rPr>
-          <w:color w:val="000000"/>
-        </w:rPr>
-        <w:t xml:space="preserve"> </w:t>
-      </w:r>
-      <w:r>
-        <w:rPr>
-          <w:color w:val="000000"/>
-        </w:rPr>
-        <w:t>##Patients.ZipCode##</w:t>
-      </w:r>
-    </w:p>
-    <w:p>
-      <w:pPr>
-        <w:spacing w:after="3" w:line="252" w:lineRule="auto"/>
-        <w:ind w:left="6" w:hanging="10"/>
-        <w:contextualSpacing/>
-        <w:rPr>
-          <w:color w:val="000000"/>
-          <w:highlight w:val="yellow"/>
-        </w:rPr>
-      </w:pPr>
-      <w:r>
-        <w:rPr>
-          <w:color w:val="000000"/>
-          <w:highlight w:val="yellow"/>
-        </w:rPr>
-        <w:fldChar w:fldCharType="begin"/>
-      </w:r>
-      <w:r>
-        <w:rPr>
-          <w:color w:val="000000"/>
-          <w:highlight w:val="yellow"/>
-        </w:rPr>
-        <w:instrText xml:space="preserve"> MERGEFIELD M_50 \* MERGEFORMAT </w:instrText>
-      </w:r>
-      <w:r>
-        <w:rPr>
-          <w:color w:val="000000"/>
-          <w:highlight w:val="yellow"/>
-        </w:rPr>
-        <w:fldChar w:fldCharType="end"/>
-      </w:r>
-    </w:p>
-    <w:p>
-      <w:pPr>
-        <w:spacing w:line="252" w:lineRule="auto"/>
-        <w:ind w:left="11"/>
-        <w:contextualSpacing/>
-        <w:rPr>
-          <w:color w:val="000000"/>
-          <w:highlight w:val="yellow"/>
-        </w:rPr>
-      </w:pPr>
-      <w:r>
-        <w:rPr>
-          <w:color w:val="000000"/>
-          <w:highlight w:val="yellow"/>
-        </w:rPr>
-        <w:t xml:space="preserve">  </w:t>
-      </w:r>
-    </w:p>
-    <w:p>
-      <w:pPr>
-        <w:spacing w:after="3" w:line="252" w:lineRule="auto"/>
-        <w:ind w:left="6" w:hanging="10"/>
-        <w:contextualSpacing/>
-        <w:rPr>
-          <w:color w:val="000000"/>
-        </w:rPr>
-      </w:pPr>
-      <w:r>
-        <w:rPr>
-          <w:color w:val="000000"/>
-        </w:rPr>
-        <w:t xml:space="preserve">Dear Mr. /Mrs.: </w:t>
-      </w:r>
-      <w:r>
-        <w:rPr>
-          <w:b/>
-          <w:bCs/>
-          <w:color w:val="000000"/>
-        </w:rPr>
-        <w:t>##Patients.FirstName#</w:t>
-      </w:r>
-      <w:proofErr w:type="gramStart"/>
-      <w:r>
-        <w:rPr>
-          <w:b/>
-          <w:bCs/>
-          <w:color w:val="000000"/>
-        </w:rPr>
-        <w:t>#</w:t>
-      </w:r>
-      <w:r>
-        <w:rPr>
-          <w:b/>
-          <w:bCs/>
-          <w:color w:val="000000"/>
-        </w:rPr>
-        <w:t xml:space="preserve">  #</w:t>
-      </w:r>
-      <w:proofErr w:type="gramEnd"/>
-      <w:r>
-        <w:rPr>
-          <w:b/>
-          <w:bCs/>
-          <w:color w:val="000000"/>
-        </w:rPr>
-        <w:t>#Patients.LastName##</w:t>
-      </w:r>
-      <w:r>
-        <w:rPr>
-          <w:color w:val="000000"/>
-        </w:rPr>
-        <w:t xml:space="preserve"> </w:t>
-      </w:r>
-    </w:p>
-    <w:p>
-      <w:pPr>
-        <w:spacing w:line="252" w:lineRule="auto"/>
-        <w:ind w:left="11"/>
-        <w:contextualSpacing/>
-        <w:rPr>
-          <w:color w:val="000000"/>
-        </w:rPr>
-      </w:pPr>
-      <w:r>
-        <w:rPr>
-          <w:color w:val="000000"/>
-        </w:rPr>
-        <w:t xml:space="preserve">  </w:t>
-      </w:r>
-    </w:p>
-    <w:p>
-      <w:pPr>
-        <w:spacing w:after="3" w:line="252" w:lineRule="auto"/>
-        <w:ind w:left="6" w:hanging="10"/>
-        <w:contextualSpacing/>
-        <w:rPr>
-          <w:color w:val="000000"/>
-        </w:rPr>
-      </w:pPr>
-      <w:r>
-        <w:rPr>
-          <w:color w:val="000000"/>
-        </w:rPr>
-        <w:t xml:space="preserve">Please be advised that an appointment has been scheduled for you to see Yuri Falkinstein, M.D. on </w:t>
-      </w:r>
-      <w:r>
-        <w:rPr>
-          <w:color w:val="000000"/>
-        </w:rPr>
-        <w:t>##</w:t>
-      </w:r>
-      <w:proofErr w:type="spellStart"/>
-      <w:r>
-        <w:rPr>
-          <w:color w:val="000000"/>
-        </w:rPr>
-        <w:t>Appointments.AvailableDate</w:t>
-      </w:r>
-      <w:proofErr w:type="spellEnd"/>
-      <w:r>
-        <w:rPr>
-          <w:color w:val="000000"/>
-        </w:rPr>
-        <w:t xml:space="preserve">## </w:t>
-      </w:r>
-      <w:proofErr w:type="gramStart"/>
-      <w:r>
-        <w:rPr>
-          <w:color w:val="000000"/>
-        </w:rPr>
-        <w:t xml:space="preserve">at  </w:t>
-      </w:r>
-      <w:r>
-        <w:rPr>
-          <w:color w:val="000000"/>
-        </w:rPr>
-        <w:t>#</w:t>
-      </w:r>
-      <w:proofErr w:type="gramEnd"/>
-      <w:r>
-        <w:rPr>
-          <w:color w:val="000000"/>
-        </w:rPr>
-        <w:t>#</w:t>
-      </w:r>
-      <w:proofErr w:type="spellStart"/>
-      <w:r>
-        <w:rPr>
-          <w:color w:val="000000"/>
-        </w:rPr>
-        <w:t>Appointments.AppointmenTime</w:t>
-      </w:r>
-      <w:proofErr w:type="spellEnd"/>
-      <w:r>
-        <w:rPr>
-          <w:color w:val="000000"/>
-        </w:rPr>
-        <w:t>##</w:t>
+        </w:rPr>
+        <w:t>##Appointments.AppointmenTime##</w:t>
       </w:r>
       <w:r>
         <w:rPr>
@@ -9285,7 +9094,7 @@
         </w:rPr>
         <w:br/>
       </w:r>
-      <w:bookmarkStart w:id="1" w:name="_Hlk78194904"/>
+      <w:bookmarkStart w:id="0" w:name="_Hlk78194904"/>
       <w:r>
         <w:rPr>
           <w:color w:val="333333"/>
@@ -9363,7 +9172,7 @@
         </w:rPr>
         <w:t xml:space="preserve"> to your scheduled appointment time with proof of identification.</w:t>
       </w:r>
-      <w:bookmarkEnd w:id="1"/>
+      <w:bookmarkEnd w:id="0"/>
       <w:r>
         <w:rPr>
           <w:color w:val="333333"/>
@@ -11908,17 +11717,6 @@
         </w:rPr>
         <w:t>required)</w:t>
       </w:r>
-    </w:p>
-    <w:p>
-      <w:pPr>
-        <w:contextualSpacing/>
-        <w:jc w:val="center"/>
-        <w:rPr>
-          <w:spacing w:val="-2"/>
-          <w:sz w:val="20"/>
-          <w:u w:val="single"/>
-        </w:rPr>
-      </w:pPr>
     </w:p>
     <w:tbl>
       <w:tblPr>
@@ -11943,7 +11741,6 @@
               <w:bottom w:val="single" w:sz="4" w:space="0" w:color="auto"/>
               <w:right w:val="nil"/>
             </w:tcBorders>
-            <w:shd w:val="clear" w:color="auto" w:fill="auto"/>
             <w:hideMark/>
           </w:tcPr>
           <w:p>
@@ -11976,7 +11773,6 @@
               <w:bottom w:val="single" w:sz="4" w:space="0" w:color="auto"/>
               <w:right w:val="nil"/>
             </w:tcBorders>
-            <w:shd w:val="clear" w:color="auto" w:fill="auto"/>
             <w:hideMark/>
           </w:tcPr>
           <w:p>
@@ -12005,6 +11801,9 @@
         </w:tc>
       </w:tr>
       <w:tr>
+        <w:trPr>
+          <w:trHeight w:val="70"/>
+        </w:trPr>
         <w:tc>
           <w:tcPr>
             <w:tcW w:w="7290" w:type="dxa"/>
@@ -12014,7 +11813,6 @@
               <w:bottom w:val="nil"/>
               <w:right w:val="nil"/>
             </w:tcBorders>
-            <w:shd w:val="clear" w:color="auto" w:fill="auto"/>
             <w:hideMark/>
           </w:tcPr>
           <w:p>
@@ -12063,7 +11861,6 @@
               <w:bottom w:val="nil"/>
               <w:right w:val="nil"/>
             </w:tcBorders>
-            <w:shd w:val="clear" w:color="auto" w:fill="auto"/>
             <w:hideMark/>
           </w:tcPr>
           <w:p>
@@ -12130,26 +11927,6 @@
         </w:tc>
       </w:tr>
     </w:tbl>
-    <w:p>
-      <w:pPr>
-        <w:ind w:left="3218" w:right="3163"/>
-        <w:contextualSpacing/>
-        <w:jc w:val="center"/>
-        <w:rPr>
-          <w:sz w:val="18"/>
-          <w:szCs w:val="20"/>
-          <w:highlight w:val="yellow"/>
-        </w:rPr>
-      </w:pPr>
-      <w:r>
-        <w:rPr>
-          <w:sz w:val="18"/>
-          <w:szCs w:val="20"/>
-          <w:highlight w:val="yellow"/>
-        </w:rPr>
-        <w:t xml:space="preserve">                                                 </w:t>
-      </w:r>
-    </w:p>
     <w:tbl>
       <w:tblPr>
         <w:tblpPr w:leftFromText="180" w:rightFromText="180" w:topFromText="44" w:vertAnchor="text" w:horzAnchor="margin" w:tblpY="70"/>
@@ -12171,14 +11948,13 @@
         </w:trPr>
         <w:tc>
           <w:tcPr>
-            <w:tcW w:w="5395" w:type="dxa"/>
+            <w:tcW w:w="5340" w:type="dxa"/>
             <w:tcBorders>
               <w:top w:val="nil"/>
               <w:left w:val="nil"/>
               <w:bottom w:val="single" w:sz="4" w:space="0" w:color="auto"/>
               <w:right w:val="nil"/>
             </w:tcBorders>
-            <w:shd w:val="clear" w:color="auto" w:fill="auto"/>
             <w:hideMark/>
           </w:tcPr>
           <w:p>
@@ -12207,14 +11983,13 @@
         </w:tc>
         <w:tc>
           <w:tcPr>
-            <w:tcW w:w="2209" w:type="dxa"/>
+            <w:tcW w:w="2200" w:type="dxa"/>
             <w:tcBorders>
               <w:top w:val="nil"/>
               <w:left w:val="nil"/>
               <w:bottom w:val="single" w:sz="4" w:space="0" w:color="auto"/>
               <w:right w:val="nil"/>
             </w:tcBorders>
-            <w:shd w:val="clear" w:color="auto" w:fill="auto"/>
             <w:hideMark/>
           </w:tcPr>
           <w:p>
@@ -12242,14 +12017,13 @@
         </w:tc>
         <w:tc>
           <w:tcPr>
-            <w:tcW w:w="1680" w:type="dxa"/>
+            <w:tcW w:w="1750" w:type="dxa"/>
             <w:tcBorders>
               <w:top w:val="nil"/>
               <w:left w:val="nil"/>
               <w:bottom w:val="single" w:sz="4" w:space="0" w:color="auto"/>
               <w:right w:val="nil"/>
             </w:tcBorders>
-            <w:shd w:val="clear" w:color="auto" w:fill="auto"/>
             <w:hideMark/>
           </w:tcPr>
           <w:p>
@@ -12278,14 +12052,13 @@
         </w:tc>
         <w:tc>
           <w:tcPr>
-            <w:tcW w:w="2376" w:type="dxa"/>
+            <w:tcW w:w="2370" w:type="dxa"/>
             <w:tcBorders>
               <w:top w:val="nil"/>
               <w:left w:val="nil"/>
               <w:bottom w:val="single" w:sz="4" w:space="0" w:color="auto"/>
               <w:right w:val="nil"/>
             </w:tcBorders>
-            <w:shd w:val="clear" w:color="auto" w:fill="auto"/>
             <w:hideMark/>
           </w:tcPr>
           <w:p>
@@ -12315,14 +12088,13 @@
       <w:tr>
         <w:tc>
           <w:tcPr>
-            <w:tcW w:w="5395" w:type="dxa"/>
+            <w:tcW w:w="5340" w:type="dxa"/>
             <w:tcBorders>
               <w:top w:val="single" w:sz="4" w:space="0" w:color="auto"/>
               <w:left w:val="nil"/>
               <w:bottom w:val="nil"/>
               <w:right w:val="nil"/>
             </w:tcBorders>
-            <w:shd w:val="clear" w:color="auto" w:fill="auto"/>
             <w:hideMark/>
           </w:tcPr>
           <w:p>
@@ -12344,14 +12116,13 @@
         </w:tc>
         <w:tc>
           <w:tcPr>
-            <w:tcW w:w="2209" w:type="dxa"/>
+            <w:tcW w:w="2200" w:type="dxa"/>
             <w:tcBorders>
               <w:top w:val="single" w:sz="4" w:space="0" w:color="auto"/>
               <w:left w:val="nil"/>
               <w:bottom w:val="nil"/>
               <w:right w:val="nil"/>
             </w:tcBorders>
-            <w:shd w:val="clear" w:color="auto" w:fill="auto"/>
             <w:hideMark/>
           </w:tcPr>
           <w:p>
@@ -12374,14 +12145,13 @@
         </w:tc>
         <w:tc>
           <w:tcPr>
-            <w:tcW w:w="1680" w:type="dxa"/>
+            <w:tcW w:w="1750" w:type="dxa"/>
             <w:tcBorders>
               <w:top w:val="single" w:sz="4" w:space="0" w:color="auto"/>
               <w:left w:val="nil"/>
               <w:bottom w:val="nil"/>
               <w:right w:val="nil"/>
             </w:tcBorders>
-            <w:shd w:val="clear" w:color="auto" w:fill="auto"/>
             <w:hideMark/>
           </w:tcPr>
           <w:p>
@@ -12404,14 +12174,13 @@
         </w:tc>
         <w:tc>
           <w:tcPr>
-            <w:tcW w:w="2376" w:type="dxa"/>
+            <w:tcW w:w="2370" w:type="dxa"/>
             <w:tcBorders>
               <w:top w:val="single" w:sz="4" w:space="0" w:color="auto"/>
               <w:left w:val="nil"/>
               <w:bottom w:val="nil"/>
               <w:right w:val="nil"/>
             </w:tcBorders>
-            <w:shd w:val="clear" w:color="auto" w:fill="auto"/>
             <w:hideMark/>
           </w:tcPr>
           <w:p>
@@ -12434,11 +12203,6 @@
         </w:tc>
       </w:tr>
     </w:tbl>
-    <w:p>
-      <w:pPr>
-        <w:contextualSpacing/>
-      </w:pPr>
-    </w:p>
     <w:tbl>
       <w:tblPr>
         <w:tblW w:w="0" w:type="auto"/>
@@ -12454,10 +12218,12 @@
         <w:gridCol w:w="3672"/>
       </w:tblGrid>
       <w:tr>
+        <w:trPr>
+          <w:trHeight w:val="80"/>
+        </w:trPr>
         <w:tc>
           <w:tcPr>
-            <w:tcW w:w="3420" w:type="dxa"/>
-            <w:shd w:val="clear" w:color="auto" w:fill="auto"/>
+            <w:tcW w:w="3404" w:type="dxa"/>
           </w:tcPr>
           <w:p>
             <w:pPr>
@@ -12484,8 +12250,7 @@
         </w:tc>
         <w:tc>
           <w:tcPr>
-            <w:tcW w:w="3328" w:type="dxa"/>
-            <w:shd w:val="clear" w:color="auto" w:fill="auto"/>
+            <w:tcW w:w="3319" w:type="dxa"/>
           </w:tcPr>
           <w:p>
             <w:pPr>
@@ -12551,8 +12316,7 @@
         </w:tc>
         <w:tc>
           <w:tcPr>
-            <w:tcW w:w="3692" w:type="dxa"/>
-            <w:shd w:val="clear" w:color="auto" w:fill="auto"/>
+            <w:tcW w:w="3672" w:type="dxa"/>
           </w:tcPr>
           <w:p>
             <w:pPr>
@@ -12581,8 +12345,7 @@
       <w:tr>
         <w:tc>
           <w:tcPr>
-            <w:tcW w:w="3420" w:type="dxa"/>
-            <w:shd w:val="clear" w:color="auto" w:fill="auto"/>
+            <w:tcW w:w="3404" w:type="dxa"/>
           </w:tcPr>
           <w:p>
             <w:pPr>
@@ -12605,8 +12368,7 @@
         </w:tc>
         <w:tc>
           <w:tcPr>
-            <w:tcW w:w="3328" w:type="dxa"/>
-            <w:shd w:val="clear" w:color="auto" w:fill="auto"/>
+            <w:tcW w:w="3319" w:type="dxa"/>
           </w:tcPr>
           <w:p>
             <w:pPr>
@@ -12629,8 +12391,7 @@
         </w:tc>
         <w:tc>
           <w:tcPr>
-            <w:tcW w:w="3692" w:type="dxa"/>
-            <w:shd w:val="clear" w:color="auto" w:fill="auto"/>
+            <w:tcW w:w="3672" w:type="dxa"/>
           </w:tcPr>
           <w:p>
             <w:pPr>
@@ -12700,7 +12461,6 @@
               <w:bottom w:val="single" w:sz="4" w:space="0" w:color="auto"/>
               <w:right w:val="nil"/>
             </w:tcBorders>
-            <w:shd w:val="clear" w:color="auto" w:fill="auto"/>
           </w:tcPr>
           <w:p>
             <w:pPr>
@@ -12736,7 +12496,6 @@
               <w:bottom w:val="nil"/>
               <w:right w:val="nil"/>
             </w:tcBorders>
-            <w:shd w:val="clear" w:color="auto" w:fill="auto"/>
           </w:tcPr>
           <w:p>
             <w:pPr>
@@ -12768,7 +12527,6 @@
               <w:bottom w:val="single" w:sz="4" w:space="0" w:color="auto"/>
               <w:right w:val="nil"/>
             </w:tcBorders>
-            <w:shd w:val="clear" w:color="auto" w:fill="auto"/>
           </w:tcPr>
           <w:p>
             <w:pPr>
@@ -12839,7 +12597,6 @@
               <w:bottom w:val="single" w:sz="4" w:space="0" w:color="auto"/>
               <w:right w:val="nil"/>
             </w:tcBorders>
-            <w:shd w:val="clear" w:color="auto" w:fill="auto"/>
           </w:tcPr>
           <w:p>
             <w:pPr>
@@ -12893,7 +12650,6 @@
               <w:bottom w:val="single" w:sz="4" w:space="0" w:color="auto"/>
               <w:right w:val="nil"/>
             </w:tcBorders>
-            <w:shd w:val="clear" w:color="auto" w:fill="auto"/>
           </w:tcPr>
           <w:p>
             <w:pPr>
@@ -12947,7 +12703,6 @@
               <w:bottom w:val="single" w:sz="4" w:space="0" w:color="auto"/>
               <w:right w:val="nil"/>
             </w:tcBorders>
-            <w:shd w:val="clear" w:color="auto" w:fill="auto"/>
           </w:tcPr>
           <w:p>
             <w:pPr>
@@ -12995,7 +12750,7 @@
       </w:tr>
       <w:tr>
         <w:trPr>
-          <w:trHeight w:val="413"/>
+          <w:trHeight w:val="227"/>
         </w:trPr>
         <w:tc>
           <w:tcPr>
@@ -13006,7 +12761,6 @@
               <w:bottom w:val="nil"/>
               <w:right w:val="nil"/>
             </w:tcBorders>
-            <w:shd w:val="clear" w:color="auto" w:fill="auto"/>
           </w:tcPr>
           <w:p>
             <w:pPr>
@@ -13036,7 +12790,6 @@
               <w:bottom w:val="nil"/>
               <w:right w:val="nil"/>
             </w:tcBorders>
-            <w:shd w:val="clear" w:color="auto" w:fill="auto"/>
           </w:tcPr>
           <w:p>
             <w:pPr>
@@ -13066,7 +12819,6 @@
               <w:bottom w:val="nil"/>
               <w:right w:val="nil"/>
             </w:tcBorders>
-            <w:shd w:val="clear" w:color="auto" w:fill="auto"/>
           </w:tcPr>
           <w:p>
             <w:pPr>
@@ -13096,7 +12848,6 @@
               <w:bottom w:val="nil"/>
               <w:right w:val="nil"/>
             </w:tcBorders>
-            <w:shd w:val="clear" w:color="auto" w:fill="auto"/>
           </w:tcPr>
           <w:p>
             <w:pPr>
@@ -13169,15 +12920,51 @@
         <w:tblLook w:val="04A0" w:firstRow="1" w:lastRow="0" w:firstColumn="1" w:lastColumn="0" w:noHBand="0" w:noVBand="1"/>
       </w:tblPr>
       <w:tblGrid>
-        <w:gridCol w:w="2675"/>
-        <w:gridCol w:w="2532"/>
-        <w:gridCol w:w="2618"/>
-        <w:gridCol w:w="3375"/>
+        <w:gridCol w:w="2832"/>
+        <w:gridCol w:w="2679"/>
+        <w:gridCol w:w="1195"/>
+        <w:gridCol w:w="393"/>
+        <w:gridCol w:w="1259"/>
+        <w:gridCol w:w="467"/>
+        <w:gridCol w:w="2375"/>
       </w:tblGrid>
       <w:tr>
+        <w:trPr>
+          <w:trHeight w:val="390"/>
+        </w:trPr>
         <w:tc>
           <w:tcPr>
-            <w:tcW w:w="8497" w:type="dxa"/>
+            <w:tcW w:w="7100" w:type="dxa"/>
+            <w:gridSpan w:val="4"/>
+            <w:tcBorders>
+              <w:top w:val="nil"/>
+              <w:left w:val="nil"/>
+              <w:bottom w:val="single" w:sz="4" w:space="0" w:color="auto"/>
+              <w:right w:val="nil"/>
+            </w:tcBorders>
+          </w:tcPr>
+          <w:p>
+            <w:pPr>
+              <w:contextualSpacing/>
+              <w:rPr>
+                <w:rFonts w:eastAsia="Calibri"/>
+                <w:sz w:val="20"/>
+                <w:szCs w:val="20"/>
+                <w:highlight w:val="yellow"/>
+              </w:rPr>
+            </w:pPr>
+            <w:r>
+              <w:rPr>
+                <w:rFonts w:ascii="Calibri" w:hAnsi="Calibri" w:cs="Calibri"/>
+                <w:lang w:val="en"/>
+              </w:rPr>
+              <w:t>##InjuryDetails.ClaimExaminerName##</w:t>
+            </w:r>
+          </w:p>
+        </w:tc>
+        <w:tc>
+          <w:tcPr>
+            <w:tcW w:w="4100" w:type="dxa"/>
             <w:gridSpan w:val="3"/>
             <w:tcBorders>
               <w:top w:val="nil"/>
@@ -13185,37 +12972,6 @@
               <w:bottom w:val="single" w:sz="4" w:space="0" w:color="auto"/>
               <w:right w:val="nil"/>
             </w:tcBorders>
-            <w:shd w:val="clear" w:color="auto" w:fill="auto"/>
-          </w:tcPr>
-          <w:p>
-            <w:pPr>
-              <w:contextualSpacing/>
-              <w:rPr>
-                <w:rFonts w:eastAsia="Calibri"/>
-                <w:sz w:val="20"/>
-                <w:szCs w:val="20"/>
-                <w:highlight w:val="yellow"/>
-              </w:rPr>
-            </w:pPr>
-            <w:r>
-              <w:rPr>
-                <w:rFonts w:ascii="Calibri" w:hAnsi="Calibri" w:cs="Calibri"/>
-                <w:lang w:val="en"/>
-              </w:rPr>
-              <w:t>##InjuryDetails.ClaimExaminerName##</w:t>
-            </w:r>
-          </w:p>
-        </w:tc>
-        <w:tc>
-          <w:tcPr>
-            <w:tcW w:w="2833" w:type="dxa"/>
-            <w:tcBorders>
-              <w:top w:val="nil"/>
-              <w:left w:val="nil"/>
-              <w:bottom w:val="single" w:sz="4" w:space="0" w:color="auto"/>
-              <w:right w:val="nil"/>
-            </w:tcBorders>
-            <w:shd w:val="clear" w:color="auto" w:fill="auto"/>
           </w:tcPr>
           <w:p>
             <w:pPr>
@@ -13240,19 +12996,18 @@
       </w:tr>
       <w:tr>
         <w:trPr>
-          <w:trHeight w:val="440"/>
+          <w:trHeight w:val="218"/>
         </w:trPr>
         <w:tc>
           <w:tcPr>
-            <w:tcW w:w="8497" w:type="dxa"/>
-            <w:gridSpan w:val="3"/>
+            <w:tcW w:w="8351" w:type="dxa"/>
+            <w:gridSpan w:val="6"/>
             <w:tcBorders>
               <w:top w:val="single" w:sz="4" w:space="0" w:color="auto"/>
               <w:left w:val="nil"/>
               <w:bottom w:val="nil"/>
               <w:right w:val="nil"/>
             </w:tcBorders>
-            <w:shd w:val="clear" w:color="auto" w:fill="auto"/>
           </w:tcPr>
           <w:p>
             <w:pPr>
@@ -13276,14 +13031,13 @@
         </w:tc>
         <w:tc>
           <w:tcPr>
-            <w:tcW w:w="2833" w:type="dxa"/>
+            <w:tcW w:w="2849" w:type="dxa"/>
             <w:tcBorders>
               <w:top w:val="single" w:sz="4" w:space="0" w:color="auto"/>
               <w:left w:val="nil"/>
               <w:bottom w:val="nil"/>
               <w:right w:val="nil"/>
             </w:tcBorders>
-            <w:shd w:val="clear" w:color="auto" w:fill="auto"/>
           </w:tcPr>
           <w:p>
             <w:pPr>
@@ -13309,7 +13063,7 @@
       <w:tr>
         <w:tc>
           <w:tcPr>
-            <w:tcW w:w="8497" w:type="dxa"/>
+            <w:tcW w:w="6884" w:type="dxa"/>
             <w:gridSpan w:val="3"/>
             <w:tcBorders>
               <w:top w:val="nil"/>
@@ -13317,7 +13071,6 @@
               <w:bottom w:val="single" w:sz="4" w:space="0" w:color="auto"/>
               <w:right w:val="nil"/>
             </w:tcBorders>
-            <w:shd w:val="clear" w:color="auto" w:fill="auto"/>
           </w:tcPr>
           <w:p>
             <w:pPr>
@@ -13341,14 +13094,14 @@
         </w:tc>
         <w:tc>
           <w:tcPr>
-            <w:tcW w:w="2833" w:type="dxa"/>
+            <w:tcW w:w="4316" w:type="dxa"/>
+            <w:gridSpan w:val="4"/>
             <w:tcBorders>
               <w:top w:val="nil"/>
               <w:left w:val="nil"/>
               <w:bottom w:val="single" w:sz="4" w:space="0" w:color="auto"/>
               <w:right w:val="nil"/>
             </w:tcBorders>
-            <w:shd w:val="clear" w:color="auto" w:fill="auto"/>
           </w:tcPr>
           <w:p>
             <w:pPr>
@@ -13373,19 +13126,18 @@
       </w:tr>
       <w:tr>
         <w:trPr>
-          <w:trHeight w:val="404"/>
+          <w:trHeight w:val="227"/>
         </w:trPr>
         <w:tc>
           <w:tcPr>
-            <w:tcW w:w="8497" w:type="dxa"/>
-            <w:gridSpan w:val="3"/>
+            <w:tcW w:w="8351" w:type="dxa"/>
+            <w:gridSpan w:val="6"/>
             <w:tcBorders>
               <w:top w:val="single" w:sz="4" w:space="0" w:color="auto"/>
               <w:left w:val="nil"/>
               <w:bottom w:val="nil"/>
               <w:right w:val="nil"/>
             </w:tcBorders>
-            <w:shd w:val="clear" w:color="auto" w:fill="auto"/>
           </w:tcPr>
           <w:p>
             <w:pPr>
@@ -13409,14 +13161,13 @@
         </w:tc>
         <w:tc>
           <w:tcPr>
-            <w:tcW w:w="2833" w:type="dxa"/>
+            <w:tcW w:w="2849" w:type="dxa"/>
             <w:tcBorders>
               <w:top w:val="single" w:sz="4" w:space="0" w:color="auto"/>
               <w:left w:val="nil"/>
               <w:bottom w:val="nil"/>
               <w:right w:val="nil"/>
             </w:tcBorders>
-            <w:shd w:val="clear" w:color="auto" w:fill="auto"/>
           </w:tcPr>
           <w:p>
             <w:pPr>
@@ -13441,14 +13192,13 @@
       <w:tr>
         <w:tc>
           <w:tcPr>
-            <w:tcW w:w="4495" w:type="dxa"/>
+            <w:tcW w:w="2829" w:type="dxa"/>
             <w:tcBorders>
               <w:top w:val="nil"/>
               <w:left w:val="nil"/>
               <w:bottom w:val="single" w:sz="4" w:space="0" w:color="auto"/>
               <w:right w:val="nil"/>
             </w:tcBorders>
-            <w:shd w:val="clear" w:color="auto" w:fill="auto"/>
           </w:tcPr>
           <w:p>
             <w:pPr>
@@ -13472,14 +13222,13 @@
         </w:tc>
         <w:tc>
           <w:tcPr>
-            <w:tcW w:w="2790" w:type="dxa"/>
+            <w:tcW w:w="2677" w:type="dxa"/>
             <w:tcBorders>
               <w:top w:val="nil"/>
               <w:left w:val="nil"/>
               <w:bottom w:val="single" w:sz="4" w:space="0" w:color="auto"/>
               <w:right w:val="nil"/>
             </w:tcBorders>
-            <w:shd w:val="clear" w:color="auto" w:fill="auto"/>
           </w:tcPr>
           <w:p>
             <w:pPr>
@@ -13503,14 +13252,14 @@
         </w:tc>
         <w:tc>
           <w:tcPr>
-            <w:tcW w:w="1212" w:type="dxa"/>
+            <w:tcW w:w="2324" w:type="dxa"/>
+            <w:gridSpan w:val="3"/>
             <w:tcBorders>
               <w:top w:val="nil"/>
               <w:left w:val="nil"/>
               <w:bottom w:val="single" w:sz="4" w:space="0" w:color="auto"/>
               <w:right w:val="nil"/>
             </w:tcBorders>
-            <w:shd w:val="clear" w:color="auto" w:fill="auto"/>
           </w:tcPr>
           <w:p>
             <w:pPr>
@@ -13534,14 +13283,14 @@
         </w:tc>
         <w:tc>
           <w:tcPr>
-            <w:tcW w:w="2833" w:type="dxa"/>
+            <w:tcW w:w="3370" w:type="dxa"/>
+            <w:gridSpan w:val="2"/>
             <w:tcBorders>
               <w:top w:val="nil"/>
               <w:left w:val="nil"/>
               <w:bottom w:val="single" w:sz="4" w:space="0" w:color="auto"/>
               <w:right w:val="nil"/>
             </w:tcBorders>
-            <w:shd w:val="clear" w:color="auto" w:fill="auto"/>
           </w:tcPr>
           <w:p>
             <w:pPr>
@@ -13565,18 +13314,17 @@
       </w:tr>
       <w:tr>
         <w:trPr>
-          <w:trHeight w:val="440"/>
+          <w:trHeight w:val="497"/>
         </w:trPr>
         <w:tc>
           <w:tcPr>
-            <w:tcW w:w="4495" w:type="dxa"/>
+            <w:tcW w:w="2829" w:type="dxa"/>
             <w:tcBorders>
               <w:top w:val="single" w:sz="4" w:space="0" w:color="auto"/>
               <w:left w:val="nil"/>
               <w:bottom w:val="nil"/>
               <w:right w:val="nil"/>
             </w:tcBorders>
-            <w:shd w:val="clear" w:color="auto" w:fill="auto"/>
           </w:tcPr>
           <w:p>
             <w:pPr>
@@ -13599,14 +13347,13 @@
         </w:tc>
         <w:tc>
           <w:tcPr>
-            <w:tcW w:w="2790" w:type="dxa"/>
+            <w:tcW w:w="2677" w:type="dxa"/>
             <w:tcBorders>
               <w:top w:val="single" w:sz="4" w:space="0" w:color="auto"/>
               <w:left w:val="nil"/>
               <w:bottom w:val="nil"/>
               <w:right w:val="nil"/>
             </w:tcBorders>
-            <w:shd w:val="clear" w:color="auto" w:fill="auto"/>
           </w:tcPr>
           <w:p>
             <w:pPr>
@@ -13629,14 +13376,14 @@
         </w:tc>
         <w:tc>
           <w:tcPr>
-            <w:tcW w:w="1212" w:type="dxa"/>
+            <w:tcW w:w="2845" w:type="dxa"/>
+            <w:gridSpan w:val="4"/>
             <w:tcBorders>
               <w:top w:val="single" w:sz="4" w:space="0" w:color="auto"/>
               <w:left w:val="nil"/>
               <w:bottom w:val="nil"/>
               <w:right w:val="nil"/>
             </w:tcBorders>
-            <w:shd w:val="clear" w:color="auto" w:fill="auto"/>
           </w:tcPr>
           <w:p>
             <w:pPr>
@@ -13659,14 +13406,13 @@
         </w:tc>
         <w:tc>
           <w:tcPr>
-            <w:tcW w:w="2833" w:type="dxa"/>
+            <w:tcW w:w="2849" w:type="dxa"/>
             <w:tcBorders>
               <w:top w:val="single" w:sz="4" w:space="0" w:color="auto"/>
               <w:left w:val="nil"/>
               <w:bottom w:val="nil"/>
               <w:right w:val="nil"/>
             </w:tcBorders>
-            <w:shd w:val="clear" w:color="auto" w:fill="auto"/>
           </w:tcPr>
           <w:p>
             <w:pPr>
@@ -13754,15 +13500,7 @@
           <w:sz w:val="20"/>
           <w:szCs w:val="20"/>
         </w:rPr>
-        <w:t xml:space="preserve">                      Date of Appointment:</w:t>
-      </w:r>
-      <w:r>
-        <w:rPr>
-          <w:b/>
-          <w:sz w:val="20"/>
-          <w:szCs w:val="20"/>
-        </w:rPr>
-        <w:t xml:space="preserve"> </w:t>
+        <w:t xml:space="preserve">               Date of Appointment:</w:t>
       </w:r>
       <w:r>
         <w:rPr>
@@ -13848,7 +13586,6 @@
         <w:tc>
           <w:tcPr>
             <w:tcW w:w="4945" w:type="dxa"/>
-            <w:shd w:val="clear" w:color="auto" w:fill="auto"/>
           </w:tcPr>
           <w:p>
             <w:pPr>
@@ -13877,7 +13614,6 @@
         <w:tc>
           <w:tcPr>
             <w:tcW w:w="2520" w:type="dxa"/>
-            <w:shd w:val="clear" w:color="auto" w:fill="auto"/>
           </w:tcPr>
           <w:p>
             <w:pPr>
@@ -13906,7 +13642,6 @@
         <w:tc>
           <w:tcPr>
             <w:tcW w:w="1022" w:type="dxa"/>
-            <w:shd w:val="clear" w:color="auto" w:fill="auto"/>
           </w:tcPr>
           <w:p>
             <w:pPr>
@@ -13928,7 +13663,6 @@
         <w:tc>
           <w:tcPr>
             <w:tcW w:w="2843" w:type="dxa"/>
-            <w:shd w:val="clear" w:color="auto" w:fill="auto"/>
           </w:tcPr>
           <w:p>
             <w:pPr>
@@ -13962,7 +13696,6 @@
         <w:tc>
           <w:tcPr>
             <w:tcW w:w="4945" w:type="dxa"/>
-            <w:shd w:val="clear" w:color="auto" w:fill="auto"/>
           </w:tcPr>
           <w:p>
             <w:pPr>
@@ -13986,7 +13719,6 @@
         <w:tc>
           <w:tcPr>
             <w:tcW w:w="2520" w:type="dxa"/>
-            <w:shd w:val="clear" w:color="auto" w:fill="auto"/>
           </w:tcPr>
           <w:p>
             <w:pPr>
@@ -14010,7 +13742,6 @@
         <w:tc>
           <w:tcPr>
             <w:tcW w:w="1022" w:type="dxa"/>
-            <w:shd w:val="clear" w:color="auto" w:fill="auto"/>
           </w:tcPr>
           <w:p>
             <w:pPr>
@@ -14034,7 +13765,6 @@
         <w:tc>
           <w:tcPr>
             <w:tcW w:w="2843" w:type="dxa"/>
-            <w:shd w:val="clear" w:color="auto" w:fill="auto"/>
           </w:tcPr>
           <w:p>
             <w:pPr>
@@ -14224,15 +13954,10 @@
     </w:p>
     <w:p>
       <w:pPr>
-        <w:contextualSpacing/>
-        <w:rPr>
-          <w:sz w:val="20"/>
-        </w:rPr>
-      </w:pPr>
-    </w:p>
-    <w:p>
-      <w:pPr>
         <w:pStyle w:val="BodyText"/>
+        <w:rPr>
+          <w:noProof/>
+        </w:rPr>
       </w:pPr>
       <w:r>
         <w:rPr>
@@ -14338,10 +14063,7 @@
     </w:p>
     <w:p>
       <w:pPr>
-        <w:contextualSpacing/>
-        <w:rPr>
-          <w:sz w:val="20"/>
-        </w:rPr>
+        <w:pStyle w:val="BodyText"/>
       </w:pPr>
     </w:p>
     <w:p>
@@ -14355,9 +14077,6 @@
         </w:rPr>
       </w:pPr>
       <w:r>
-        <w:t xml:space="preserve"> </w:t>
-      </w:r>
-      <w:r>
         <w:rPr>
           <w:i/>
           <w:iCs/>
@@ -14372,46 +14091,9 @@
           <w:sz w:val="18"/>
           <w:szCs w:val="20"/>
         </w:rPr>
-        <w:t xml:space="preserve">: The Administrative Director's regulation 10160 requires you to forward a completed, DWC-AD form 101(DEU) (Request for Summary Rating Determination of Qualified Medical Evaluator's Report) (see, 8 Cal. Code Regs. §§ 10160 and 10161) together with all medical </w:t>
-      </w:r>
-      <w:r>
-        <w:rPr>
-          <w:i/>
-          <w:sz w:val="18"/>
-          <w:szCs w:val="20"/>
-        </w:rPr>
-        <w:lastRenderedPageBreak/>
-        <w:t>reports and medical records prior to the scheduled examination with the QME. You must also provide the employee with a DWC-AD form 100 (DEU) (Employee's Disability Questionnaire</w:t>
-      </w:r>
-      <w:proofErr w:type="gramStart"/>
-      <w:r>
-        <w:rPr>
-          <w:i/>
-          <w:sz w:val="18"/>
-          <w:szCs w:val="20"/>
-        </w:rPr>
-        <w:t>)(</w:t>
-      </w:r>
-      <w:proofErr w:type="gramEnd"/>
-      <w:r>
-        <w:rPr>
-          <w:i/>
-          <w:sz w:val="18"/>
-          <w:szCs w:val="20"/>
-        </w:rPr>
-        <w:t>See, 8 Cal. Code Regs. §§ 10160 and 10161) prior to the examination.</w:t>
+        <w:t>: The Administrative Director's regulation 10160 requires you to forward a completed, DWC-AD form 101(DEU) (Request for Summary Rating Determination of Qualified Medical Evaluator's Report) (see, 8 Cal. Code Regs. §§ 10160 and 10161) together with all medical reports and medical records prior to the scheduled examination with the QME. You must also provide the employee with a DWC-AD form 100 (DEU) (Employee's Disability Questionnaire)(See, 8 Cal. Code Regs. §§ 10160 and 10161) prior to the examination.</w:t>
       </w:r>
     </w:p>
-    <w:p>
-      <w:pPr>
-        <w:pStyle w:val="BodyText"/>
-        <w:kinsoku w:val="0"/>
-        <w:overflowPunct w:val="0"/>
-        <w:ind w:left="0" w:firstLine="0"/>
-        <w:contextualSpacing/>
-      </w:pPr>
-    </w:p>
-    <w:p/>
     <w:sectPr>
       <w:pgSz w:w="12240" w:h="15840"/>
       <w:pgMar w:top="780" w:right="520" w:bottom="450" w:left="520" w:header="0" w:footer="0" w:gutter="0"/>
@@ -14426,7 +14108,7 @@
 </file>
 
 <file path=word/endnotes.xml><?xml version="1.0" encoding="utf-8"?>
-<w:endnotes xmlns:wpc="http://schemas.microsoft.com/office/word/2010/wordprocessingCanvas" xmlns:cx="http://schemas.microsoft.com/office/drawing/2014/chartex" xmlns:cx1="http://schemas.microsoft.com/office/drawing/2015/9/8/chartex" xmlns:mc="http://schemas.openxmlformats.org/markup-compatibility/2006" xmlns:o="urn:schemas-microsoft-com:office:office" xmlns:r="http://schemas.openxmlformats.org/officeDocument/2006/relationships" xmlns:m="http://schemas.openxmlformats.org/officeDocument/2006/math" xmlns:v="urn:schemas-microsoft-com:vml" xmlns:wp14="http://schemas.microsoft.com/office/word/2010/wordprocessingDrawing" xmlns:wp="http://schemas.openxmlformats.org/drawingml/2006/wordprocessingDrawing" xmlns:w10="urn:schemas-microsoft-com:office:word" xmlns:w="http://schemas.openxmlformats.org/wordprocessingml/2006/main" xmlns:w14="http://schemas.microsoft.com/office/word/2010/wordml" xmlns:w15="http://schemas.microsoft.com/office/word/2012/wordml" xmlns:w16se="http://schemas.microsoft.com/office/word/2015/wordml/symex" xmlns:wpg="http://schemas.microsoft.com/office/word/2010/wordprocessingGroup" xmlns:wpi="http://schemas.microsoft.com/office/word/2010/wordprocessingInk" xmlns:wne="http://schemas.microsoft.com/office/word/2006/wordml" xmlns:wps="http://schemas.microsoft.com/office/word/2010/wordprocessingShape" mc:Ignorable="w14 w15 w16se wp14">
+<w:endnotes xmlns:wpc="http://schemas.microsoft.com/office/word/2010/wordprocessingCanvas" xmlns:cx="http://schemas.microsoft.com/office/drawing/2014/chartex" xmlns:cx1="http://schemas.microsoft.com/office/drawing/2015/9/8/chartex" xmlns:cx2="http://schemas.microsoft.com/office/drawing/2015/10/21/chartex" xmlns:cx3="http://schemas.microsoft.com/office/drawing/2016/5/9/chartex" xmlns:cx4="http://schemas.microsoft.com/office/drawing/2016/5/10/chartex" xmlns:cx5="http://schemas.microsoft.com/office/drawing/2016/5/11/chartex" xmlns:cx6="http://schemas.microsoft.com/office/drawing/2016/5/12/chartex" xmlns:cx7="http://schemas.microsoft.com/office/drawing/2016/5/13/chartex" xmlns:cx8="http://schemas.microsoft.com/office/drawing/2016/5/14/chartex" xmlns:mc="http://schemas.openxmlformats.org/markup-compatibility/2006" xmlns:aink="http://schemas.microsoft.com/office/drawing/2016/ink" xmlns:am3d="http://schemas.microsoft.com/office/drawing/2017/model3d" xmlns:o="urn:schemas-microsoft-com:office:office" xmlns:oel="http://schemas.microsoft.com/office/2019/extlst" xmlns:r="http://schemas.openxmlformats.org/officeDocument/2006/relationships" xmlns:m="http://schemas.openxmlformats.org/officeDocument/2006/math" xmlns:v="urn:schemas-microsoft-com:vml" xmlns:wp14="http://schemas.microsoft.com/office/word/2010/wordprocessingDrawing" xmlns:wp="http://schemas.openxmlformats.org/drawingml/2006/wordprocessingDrawing" xmlns:w10="urn:schemas-microsoft-com:office:word" xmlns:w="http://schemas.openxmlformats.org/wordprocessingml/2006/main" xmlns:w14="http://schemas.microsoft.com/office/word/2010/wordml" xmlns:w15="http://schemas.microsoft.com/office/word/2012/wordml" xmlns:w16cex="http://schemas.microsoft.com/office/word/2018/wordml/cex" xmlns:w16cid="http://schemas.microsoft.com/office/word/2016/wordml/cid" xmlns:w16="http://schemas.microsoft.com/office/word/2018/wordml" xmlns:w16du="http://schemas.microsoft.com/office/word/2023/wordml/word16du" xmlns:w16sdtdh="http://schemas.microsoft.com/office/word/2020/wordml/sdtdatahash" xmlns:w16sdtfl="http://schemas.microsoft.com/office/word/2024/wordml/sdtformatlock" xmlns:w16se="http://schemas.microsoft.com/office/word/2015/wordml/symex" xmlns:wpg="http://schemas.microsoft.com/office/word/2010/wordprocessingGroup" xmlns:wpi="http://schemas.microsoft.com/office/word/2010/wordprocessingInk" xmlns:wne="http://schemas.microsoft.com/office/word/2006/wordml" xmlns:wps="http://schemas.microsoft.com/office/word/2010/wordprocessingShape" mc:Ignorable="w14 w15 w16se w16cid w16 w16cex w16sdtdh w16sdtfl w16du wp14">
   <w:endnote w:type="separator" w:id="-1">
     <w:p>
       <w:pPr>
@@ -14451,7 +14133,7 @@
 </file>
 
 <file path=word/footer1.xml><?xml version="1.0" encoding="utf-8"?>
-<w:ftr xmlns:wpc="http://schemas.microsoft.com/office/word/2010/wordprocessingCanvas" xmlns:cx="http://schemas.microsoft.com/office/drawing/2014/chartex" xmlns:cx1="http://schemas.microsoft.com/office/drawing/2015/9/8/chartex" xmlns:mc="http://schemas.openxmlformats.org/markup-compatibility/2006" xmlns:o="urn:schemas-microsoft-com:office:office" xmlns:r="http://schemas.openxmlformats.org/officeDocument/2006/relationships" xmlns:m="http://schemas.openxmlformats.org/officeDocument/2006/math" xmlns:v="urn:schemas-microsoft-com:vml" xmlns:wp14="http://schemas.microsoft.com/office/word/2010/wordprocessingDrawing" xmlns:wp="http://schemas.openxmlformats.org/drawingml/2006/wordprocessingDrawing" xmlns:w10="urn:schemas-microsoft-com:office:word" xmlns:w="http://schemas.openxmlformats.org/wordprocessingml/2006/main" xmlns:w14="http://schemas.microsoft.com/office/word/2010/wordml" xmlns:w15="http://schemas.microsoft.com/office/word/2012/wordml" xmlns:w16se="http://schemas.microsoft.com/office/word/2015/wordml/symex" xmlns:wpg="http://schemas.microsoft.com/office/word/2010/wordprocessingGroup" xmlns:wpi="http://schemas.microsoft.com/office/word/2010/wordprocessingInk" xmlns:wne="http://schemas.microsoft.com/office/word/2006/wordml" xmlns:wps="http://schemas.microsoft.com/office/word/2010/wordprocessingShape" mc:Ignorable="w14 w15 w16se wp14">
+<w:ftr xmlns:wpc="http://schemas.microsoft.com/office/word/2010/wordprocessingCanvas" xmlns:cx="http://schemas.microsoft.com/office/drawing/2014/chartex" xmlns:cx1="http://schemas.microsoft.com/office/drawing/2015/9/8/chartex" xmlns:cx2="http://schemas.microsoft.com/office/drawing/2015/10/21/chartex" xmlns:cx3="http://schemas.microsoft.com/office/drawing/2016/5/9/chartex" xmlns:cx4="http://schemas.microsoft.com/office/drawing/2016/5/10/chartex" xmlns:cx5="http://schemas.microsoft.com/office/drawing/2016/5/11/chartex" xmlns:cx6="http://schemas.microsoft.com/office/drawing/2016/5/12/chartex" xmlns:cx7="http://schemas.microsoft.com/office/drawing/2016/5/13/chartex" xmlns:cx8="http://schemas.microsoft.com/office/drawing/2016/5/14/chartex" xmlns:mc="http://schemas.openxmlformats.org/markup-compatibility/2006" xmlns:aink="http://schemas.microsoft.com/office/drawing/2016/ink" xmlns:am3d="http://schemas.microsoft.com/office/drawing/2017/model3d" xmlns:o="urn:schemas-microsoft-com:office:office" xmlns:oel="http://schemas.microsoft.com/office/2019/extlst" xmlns:r="http://schemas.openxmlformats.org/officeDocument/2006/relationships" xmlns:m="http://schemas.openxmlformats.org/officeDocument/2006/math" xmlns:v="urn:schemas-microsoft-com:vml" xmlns:wp14="http://schemas.microsoft.com/office/word/2010/wordprocessingDrawing" xmlns:wp="http://schemas.openxmlformats.org/drawingml/2006/wordprocessingDrawing" xmlns:w10="urn:schemas-microsoft-com:office:word" xmlns:w="http://schemas.openxmlformats.org/wordprocessingml/2006/main" xmlns:w14="http://schemas.microsoft.com/office/word/2010/wordml" xmlns:w15="http://schemas.microsoft.com/office/word/2012/wordml" xmlns:w16cex="http://schemas.microsoft.com/office/word/2018/wordml/cex" xmlns:w16cid="http://schemas.microsoft.com/office/word/2016/wordml/cid" xmlns:w16="http://schemas.microsoft.com/office/word/2018/wordml" xmlns:w16du="http://schemas.microsoft.com/office/word/2023/wordml/word16du" xmlns:w16sdtdh="http://schemas.microsoft.com/office/word/2020/wordml/sdtdatahash" xmlns:w16sdtfl="http://schemas.microsoft.com/office/word/2024/wordml/sdtformatlock" xmlns:w16se="http://schemas.microsoft.com/office/word/2015/wordml/symex" xmlns:wpg="http://schemas.microsoft.com/office/word/2010/wordprocessingGroup" xmlns:wpi="http://schemas.microsoft.com/office/word/2010/wordprocessingInk" xmlns:wne="http://schemas.microsoft.com/office/word/2006/wordml" xmlns:wps="http://schemas.microsoft.com/office/word/2010/wordprocessingShape" mc:Ignorable="w14 w15 w16se w16cid w16 w16cex w16sdtdh w16sdtfl w16du wp14">
   <w:p>
     <w:pPr>
       <w:contextualSpacing/>
@@ -14499,7 +14181,7 @@
 </file>
 
 <file path=word/footer2.xml><?xml version="1.0" encoding="utf-8"?>
-<w:ftr xmlns:wpc="http://schemas.microsoft.com/office/word/2010/wordprocessingCanvas" xmlns:cx="http://schemas.microsoft.com/office/drawing/2014/chartex" xmlns:cx1="http://schemas.microsoft.com/office/drawing/2015/9/8/chartex" xmlns:mc="http://schemas.openxmlformats.org/markup-compatibility/2006" xmlns:o="urn:schemas-microsoft-com:office:office" xmlns:r="http://schemas.openxmlformats.org/officeDocument/2006/relationships" xmlns:m="http://schemas.openxmlformats.org/officeDocument/2006/math" xmlns:v="urn:schemas-microsoft-com:vml" xmlns:wp14="http://schemas.microsoft.com/office/word/2010/wordprocessingDrawing" xmlns:wp="http://schemas.openxmlformats.org/drawingml/2006/wordprocessingDrawing" xmlns:w10="urn:schemas-microsoft-com:office:word" xmlns:w="http://schemas.openxmlformats.org/wordprocessingml/2006/main" xmlns:w14="http://schemas.microsoft.com/office/word/2010/wordml" xmlns:w15="http://schemas.microsoft.com/office/word/2012/wordml" xmlns:w16se="http://schemas.microsoft.com/office/word/2015/wordml/symex" xmlns:wpg="http://schemas.microsoft.com/office/word/2010/wordprocessingGroup" xmlns:wpi="http://schemas.microsoft.com/office/word/2010/wordprocessingInk" xmlns:wne="http://schemas.microsoft.com/office/word/2006/wordml" xmlns:wps="http://schemas.microsoft.com/office/word/2010/wordprocessingShape" mc:Ignorable="w14 w15 w16se wp14">
+<w:ftr xmlns:wpc="http://schemas.microsoft.com/office/word/2010/wordprocessingCanvas" xmlns:cx="http://schemas.microsoft.com/office/drawing/2014/chartex" xmlns:cx1="http://schemas.microsoft.com/office/drawing/2015/9/8/chartex" xmlns:cx2="http://schemas.microsoft.com/office/drawing/2015/10/21/chartex" xmlns:cx3="http://schemas.microsoft.com/office/drawing/2016/5/9/chartex" xmlns:cx4="http://schemas.microsoft.com/office/drawing/2016/5/10/chartex" xmlns:cx5="http://schemas.microsoft.com/office/drawing/2016/5/11/chartex" xmlns:cx6="http://schemas.microsoft.com/office/drawing/2016/5/12/chartex" xmlns:cx7="http://schemas.microsoft.com/office/drawing/2016/5/13/chartex" xmlns:cx8="http://schemas.microsoft.com/office/drawing/2016/5/14/chartex" xmlns:mc="http://schemas.openxmlformats.org/markup-compatibility/2006" xmlns:aink="http://schemas.microsoft.com/office/drawing/2016/ink" xmlns:am3d="http://schemas.microsoft.com/office/drawing/2017/model3d" xmlns:o="urn:schemas-microsoft-com:office:office" xmlns:oel="http://schemas.microsoft.com/office/2019/extlst" xmlns:r="http://schemas.openxmlformats.org/officeDocument/2006/relationships" xmlns:m="http://schemas.openxmlformats.org/officeDocument/2006/math" xmlns:v="urn:schemas-microsoft-com:vml" xmlns:wp14="http://schemas.microsoft.com/office/word/2010/wordprocessingDrawing" xmlns:wp="http://schemas.openxmlformats.org/drawingml/2006/wordprocessingDrawing" xmlns:w10="urn:schemas-microsoft-com:office:word" xmlns:w="http://schemas.openxmlformats.org/wordprocessingml/2006/main" xmlns:w14="http://schemas.microsoft.com/office/word/2010/wordml" xmlns:w15="http://schemas.microsoft.com/office/word/2012/wordml" xmlns:w16cex="http://schemas.microsoft.com/office/word/2018/wordml/cex" xmlns:w16cid="http://schemas.microsoft.com/office/word/2016/wordml/cid" xmlns:w16="http://schemas.microsoft.com/office/word/2018/wordml" xmlns:w16du="http://schemas.microsoft.com/office/word/2023/wordml/word16du" xmlns:w16sdtdh="http://schemas.microsoft.com/office/word/2020/wordml/sdtdatahash" xmlns:w16sdtfl="http://schemas.microsoft.com/office/word/2024/wordml/sdtformatlock" xmlns:w16se="http://schemas.microsoft.com/office/word/2015/wordml/symex" xmlns:wpg="http://schemas.microsoft.com/office/word/2010/wordprocessingGroup" xmlns:wpi="http://schemas.microsoft.com/office/word/2010/wordprocessingInk" xmlns:wne="http://schemas.microsoft.com/office/word/2006/wordml" xmlns:wps="http://schemas.microsoft.com/office/word/2010/wordprocessingShape" mc:Ignorable="w14 w15 w16se w16cid w16 w16cex w16sdtdh w16sdtfl w16du wp14">
   <w:p>
     <w:pPr>
       <w:pStyle w:val="Footer"/>
@@ -14509,7 +14191,7 @@
 </file>
 
 <file path=word/footnotes.xml><?xml version="1.0" encoding="utf-8"?>
-<w:footnotes xmlns:wpc="http://schemas.microsoft.com/office/word/2010/wordprocessingCanvas" xmlns:cx="http://schemas.microsoft.com/office/drawing/2014/chartex" xmlns:cx1="http://schemas.microsoft.com/office/drawing/2015/9/8/chartex" xmlns:mc="http://schemas.openxmlformats.org/markup-compatibility/2006" xmlns:o="urn:schemas-microsoft-com:office:office" xmlns:r="http://schemas.openxmlformats.org/officeDocument/2006/relationships" xmlns:m="http://schemas.openxmlformats.org/officeDocument/2006/math" xmlns:v="urn:schemas-microsoft-com:vml" xmlns:wp14="http://schemas.microsoft.com/office/word/2010/wordprocessingDrawing" xmlns:wp="http://schemas.openxmlformats.org/drawingml/2006/wordprocessingDrawing" xmlns:w10="urn:schemas-microsoft-com:office:word" xmlns:w="http://schemas.openxmlformats.org/wordprocessingml/2006/main" xmlns:w14="http://schemas.microsoft.com/office/word/2010/wordml" xmlns:w15="http://schemas.microsoft.com/office/word/2012/wordml" xmlns:w16se="http://schemas.microsoft.com/office/word/2015/wordml/symex" xmlns:wpg="http://schemas.microsoft.com/office/word/2010/wordprocessingGroup" xmlns:wpi="http://schemas.microsoft.com/office/word/2010/wordprocessingInk" xmlns:wne="http://schemas.microsoft.com/office/word/2006/wordml" xmlns:wps="http://schemas.microsoft.com/office/word/2010/wordprocessingShape" mc:Ignorable="w14 w15 w16se wp14">
+<w:footnotes xmlns:wpc="http://schemas.microsoft.com/office/word/2010/wordprocessingCanvas" xmlns:cx="http://schemas.microsoft.com/office/drawing/2014/chartex" xmlns:cx1="http://schemas.microsoft.com/office/drawing/2015/9/8/chartex" xmlns:cx2="http://schemas.microsoft.com/office/drawing/2015/10/21/chartex" xmlns:cx3="http://schemas.microsoft.com/office/drawing/2016/5/9/chartex" xmlns:cx4="http://schemas.microsoft.com/office/drawing/2016/5/10/chartex" xmlns:cx5="http://schemas.microsoft.com/office/drawing/2016/5/11/chartex" xmlns:cx6="http://schemas.microsoft.com/office/drawing/2016/5/12/chartex" xmlns:cx7="http://schemas.microsoft.com/office/drawing/2016/5/13/chartex" xmlns:cx8="http://schemas.microsoft.com/office/drawing/2016/5/14/chartex" xmlns:mc="http://schemas.openxmlformats.org/markup-compatibility/2006" xmlns:aink="http://schemas.microsoft.com/office/drawing/2016/ink" xmlns:am3d="http://schemas.microsoft.com/office/drawing/2017/model3d" xmlns:o="urn:schemas-microsoft-com:office:office" xmlns:oel="http://schemas.microsoft.com/office/2019/extlst" xmlns:r="http://schemas.openxmlformats.org/officeDocument/2006/relationships" xmlns:m="http://schemas.openxmlformats.org/officeDocument/2006/math" xmlns:v="urn:schemas-microsoft-com:vml" xmlns:wp14="http://schemas.microsoft.com/office/word/2010/wordprocessingDrawing" xmlns:wp="http://schemas.openxmlformats.org/drawingml/2006/wordprocessingDrawing" xmlns:w10="urn:schemas-microsoft-com:office:word" xmlns:w="http://schemas.openxmlformats.org/wordprocessingml/2006/main" xmlns:w14="http://schemas.microsoft.com/office/word/2010/wordml" xmlns:w15="http://schemas.microsoft.com/office/word/2012/wordml" xmlns:w16cex="http://schemas.microsoft.com/office/word/2018/wordml/cex" xmlns:w16cid="http://schemas.microsoft.com/office/word/2016/wordml/cid" xmlns:w16="http://schemas.microsoft.com/office/word/2018/wordml" xmlns:w16du="http://schemas.microsoft.com/office/word/2023/wordml/word16du" xmlns:w16sdtdh="http://schemas.microsoft.com/office/word/2020/wordml/sdtdatahash" xmlns:w16sdtfl="http://schemas.microsoft.com/office/word/2024/wordml/sdtformatlock" xmlns:w16se="http://schemas.microsoft.com/office/word/2015/wordml/symex" xmlns:wpg="http://schemas.microsoft.com/office/word/2010/wordprocessingGroup" xmlns:wpi="http://schemas.microsoft.com/office/word/2010/wordprocessingInk" xmlns:wne="http://schemas.microsoft.com/office/word/2006/wordml" xmlns:wps="http://schemas.microsoft.com/office/word/2010/wordprocessingShape" mc:Ignorable="w14 w15 w16se w16cid w16 w16cex w16sdtdh w16sdtfl w16du wp14">
   <w:footnote w:type="separator" w:id="-1">
     <w:p>
       <w:pPr>
@@ -14534,7 +14216,7 @@
 </file>
 
 <file path=word/numbering.xml><?xml version="1.0" encoding="utf-8"?>
-<w:numbering xmlns:wpc="http://schemas.microsoft.com/office/word/2010/wordprocessingCanvas" xmlns:cx="http://schemas.microsoft.com/office/drawing/2014/chartex" xmlns:cx1="http://schemas.microsoft.com/office/drawing/2015/9/8/chartex" xmlns:mc="http://schemas.openxmlformats.org/markup-compatibility/2006" xmlns:o="urn:schemas-microsoft-com:office:office" xmlns:r="http://schemas.openxmlformats.org/officeDocument/2006/relationships" xmlns:m="http://schemas.openxmlformats.org/officeDocument/2006/math" xmlns:v="urn:schemas-microsoft-com:vml" xmlns:wp14="http://schemas.microsoft.com/office/word/2010/wordprocessingDrawing" xmlns:wp="http://schemas.openxmlformats.org/drawingml/2006/wordprocessingDrawing" xmlns:w10="urn:schemas-microsoft-com:office:word" xmlns:w="http://schemas.openxmlformats.org/wordprocessingml/2006/main" xmlns:w14="http://schemas.microsoft.com/office/word/2010/wordml" xmlns:w15="http://schemas.microsoft.com/office/word/2012/wordml" xmlns:w16se="http://schemas.microsoft.com/office/word/2015/wordml/symex" xmlns:wpg="http://schemas.microsoft.com/office/word/2010/wordprocessingGroup" xmlns:wpi="http://schemas.microsoft.com/office/word/2010/wordprocessingInk" xmlns:wne="http://schemas.microsoft.com/office/word/2006/wordml" xmlns:wps="http://schemas.microsoft.com/office/word/2010/wordprocessingShape" mc:Ignorable="w14 w15 w16se wp14">
+<w:numbering xmlns:wpc="http://schemas.microsoft.com/office/word/2010/wordprocessingCanvas" xmlns:cx="http://schemas.microsoft.com/office/drawing/2014/chartex" xmlns:cx1="http://schemas.microsoft.com/office/drawing/2015/9/8/chartex" xmlns:cx2="http://schemas.microsoft.com/office/drawing/2015/10/21/chartex" xmlns:cx3="http://schemas.microsoft.com/office/drawing/2016/5/9/chartex" xmlns:cx4="http://schemas.microsoft.com/office/drawing/2016/5/10/chartex" xmlns:cx5="http://schemas.microsoft.com/office/drawing/2016/5/11/chartex" xmlns:cx6="http://schemas.microsoft.com/office/drawing/2016/5/12/chartex" xmlns:cx7="http://schemas.microsoft.com/office/drawing/2016/5/13/chartex" xmlns:cx8="http://schemas.microsoft.com/office/drawing/2016/5/14/chartex" xmlns:mc="http://schemas.openxmlformats.org/markup-compatibility/2006" xmlns:aink="http://schemas.microsoft.com/office/drawing/2016/ink" xmlns:am3d="http://schemas.microsoft.com/office/drawing/2017/model3d" xmlns:o="urn:schemas-microsoft-com:office:office" xmlns:oel="http://schemas.microsoft.com/office/2019/extlst" xmlns:r="http://schemas.openxmlformats.org/officeDocument/2006/relationships" xmlns:m="http://schemas.openxmlformats.org/officeDocument/2006/math" xmlns:v="urn:schemas-microsoft-com:vml" xmlns:wp14="http://schemas.microsoft.com/office/word/2010/wordprocessingDrawing" xmlns:wp="http://schemas.openxmlformats.org/drawingml/2006/wordprocessingDrawing" xmlns:w10="urn:schemas-microsoft-com:office:word" xmlns:w="http://schemas.openxmlformats.org/wordprocessingml/2006/main" xmlns:w14="http://schemas.microsoft.com/office/word/2010/wordml" xmlns:w15="http://schemas.microsoft.com/office/word/2012/wordml" xmlns:w16cex="http://schemas.microsoft.com/office/word/2018/wordml/cex" xmlns:w16cid="http://schemas.microsoft.com/office/word/2016/wordml/cid" xmlns:w16="http://schemas.microsoft.com/office/word/2018/wordml" xmlns:w16du="http://schemas.microsoft.com/office/word/2023/wordml/word16du" xmlns:w16sdtdh="http://schemas.microsoft.com/office/word/2020/wordml/sdtdatahash" xmlns:w16sdtfl="http://schemas.microsoft.com/office/word/2024/wordml/sdtformatlock" xmlns:w16se="http://schemas.microsoft.com/office/word/2015/wordml/symex" xmlns:wpg="http://schemas.microsoft.com/office/word/2010/wordprocessingGroup" xmlns:wpi="http://schemas.microsoft.com/office/word/2010/wordprocessingInk" xmlns:wne="http://schemas.microsoft.com/office/word/2006/wordml" xmlns:wps="http://schemas.microsoft.com/office/word/2010/wordprocessingShape" mc:Ignorable="w14 w15 w16se w16cid w16 w16cex w16sdtdh w16sdtfl w16du wp14">
   <w:abstractNum w:abstractNumId="0" w15:restartNumberingAfterBreak="0">
     <w:nsid w:val="00000402"/>
     <w:multiLevelType w:val="multilevel"/>
@@ -16690,86 +16372,86 @@
       </w:pPr>
     </w:lvl>
   </w:abstractNum>
-  <w:num w:numId="1">
+  <w:num w:numId="1" w16cid:durableId="1713923740">
     <w:abstractNumId w:val="3"/>
   </w:num>
-  <w:num w:numId="2">
+  <w:num w:numId="2" w16cid:durableId="1517190501">
     <w:abstractNumId w:val="2"/>
   </w:num>
-  <w:num w:numId="3">
+  <w:num w:numId="3" w16cid:durableId="532573591">
     <w:abstractNumId w:val="1"/>
   </w:num>
-  <w:num w:numId="4">
+  <w:num w:numId="4" w16cid:durableId="1138110683">
     <w:abstractNumId w:val="0"/>
   </w:num>
-  <w:num w:numId="5">
+  <w:num w:numId="5" w16cid:durableId="713579895">
     <w:abstractNumId w:val="4"/>
   </w:num>
-  <w:num w:numId="6">
+  <w:num w:numId="6" w16cid:durableId="1272323191">
     <w:abstractNumId w:val="5"/>
   </w:num>
-  <w:num w:numId="7">
+  <w:num w:numId="7" w16cid:durableId="559634690">
     <w:abstractNumId w:val="10"/>
   </w:num>
-  <w:num w:numId="8">
+  <w:num w:numId="8" w16cid:durableId="108084723">
     <w:abstractNumId w:val="23"/>
   </w:num>
-  <w:num w:numId="9">
+  <w:num w:numId="9" w16cid:durableId="867723793">
     <w:abstractNumId w:val="6"/>
   </w:num>
-  <w:num w:numId="10">
+  <w:num w:numId="10" w16cid:durableId="1864711252">
     <w:abstractNumId w:val="13"/>
   </w:num>
-  <w:num w:numId="11">
+  <w:num w:numId="11" w16cid:durableId="1604533041">
     <w:abstractNumId w:val="14"/>
   </w:num>
-  <w:num w:numId="12">
+  <w:num w:numId="12" w16cid:durableId="1057431343">
     <w:abstractNumId w:val="17"/>
   </w:num>
-  <w:num w:numId="13">
+  <w:num w:numId="13" w16cid:durableId="8878517">
     <w:abstractNumId w:val="19"/>
   </w:num>
-  <w:num w:numId="14">
+  <w:num w:numId="14" w16cid:durableId="146673430">
     <w:abstractNumId w:val="22"/>
   </w:num>
-  <w:num w:numId="15">
+  <w:num w:numId="15" w16cid:durableId="613102191">
     <w:abstractNumId w:val="12"/>
   </w:num>
-  <w:num w:numId="16">
+  <w:num w:numId="16" w16cid:durableId="2123258649">
     <w:abstractNumId w:val="8"/>
   </w:num>
-  <w:num w:numId="17">
+  <w:num w:numId="17" w16cid:durableId="1200899068">
     <w:abstractNumId w:val="21"/>
   </w:num>
-  <w:num w:numId="18">
+  <w:num w:numId="18" w16cid:durableId="1572740624">
     <w:abstractNumId w:val="16"/>
   </w:num>
-  <w:num w:numId="19">
+  <w:num w:numId="19" w16cid:durableId="1034578151">
     <w:abstractNumId w:val="18"/>
   </w:num>
-  <w:num w:numId="20">
+  <w:num w:numId="20" w16cid:durableId="786968518">
     <w:abstractNumId w:val="20"/>
   </w:num>
-  <w:num w:numId="21">
+  <w:num w:numId="21" w16cid:durableId="1127771576">
     <w:abstractNumId w:val="9"/>
   </w:num>
-  <w:num w:numId="22">
+  <w:num w:numId="22" w16cid:durableId="1628781752">
     <w:abstractNumId w:val="15"/>
   </w:num>
-  <w:num w:numId="23">
+  <w:num w:numId="23" w16cid:durableId="1130243029">
     <w:abstractNumId w:val="7"/>
   </w:num>
-  <w:num w:numId="24">
+  <w:num w:numId="24" w16cid:durableId="2009013351">
     <w:abstractNumId w:val="11"/>
   </w:num>
-  <w:num w:numId="25">
+  <w:num w:numId="25" w16cid:durableId="465438464">
     <w:abstractNumId w:val="11"/>
   </w:num>
 </w:numbering>
 </file>
 
 <file path=word/styles.xml><?xml version="1.0" encoding="utf-8"?>
-<w:styles xmlns:mc="http://schemas.openxmlformats.org/markup-compatibility/2006" xmlns:r="http://schemas.openxmlformats.org/officeDocument/2006/relationships" xmlns:w="http://schemas.openxmlformats.org/wordprocessingml/2006/main" xmlns:w14="http://schemas.microsoft.com/office/word/2010/wordml" xmlns:w15="http://schemas.microsoft.com/office/word/2012/wordml" xmlns:w16se="http://schemas.microsoft.com/office/word/2015/wordml/symex" mc:Ignorable="w14 w15 w16se">
+<w:styles xmlns:mc="http://schemas.openxmlformats.org/markup-compatibility/2006" xmlns:r="http://schemas.openxmlformats.org/officeDocument/2006/relationships" xmlns:w="http://schemas.openxmlformats.org/wordprocessingml/2006/main" xmlns:w14="http://schemas.microsoft.com/office/word/2010/wordml" xmlns:w15="http://schemas.microsoft.com/office/word/2012/wordml" xmlns:w16cex="http://schemas.microsoft.com/office/word/2018/wordml/cex" xmlns:w16cid="http://schemas.microsoft.com/office/word/2016/wordml/cid" xmlns:w16="http://schemas.microsoft.com/office/word/2018/wordml" xmlns:w16du="http://schemas.microsoft.com/office/word/2023/wordml/word16du" xmlns:w16sdtdh="http://schemas.microsoft.com/office/word/2020/wordml/sdtdatahash" xmlns:w16sdtfl="http://schemas.microsoft.com/office/word/2024/wordml/sdtformatlock" xmlns:w16se="http://schemas.microsoft.com/office/word/2015/wordml/symex" mc:Ignorable="w14 w15 w16se w16cid w16 w16cex w16sdtdh w16sdtfl w16du">
   <w:docDefaults>
     <w:rPrDefault>
       <w:rPr>
@@ -16785,7 +16467,7 @@
       </w:pPr>
     </w:pPrDefault>
   </w:docDefaults>
-  <w:latentStyles w:defLockedState="0" w:defUIPriority="99" w:defSemiHidden="0" w:defUnhideWhenUsed="0" w:defQFormat="0" w:count="371">
+  <w:latentStyles w:defLockedState="0" w:defUIPriority="99" w:defSemiHidden="0" w:defUnhideWhenUsed="0" w:defQFormat="0" w:count="376">
     <w:lsdException w:name="Normal" w:uiPriority="0" w:qFormat="1"/>
     <w:lsdException w:name="heading 1" w:uiPriority="1" w:qFormat="1"/>
     <w:lsdException w:name="heading 2" w:semiHidden="1" w:uiPriority="1" w:unhideWhenUsed="1" w:qFormat="1"/>
@@ -17157,6 +16839,11 @@
     <w:lsdException w:name="List Table 5 Dark Accent 6" w:uiPriority="50"/>
     <w:lsdException w:name="List Table 6 Colorful Accent 6" w:uiPriority="51"/>
     <w:lsdException w:name="List Table 7 Colorful Accent 6" w:uiPriority="52"/>
+    <w:lsdException w:name="Mention" w:semiHidden="1" w:unhideWhenUsed="1"/>
+    <w:lsdException w:name="Smart Hyperlink" w:semiHidden="1" w:unhideWhenUsed="1"/>
+    <w:lsdException w:name="Hashtag" w:semiHidden="1" w:unhideWhenUsed="1"/>
+    <w:lsdException w:name="Unresolved Mention" w:semiHidden="1" w:unhideWhenUsed="1"/>
+    <w:lsdException w:name="Smart Link" w:semiHidden="1" w:unhideWhenUsed="1"/>
   </w:latentStyles>
   <w:style w:type="paragraph" w:default="1" w:styleId="Normal">
     <w:name w:val="Normal"/>

</xml_diff>